<commit_message>
fix: perbaiki nama PPK BAST SM-PPK dan hilangkan duplikasi kata Nomor di kop surat
</commit_message>
<xml_diff>
--- a/TEMPLATE_SPK_BAST/TEMPLATE_SPK.docx
+++ b/TEMPLATE_SPK_BAST/TEMPLATE_SPK.docx
@@ -1,4427 +1,6 @@
 
-<file path=word/document.xml><?xml version="1.0" encoding="utf-8"?>
-<w:document xmlns:wpc="http://schemas.microsoft.com/office/word/2010/wordprocessingCanvas" xmlns:cx="http://schemas.microsoft.com/office/drawing/2014/chartex" xmlns:cx1="http://schemas.microsoft.com/office/drawing/2015/9/8/chartex" xmlns:cx2="http://schemas.microsoft.com/office/drawing/2015/10/21/chartex" xmlns:cx3="http://schemas.microsoft.com/office/drawing/2016/5/9/chartex" xmlns:cx4="http://schemas.microsoft.com/office/drawing/2016/5/10/chartex" xmlns:cx5="http://schemas.microsoft.com/office/drawing/2016/5/11/chartex" xmlns:cx6="http://schemas.microsoft.com/office/drawing/2016/5/12/chartex" xmlns:cx7="http://schemas.microsoft.com/office/drawing/2016/5/13/chartex" xmlns:cx8="http://schemas.microsoft.com/office/drawing/2016/5/14/chartex" xmlns:mc="http://schemas.openxmlformats.org/markup-compatibility/2006" xmlns:aink="http://schemas.microsoft.com/office/drawing/2016/ink" xmlns:am3d="http://schemas.microsoft.com/office/drawing/2017/model3d" xmlns:o="urn:schemas-microsoft-com:office:office" xmlns:oel="http://schemas.microsoft.com/office/2019/extlst" xmlns:r="http://schemas.openxmlformats.org/officeDocument/2006/relationships" xmlns:m="http://schemas.openxmlformats.org/officeDocument/2006/math" xmlns:v="urn:schemas-microsoft-com:vml" xmlns:wp14="http://schemas.microsoft.com/office/word/2010/wordprocessingDrawing" xmlns:wp="http://schemas.openxmlformats.org/drawingml/2006/wordprocessingDrawing" xmlns:w10="urn:schemas-microsoft-com:office:word" xmlns:w="http://schemas.openxmlformats.org/wordprocessingml/2006/main" xmlns:w14="http://schemas.microsoft.com/office/word/2010/wordml" xmlns:w15="http://schemas.microsoft.com/office/word/2012/wordml" xmlns:w16cex="http://schemas.microsoft.com/office/word/2018/wordml/cex" xmlns:w16cid="http://schemas.microsoft.com/office/word/2016/wordml/cid" xmlns:w16="http://schemas.microsoft.com/office/word/2018/wordml" xmlns:w16du="http://schemas.microsoft.com/office/word/2023/wordml/word16du" xmlns:w16sdtdh="http://schemas.microsoft.com/office/word/2020/wordml/sdtdatahash" xmlns:w16sdtfl="http://schemas.microsoft.com/office/word/2024/wordml/sdtformatlock" xmlns:w16se="http://schemas.microsoft.com/office/word/2015/wordml/symex" xmlns:wpg="http://schemas.microsoft.com/office/word/2010/wordprocessingGroup" xmlns:wpi="http://schemas.microsoft.com/office/word/2010/wordprocessingInk" xmlns:wne="http://schemas.microsoft.com/office/word/2006/wordml" xmlns:wps="http://schemas.microsoft.com/office/word/2010/wordprocessingShape" mc:Ignorable="w14 w15 w16se w16cid w16 w16cex w16sdtdh w16sdtfl w16du wp14">
-  <w:body>
-    <w:tbl>
-      <w:tblPr>
-        <w:tblW w:w="10348" w:type="dxa"/>
-        <w:tblInd w:w="-567" w:type="dxa"/>
-        <w:tblLook w:val="04A0" w:firstRow="1" w:lastRow="0" w:firstColumn="1" w:lastColumn="0" w:noHBand="0" w:noVBand="1"/>
-      </w:tblPr>
-      <w:tblGrid>
-        <w:gridCol w:w="10348"/>
-      </w:tblGrid>
-      <w:tr>
-        <w:tc>
-          <w:tcPr>
-            <w:tcW w:w="10348" w:type="dxa"/>
-          </w:tcPr>
-          <w:p>
-            <w:pPr>
-              <w:tabs>
-                <w:tab w:val="left" w:pos="7830"/>
-              </w:tabs>
-              <w:spacing w:after="120"/>
-              <w:ind w:right="34"/>
-              <w:jc w:val="center"/>
-              <w:rPr>
-                <w:rFonts w:ascii="Bookman Old Style" w:hAnsi="Bookman Old Style"/>
-                <w:b/>
-                <w:sz w:val="24"/>
-                <w:szCs w:val="24"/>
-              </w:rPr>
-            </w:pPr>
-            <w:r>
-              <w:rPr>
-                <w:rFonts w:ascii="Bookman Old Style" w:hAnsi="Bookman Old Style"/>
-                <w:b/>
-                <w:sz w:val="24"/>
-                <w:szCs w:val="24"/>
-              </w:rPr>
-              <w:t>PERJANJIAN KERJA</w:t>
-            </w:r>
-          </w:p>
-          <w:p>
-            <w:pPr>
-              <w:tabs>
-                <w:tab w:val="left" w:pos="7830"/>
-              </w:tabs>
-              <w:ind w:right="34"/>
-              <w:jc w:val="center"/>
-              <w:rPr>
-                <w:rFonts w:ascii="Bookman Old Style" w:hAnsi="Bookman Old Style"/>
-                <w:b/>
-                <w:sz w:val="24"/>
-                <w:szCs w:val="24"/>
-              </w:rPr>
-            </w:pPr>
-            <w:r>
-              <w:rPr>
-                <w:rFonts w:ascii="Bookman Old Style" w:hAnsi="Bookman Old Style" w:cs="Arial"/>
-                <w:b/>
-                <w:noProof/>
-                <w:sz w:val="24"/>
-                <w:szCs w:val="24"/>
-              </w:rPr>
-              <w:t>&lt;&lt;JUDUL_PEKERJAAN_DOKUMEN&gt;&gt;</w:t>
-            </w:r>
-          </w:p>
-          <w:p>
-            <w:pPr>
-              <w:tabs>
-                <w:tab w:val="left" w:pos="7830"/>
-              </w:tabs>
-              <w:ind w:right="34"/>
-              <w:jc w:val="center"/>
-              <w:rPr>
-                <w:rFonts w:ascii="Bookman Old Style" w:hAnsi="Bookman Old Style"/>
-                <w:b/>
-                <w:sz w:val="24"/>
-                <w:szCs w:val="24"/>
-              </w:rPr>
-            </w:pPr>
-            <w:r>
-              <w:rPr>
-                <w:rFonts w:ascii="Bookman Old Style" w:hAnsi="Bookman Old Style"/>
-                <w:b/>
-                <w:sz w:val="24"/>
-                <w:szCs w:val="24"/>
-              </w:rPr>
-              <w:t>BADAN PUSAT STATISTIK KOTA SUBULUSSALAM</w:t>
-            </w:r>
-          </w:p>
-          <w:p>
-            <w:pPr>
-              <w:tabs>
-                <w:tab w:val="left" w:pos="7830"/>
-              </w:tabs>
-              <w:ind w:right="34"/>
-              <w:jc w:val="center"/>
-              <w:rPr>
-                <w:rFonts w:ascii="Bookman Old Style" w:hAnsi="Bookman Old Style" w:cs="Arial"/>
-                <w:b/>
-                <w:sz w:val="24"/>
-                <w:szCs w:val="24"/>
-              </w:rPr>
-            </w:pPr>
-            <w:r>
-              <w:rPr>
-                <w:rFonts w:ascii="Bookman Old Style" w:hAnsi="Bookman Old Style" w:cs="Arial"/>
-                <w:b/>
-                <w:sz w:val="24"/>
-                <w:szCs w:val="24"/>
-              </w:rPr>
-              <w:t xml:space="preserve">NOMOR </w:t>
-            </w:r>
-            <w:r>
-              <w:rPr>
-                <w:rFonts w:ascii="Bookman Old Style" w:hAnsi="Bookman Old Style" w:cs="Arial"/>
-                <w:b/>
-                <w:noProof/>
-                <w:sz w:val="24"/>
-                <w:szCs w:val="24"/>
-              </w:rPr>
-              <w:t>&lt;&lt;NO_</w:t>
-            </w:r>
-            <w:r>
-              <w:rPr>
-                <w:rFonts w:ascii="Bookman Old Style" w:hAnsi="Bookman Old Style" w:cs="Arial"/>
-                <w:b/>
-                <w:noProof/>
-                <w:sz w:val="24"/>
-                <w:szCs w:val="24"/>
-              </w:rPr>
-              <w:t>SPK</w:t>
-            </w:r>
-            <w:r>
-              <w:rPr>
-                <w:rFonts w:ascii="Bookman Old Style" w:hAnsi="Bookman Old Style" w:cs="Arial"/>
-                <w:b/>
-                <w:noProof/>
-                <w:sz w:val="24"/>
-                <w:szCs w:val="24"/>
-              </w:rPr>
-              <w:t>&gt;&gt;</w:t>
-            </w:r>
-          </w:p>
-        </w:tc>
-      </w:tr>
-    </w:tbl>
-    <w:p>
-      <w:pPr>
-        <w:tabs>
-          <w:tab w:val="left" w:pos="2512"/>
-        </w:tabs>
-        <w:jc w:val="center"/>
-        <w:rPr>
-          <w:rFonts w:ascii="Bookman Old Style" w:hAnsi="Bookman Old Style" w:cs="Arial"/>
-          <w:b/>
-          <w:sz w:val="24"/>
-          <w:szCs w:val="24"/>
-        </w:rPr>
-      </w:pPr>
-    </w:p>
-    <w:p>
-      <w:pPr>
-        <w:jc w:val="both"/>
-        <w:rPr>
-          <w:rFonts w:ascii="Bookman Old Style" w:hAnsi="Bookman Old Style"/>
-          <w:sz w:val="24"/>
-          <w:szCs w:val="24"/>
-        </w:rPr>
-      </w:pPr>
-      <w:r>
-        <w:rPr>
-          <w:rFonts w:ascii="Bookman Old Style" w:hAnsi="Bookman Old Style"/>
-          <w:sz w:val="24"/>
-          <w:szCs w:val="24"/>
-        </w:rPr>
-        <w:t xml:space="preserve">Pada Hari ini. </w:t>
-      </w:r>
-      <w:r>
-        <w:rPr>
-          <w:rFonts w:ascii="Bookman Old Style" w:hAnsi="Bookman Old Style" w:cs="Arial"/>
-          <w:noProof/>
-          <w:sz w:val="24"/>
-          <w:szCs w:val="24"/>
-        </w:rPr>
-        <w:t>&lt;&lt;HARI_TERBILANG&gt;&gt;</w:t>
-      </w:r>
-      <w:r>
-        <w:rPr>
-          <w:rFonts w:ascii="Bookman Old Style" w:hAnsi="Bookman Old Style" w:cs="Arial"/>
-          <w:noProof/>
-          <w:sz w:val="24"/>
-          <w:szCs w:val="24"/>
-        </w:rPr>
-        <w:t xml:space="preserve"> </w:t>
-      </w:r>
-      <w:r>
-        <w:rPr>
-          <w:rFonts w:ascii="Bookman Old Style" w:hAnsi="Bookman Old Style"/>
-          <w:sz w:val="24"/>
-          <w:szCs w:val="24"/>
-        </w:rPr>
-        <w:t xml:space="preserve">tanggal </w:t>
-      </w:r>
-      <w:r>
-        <w:rPr>
-          <w:rFonts w:ascii="Bookman Old Style" w:hAnsi="Bookman Old Style" w:cs="Arial"/>
-          <w:noProof/>
-          <w:sz w:val="24"/>
-          <w:szCs w:val="24"/>
-        </w:rPr>
-        <w:t>&lt;&lt;TANGGAL_TERBILANG&gt;&gt;</w:t>
-      </w:r>
-      <w:r>
-        <w:rPr>
-          <w:rFonts w:ascii="Bookman Old Style" w:hAnsi="Bookman Old Style" w:cs="Arial"/>
-          <w:sz w:val="24"/>
-          <w:szCs w:val="24"/>
-        </w:rPr>
-        <w:t xml:space="preserve"> </w:t>
-      </w:r>
-      <w:r>
-        <w:rPr>
-          <w:rFonts w:ascii="Bookman Old Style" w:hAnsi="Bookman Old Style"/>
-          <w:sz w:val="24"/>
-          <w:szCs w:val="24"/>
-        </w:rPr>
-        <w:t xml:space="preserve">bulan </w:t>
-      </w:r>
-      <w:r>
-        <w:rPr>
-          <w:rFonts w:ascii="Bookman Old Style" w:hAnsi="Bookman Old Style" w:cs="Arial"/>
-          <w:noProof/>
-          <w:sz w:val="24"/>
-          <w:szCs w:val="24"/>
-        </w:rPr>
-        <w:t>&lt;&lt;BULAN_TERBILANG&gt;&gt;</w:t>
-      </w:r>
-      <w:r>
-        <w:rPr>
-          <w:rFonts w:ascii="Bookman Old Style" w:hAnsi="Bookman Old Style" w:cs="Arial"/>
-          <w:noProof/>
-          <w:sz w:val="24"/>
-          <w:szCs w:val="24"/>
-        </w:rPr>
-        <w:t xml:space="preserve"> </w:t>
-      </w:r>
-      <w:r>
-        <w:rPr>
-          <w:rFonts w:ascii="Bookman Old Style" w:hAnsi="Bookman Old Style"/>
-          <w:sz w:val="24"/>
-          <w:szCs w:val="24"/>
-        </w:rPr>
-        <w:t xml:space="preserve">tahun </w:t>
-      </w:r>
-      <w:r>
-        <w:rPr>
-          <w:rFonts w:ascii="Bookman Old Style" w:hAnsi="Bookman Old Style" w:cs="Arial"/>
-          <w:sz w:val="24"/>
-          <w:szCs w:val="24"/>
-        </w:rPr>
-        <w:t>&lt;&lt;TAHUN_TERBILANG&gt;&gt;</w:t>
-      </w:r>
-      <w:r>
-        <w:rPr>
-          <w:rFonts w:ascii="Bookman Old Style" w:hAnsi="Bookman Old Style"/>
-          <w:sz w:val="24"/>
-          <w:szCs w:val="24"/>
-        </w:rPr>
-        <w:t xml:space="preserve"> </w:t>
-      </w:r>
-      <w:r>
-        <w:rPr>
-          <w:rFonts w:ascii="Bookman Old Style" w:hAnsi="Bookman Old Style" w:cs="Arial"/>
-          <w:noProof/>
-          <w:sz w:val="24"/>
-          <w:szCs w:val="24"/>
-        </w:rPr>
-        <w:t>(&lt;&lt;TANGGAL_BAST&gt;&gt;)</w:t>
-      </w:r>
-      <w:r>
-        <w:rPr>
-          <w:rFonts w:ascii="Bookman Old Style" w:hAnsi="Bookman Old Style"/>
-          <w:sz w:val="24"/>
-          <w:szCs w:val="24"/>
-        </w:rPr>
-        <w:t xml:space="preserve">. bertempat di </w:t>
-      </w:r>
-      <w:r>
-        <w:rPr>
-          <w:rFonts w:ascii="Bookman Old Style" w:hAnsi="Bookman Old Style"/>
-          <w:noProof/>
-          <w:sz w:val="24"/>
-          <w:szCs w:val="24"/>
-        </w:rPr>
-        <w:t>Kantor BPS Kota Subulussalam</w:t>
-      </w:r>
-      <w:r>
-        <w:rPr>
-          <w:rFonts w:ascii="Bookman Old Style" w:hAnsi="Bookman Old Style"/>
-          <w:sz w:val="24"/>
-          <w:szCs w:val="24"/>
-        </w:rPr>
-        <w:t xml:space="preserve"> yang bertanda tangan di bawah ini:</w:t>
-      </w:r>
-    </w:p>
-    <w:p>
-      <w:pPr>
-        <w:jc w:val="both"/>
-        <w:rPr>
-          <w:rFonts w:ascii="Bookman Old Style" w:hAnsi="Bookman Old Style"/>
-          <w:sz w:val="24"/>
-          <w:szCs w:val="24"/>
-        </w:rPr>
-      </w:pPr>
-    </w:p>
-    <w:tbl>
-      <w:tblPr>
-        <w:tblStyle w:val="TableGrid"/>
-        <w:tblW w:w="0" w:type="auto"/>
-        <w:tblBorders>
-          <w:top w:val="none" w:sz="0" w:space="0" w:color="auto"/>
-          <w:left w:val="none" w:sz="0" w:space="0" w:color="auto"/>
-          <w:bottom w:val="none" w:sz="0" w:space="0" w:color="auto"/>
-          <w:right w:val="none" w:sz="0" w:space="0" w:color="auto"/>
-          <w:insideH w:val="none" w:sz="0" w:space="0" w:color="auto"/>
-          <w:insideV w:val="none" w:sz="0" w:space="0" w:color="auto"/>
-        </w:tblBorders>
-        <w:tblLook w:val="04A0" w:firstRow="1" w:lastRow="0" w:firstColumn="1" w:lastColumn="0" w:noHBand="0" w:noVBand="1"/>
-      </w:tblPr>
-      <w:tblGrid>
-        <w:gridCol w:w="3256"/>
-        <w:gridCol w:w="293"/>
-        <w:gridCol w:w="5944"/>
-      </w:tblGrid>
-      <w:tr>
-        <w:tc>
-          <w:tcPr>
-            <w:tcW w:w="3256" w:type="dxa"/>
-          </w:tcPr>
-          <w:p>
-            <w:pPr>
-              <w:pStyle w:val="ListParagraph"/>
-              <w:numPr>
-                <w:ilvl w:val="0"/>
-                <w:numId w:val="45"/>
-              </w:numPr>
-              <w:ind w:left="313"/>
-              <w:jc w:val="both"/>
-              <w:rPr>
-                <w:rFonts w:ascii="Bookman Old Style" w:hAnsi="Bookman Old Style"/>
-                <w:sz w:val="24"/>
-                <w:szCs w:val="24"/>
-              </w:rPr>
-            </w:pPr>
-            <w:r>
-              <w:rPr>
-                <w:rFonts w:ascii="Bookman Old Style" w:hAnsi="Bookman Old Style" w:cs="Times New Roman"/>
-                <w:color w:val="000000" w:themeColor="text1"/>
-                <w:sz w:val="24"/>
-                <w:szCs w:val="24"/>
-              </w:rPr>
-              <w:t>&lt;&lt;NAMA_PPK&gt;&gt;</w:t>
-            </w:r>
-          </w:p>
-          <w:p>
-            <w:pPr>
-              <w:jc w:val="both"/>
-              <w:rPr>
-                <w:rFonts w:ascii="Bookman Old Style" w:hAnsi="Bookman Old Style"/>
-                <w:sz w:val="24"/>
-                <w:szCs w:val="24"/>
-              </w:rPr>
-            </w:pPr>
-          </w:p>
-          <w:p>
-            <w:pPr>
-              <w:jc w:val="both"/>
-              <w:rPr>
-                <w:rFonts w:ascii="Bookman Old Style" w:hAnsi="Bookman Old Style"/>
-                <w:sz w:val="24"/>
-                <w:szCs w:val="24"/>
-              </w:rPr>
-            </w:pPr>
-          </w:p>
-          <w:p>
-            <w:pPr>
-              <w:jc w:val="both"/>
-              <w:rPr>
-                <w:rFonts w:ascii="Bookman Old Style" w:hAnsi="Bookman Old Style"/>
-                <w:sz w:val="24"/>
-                <w:szCs w:val="24"/>
-              </w:rPr>
-            </w:pPr>
-          </w:p>
-          <w:p>
-            <w:pPr>
-              <w:jc w:val="both"/>
-              <w:rPr>
-                <w:rFonts w:ascii="Bookman Old Style" w:hAnsi="Bookman Old Style"/>
-                <w:sz w:val="24"/>
-                <w:szCs w:val="24"/>
-              </w:rPr>
-            </w:pPr>
-          </w:p>
-          <w:p>
-            <w:pPr>
-              <w:jc w:val="both"/>
-              <w:rPr>
-                <w:rFonts w:ascii="Bookman Old Style" w:hAnsi="Bookman Old Style"/>
-                <w:sz w:val="24"/>
-                <w:szCs w:val="24"/>
-              </w:rPr>
-            </w:pPr>
-          </w:p>
-          <w:p>
-            <w:pPr>
-              <w:jc w:val="both"/>
-              <w:rPr>
-                <w:rFonts w:ascii="Bookman Old Style" w:hAnsi="Bookman Old Style"/>
-                <w:sz w:val="24"/>
-                <w:szCs w:val="24"/>
-              </w:rPr>
-            </w:pPr>
-          </w:p>
-          <w:p>
-            <w:pPr>
-              <w:pStyle w:val="ListParagraph"/>
-              <w:numPr>
-                <w:ilvl w:val="0"/>
-                <w:numId w:val="45"/>
-              </w:numPr>
-              <w:ind w:left="318"/>
-              <w:jc w:val="both"/>
-              <w:rPr>
-                <w:rFonts w:ascii="Bookman Old Style" w:hAnsi="Bookman Old Style"/>
-                <w:sz w:val="24"/>
-                <w:szCs w:val="24"/>
-              </w:rPr>
-            </w:pPr>
-            <w:r>
-              <w:rPr>
-                <w:rFonts w:ascii="Bookman Old Style" w:hAnsi="Bookman Old Style"/>
-                <w:sz w:val="24"/>
-                <w:szCs w:val="24"/>
-              </w:rPr>
-              <w:t>&lt;&lt;NAMA_PETUGAS&gt;&gt;</w:t>
-            </w:r>
-          </w:p>
-        </w:tc>
-        <w:tc>
-          <w:tcPr>
-            <w:tcW w:w="293" w:type="dxa"/>
-          </w:tcPr>
-          <w:p>
-            <w:pPr>
-              <w:jc w:val="both"/>
-              <w:rPr>
-                <w:rFonts w:ascii="Bookman Old Style" w:hAnsi="Bookman Old Style"/>
-                <w:sz w:val="24"/>
-                <w:szCs w:val="24"/>
-              </w:rPr>
-            </w:pPr>
-            <w:r>
-              <w:rPr>
-                <w:rFonts w:ascii="Bookman Old Style" w:hAnsi="Bookman Old Style"/>
-                <w:sz w:val="24"/>
-                <w:szCs w:val="24"/>
-              </w:rPr>
-              <w:t>:</w:t>
-            </w:r>
-          </w:p>
-          <w:p>
-            <w:pPr>
-              <w:jc w:val="both"/>
-              <w:rPr>
-                <w:rFonts w:ascii="Bookman Old Style" w:hAnsi="Bookman Old Style"/>
-                <w:sz w:val="24"/>
-                <w:szCs w:val="24"/>
-              </w:rPr>
-            </w:pPr>
-          </w:p>
-          <w:p>
-            <w:pPr>
-              <w:jc w:val="both"/>
-              <w:rPr>
-                <w:rFonts w:ascii="Bookman Old Style" w:hAnsi="Bookman Old Style"/>
-                <w:sz w:val="24"/>
-                <w:szCs w:val="24"/>
-              </w:rPr>
-            </w:pPr>
-          </w:p>
-          <w:p>
-            <w:pPr>
-              <w:jc w:val="both"/>
-              <w:rPr>
-                <w:rFonts w:ascii="Bookman Old Style" w:hAnsi="Bookman Old Style"/>
-                <w:sz w:val="24"/>
-                <w:szCs w:val="24"/>
-              </w:rPr>
-            </w:pPr>
-          </w:p>
-          <w:p>
-            <w:pPr>
-              <w:jc w:val="both"/>
-              <w:rPr>
-                <w:rFonts w:ascii="Bookman Old Style" w:hAnsi="Bookman Old Style"/>
-                <w:sz w:val="24"/>
-                <w:szCs w:val="24"/>
-              </w:rPr>
-            </w:pPr>
-          </w:p>
-          <w:p>
-            <w:pPr>
-              <w:jc w:val="both"/>
-              <w:rPr>
-                <w:rFonts w:ascii="Bookman Old Style" w:hAnsi="Bookman Old Style"/>
-                <w:sz w:val="24"/>
-                <w:szCs w:val="24"/>
-              </w:rPr>
-            </w:pPr>
-          </w:p>
-          <w:p>
-            <w:pPr>
-              <w:jc w:val="both"/>
-              <w:rPr>
-                <w:rFonts w:ascii="Bookman Old Style" w:hAnsi="Bookman Old Style"/>
-                <w:sz w:val="24"/>
-                <w:szCs w:val="24"/>
-              </w:rPr>
-            </w:pPr>
-          </w:p>
-          <w:p>
-            <w:pPr>
-              <w:jc w:val="both"/>
-              <w:rPr>
-                <w:rFonts w:ascii="Bookman Old Style" w:hAnsi="Bookman Old Style"/>
-                <w:sz w:val="24"/>
-                <w:szCs w:val="24"/>
-              </w:rPr>
-            </w:pPr>
-            <w:r>
-              <w:rPr>
-                <w:rFonts w:ascii="Bookman Old Style" w:hAnsi="Bookman Old Style"/>
-                <w:sz w:val="24"/>
-                <w:szCs w:val="24"/>
-              </w:rPr>
-              <w:t>:</w:t>
-            </w:r>
-          </w:p>
-        </w:tc>
-        <w:tc>
-          <w:tcPr>
-            <w:tcW w:w="5944" w:type="dxa"/>
-          </w:tcPr>
-          <w:p>
-            <w:pPr>
-              <w:jc w:val="both"/>
-              <w:rPr>
-                <w:rFonts w:ascii="Bookman Old Style" w:hAnsi="Bookman Old Style"/>
-                <w:sz w:val="24"/>
-                <w:szCs w:val="24"/>
-              </w:rPr>
-            </w:pPr>
-            <w:r>
-              <w:rPr>
-                <w:rFonts w:ascii="Bookman Old Style" w:hAnsi="Bookman Old Style"/>
-                <w:sz w:val="24"/>
-                <w:szCs w:val="24"/>
-              </w:rPr>
-              <w:t xml:space="preserve">Pejabat Pembuat Komitmen Badan Pusat Statistik </w:t>
-            </w:r>
-            <w:r>
-              <w:rPr>
-                <w:rFonts w:ascii="Bookman Old Style" w:hAnsi="Bookman Old Style"/>
-                <w:sz w:val="24"/>
-                <w:szCs w:val="24"/>
-                <w:lang w:val="en-ID"/>
-              </w:rPr>
-              <w:t>BPS Kota Subulussalam</w:t>
-            </w:r>
-            <w:r>
-              <w:rPr>
-                <w:rFonts w:ascii="Bookman Old Style" w:hAnsi="Bookman Old Style"/>
-                <w:sz w:val="24"/>
-                <w:szCs w:val="24"/>
-              </w:rPr>
-              <w:t xml:space="preserve"> alamat Jl. Raja Tua Lae Oram </w:t>
-            </w:r>
-            <w:r>
-              <w:rPr>
-                <w:rFonts w:ascii="Bookman Old Style" w:hAnsi="Bookman Old Style"/>
-                <w:sz w:val="24"/>
-                <w:szCs w:val="24"/>
-                <w:lang w:val="en-ID"/>
-              </w:rPr>
-              <w:t>Komplek Perkantoran Walikota Subulussalam</w:t>
-            </w:r>
-            <w:r>
-              <w:rPr>
-                <w:rFonts w:ascii="Bookman Old Style" w:hAnsi="Bookman Old Style"/>
-                <w:sz w:val="24"/>
-                <w:szCs w:val="24"/>
-              </w:rPr>
-              <w:t xml:space="preserve"> bertindak untuk dan atas nama Badan Pusat Statistik </w:t>
-            </w:r>
-            <w:r>
-              <w:rPr>
-                <w:rFonts w:ascii="Bookman Old Style" w:hAnsi="Bookman Old Style"/>
-                <w:sz w:val="24"/>
-                <w:szCs w:val="24"/>
-                <w:lang w:val="en-ID"/>
-              </w:rPr>
-              <w:t>BPS Kota Subulussalam</w:t>
-            </w:r>
-            <w:r>
-              <w:rPr>
-                <w:rFonts w:ascii="Bookman Old Style" w:hAnsi="Bookman Old Style"/>
-                <w:sz w:val="24"/>
-                <w:szCs w:val="24"/>
-              </w:rPr>
-              <w:t xml:space="preserve"> selanjutnya disebut </w:t>
-            </w:r>
-            <w:r>
-              <w:rPr>
-                <w:rFonts w:ascii="Bookman Old Style" w:hAnsi="Bookman Old Style"/>
-                <w:b/>
-                <w:sz w:val="24"/>
-                <w:szCs w:val="24"/>
-              </w:rPr>
-              <w:t>PIHAK PERTAMA</w:t>
-            </w:r>
-            <w:r>
-              <w:rPr>
-                <w:rFonts w:ascii="Bookman Old Style" w:hAnsi="Bookman Old Style"/>
-                <w:sz w:val="24"/>
-                <w:szCs w:val="24"/>
-              </w:rPr>
-              <w:t>.</w:t>
-            </w:r>
-          </w:p>
-          <w:p>
-            <w:pPr>
-              <w:jc w:val="both"/>
-              <w:rPr>
-                <w:rFonts w:ascii="Bookman Old Style" w:hAnsi="Bookman Old Style"/>
-                <w:sz w:val="24"/>
-                <w:szCs w:val="24"/>
-              </w:rPr>
-            </w:pPr>
-          </w:p>
-          <w:p>
-            <w:pPr>
-              <w:tabs>
-                <w:tab w:val="left" w:pos="7830"/>
-              </w:tabs>
-              <w:ind w:right="34"/>
-              <w:jc w:val="both"/>
-              <w:rPr>
-                <w:rFonts w:ascii="Bookman Old Style" w:hAnsi="Bookman Old Style"/>
-                <w:sz w:val="24"/>
-                <w:szCs w:val="24"/>
-              </w:rPr>
-            </w:pPr>
-            <w:r>
-              <w:rPr>
-                <w:rFonts w:ascii="Bookman Old Style" w:hAnsi="Bookman Old Style"/>
-                <w:sz w:val="24"/>
-                <w:szCs w:val="24"/>
-              </w:rPr>
-              <w:t xml:space="preserve">&lt;&lt;JABATAN_PETUGAS&gt;&gt; </w:t>
-            </w:r>
-            <w:r>
-              <w:rPr>
-                <w:rFonts w:ascii="Bookman Old Style" w:hAnsi="Bookman Old Style" w:cs="Times New Roman"/>
-                <w:color w:val="000000" w:themeColor="text1"/>
-                <w:sz w:val="24"/>
-                <w:szCs w:val="24"/>
-              </w:rPr>
-              <w:t xml:space="preserve">&lt;&lt;URAIAN_PEKERJAAN&gt;&gt;; </w:t>
-            </w:r>
-            <w:r>
-              <w:rPr>
-                <w:rFonts w:ascii="Bookman Old Style" w:hAnsi="Bookman Old Style"/>
-                <w:sz w:val="24"/>
-                <w:szCs w:val="24"/>
-              </w:rPr>
-              <w:t xml:space="preserve">beralamat </w:t>
-            </w:r>
-            <w:r>
-              <w:rPr>
-                <w:rFonts w:ascii="Bookman Old Style" w:hAnsi="Bookman Old Style"/>
-                <w:sz w:val="24"/>
-                <w:szCs w:val="24"/>
-              </w:rPr>
-              <w:t>&lt;&lt;ASAL&gt;&gt;.</w:t>
-            </w:r>
-            <w:r>
-              <w:rPr>
-                <w:rFonts w:ascii="Bookman Old Style" w:hAnsi="Bookman Old Style"/>
-                <w:sz w:val="24"/>
-                <w:szCs w:val="24"/>
-              </w:rPr>
-              <w:t xml:space="preserve"> Bertindak untuk dan atas nama diri sendiri. selanjutnya disebut </w:t>
-            </w:r>
-            <w:r>
-              <w:rPr>
-                <w:rFonts w:ascii="Bookman Old Style" w:hAnsi="Bookman Old Style"/>
-                <w:b/>
-                <w:sz w:val="24"/>
-                <w:szCs w:val="24"/>
-              </w:rPr>
-              <w:t>PIHAK</w:t>
-            </w:r>
-            <w:r>
-              <w:rPr>
-                <w:rFonts w:ascii="Bookman Old Style" w:hAnsi="Bookman Old Style"/>
-                <w:b/>
-                <w:sz w:val="24"/>
-                <w:szCs w:val="24"/>
-              </w:rPr>
-              <w:t xml:space="preserve"> </w:t>
-            </w:r>
-            <w:r>
-              <w:rPr>
-                <w:rFonts w:ascii="Bookman Old Style" w:hAnsi="Bookman Old Style"/>
-                <w:b/>
-                <w:sz w:val="24"/>
-                <w:szCs w:val="24"/>
-              </w:rPr>
-              <w:t>KEDUA</w:t>
-            </w:r>
-            <w:r>
-              <w:rPr>
-                <w:rFonts w:ascii="Bookman Old Style" w:hAnsi="Bookman Old Style"/>
-                <w:sz w:val="24"/>
-                <w:szCs w:val="24"/>
-              </w:rPr>
-              <w:t>.</w:t>
-            </w:r>
-          </w:p>
-        </w:tc>
-      </w:tr>
-    </w:tbl>
-    <w:p>
-      <w:pPr>
-        <w:jc w:val="both"/>
-        <w:rPr>
-          <w:rFonts w:ascii="Bookman Old Style" w:hAnsi="Bookman Old Style"/>
-          <w:sz w:val="24"/>
-          <w:szCs w:val="24"/>
-        </w:rPr>
-      </w:pPr>
-    </w:p>
-    <w:p>
-      <w:pPr>
-        <w:jc w:val="both"/>
-        <w:rPr>
-          <w:rFonts w:ascii="Bookman Old Style" w:hAnsi="Bookman Old Style"/>
-          <w:sz w:val="24"/>
-          <w:szCs w:val="24"/>
-        </w:rPr>
-      </w:pPr>
-    </w:p>
-    <w:p>
-      <w:pPr>
-        <w:tabs>
-          <w:tab w:val="left" w:pos="7830"/>
-        </w:tabs>
-        <w:ind w:right="34"/>
-        <w:jc w:val="both"/>
-        <w:rPr>
-          <w:rFonts w:ascii="Bookman Old Style" w:hAnsi="Bookman Old Style"/>
-          <w:b/>
-          <w:sz w:val="24"/>
-          <w:szCs w:val="24"/>
-        </w:rPr>
-      </w:pPr>
-      <w:r>
-        <w:rPr>
-          <w:rFonts w:ascii="Bookman Old Style" w:hAnsi="Bookman Old Style"/>
-          <w:sz w:val="24"/>
-          <w:szCs w:val="24"/>
-        </w:rPr>
-        <w:t xml:space="preserve">bahwa </w:t>
-      </w:r>
-      <w:r>
-        <w:rPr>
-          <w:rFonts w:ascii="Bookman Old Style" w:hAnsi="Bookman Old Style"/>
-          <w:b/>
-          <w:sz w:val="24"/>
-          <w:szCs w:val="24"/>
-        </w:rPr>
-        <w:t>PIHAK PERTAMA</w:t>
-      </w:r>
-      <w:r>
-        <w:rPr>
-          <w:rFonts w:ascii="Bookman Old Style" w:hAnsi="Bookman Old Style"/>
-          <w:sz w:val="24"/>
-          <w:szCs w:val="24"/>
-        </w:rPr>
-        <w:t xml:space="preserve"> dan </w:t>
-      </w:r>
-      <w:r>
-        <w:rPr>
-          <w:rFonts w:ascii="Bookman Old Style" w:hAnsi="Bookman Old Style"/>
-          <w:b/>
-          <w:sz w:val="24"/>
-          <w:szCs w:val="24"/>
-        </w:rPr>
-        <w:t>PIHAK KEDUA</w:t>
-      </w:r>
-      <w:r>
-        <w:rPr>
-          <w:rFonts w:ascii="Bookman Old Style" w:hAnsi="Bookman Old Style"/>
-          <w:sz w:val="24"/>
-          <w:szCs w:val="24"/>
-        </w:rPr>
-        <w:t xml:space="preserve"> yang secara bersama-sama disebut </w:t>
-      </w:r>
-      <w:r>
-        <w:rPr>
-          <w:rFonts w:ascii="Bookman Old Style" w:hAnsi="Bookman Old Style"/>
-          <w:b/>
-          <w:sz w:val="24"/>
-          <w:szCs w:val="24"/>
-        </w:rPr>
-        <w:t>PARA PIHAK</w:t>
-      </w:r>
-      <w:r>
-        <w:rPr>
-          <w:rFonts w:ascii="Bookman Old Style" w:hAnsi="Bookman Old Style"/>
-          <w:sz w:val="24"/>
-          <w:szCs w:val="24"/>
-        </w:rPr>
-        <w:t xml:space="preserve">. sepakat untuk mengikatkan diri dalam Perjanjian Kerja </w:t>
-      </w:r>
-      <w:r>
-        <w:rPr>
-          <w:rFonts w:ascii="Bookman Old Style" w:hAnsi="Bookman Old Style"/>
-          <w:sz w:val="24"/>
-          <w:szCs w:val="24"/>
-        </w:rPr>
-        <w:t>&lt;&lt;JABATAN_PIHAK_KEDUA&gt;&gt;</w:t>
-      </w:r>
-      <w:r>
-        <w:rPr>
-          <w:rFonts w:ascii="Bookman Old Style" w:hAnsi="Bookman Old Style"/>
-          <w:sz w:val="24"/>
-          <w:szCs w:val="24"/>
-        </w:rPr>
-        <w:t xml:space="preserve"> Kegiatan </w:t>
-      </w:r>
-      <w:r>
-        <w:rPr>
-          <w:rFonts w:ascii="Arial" w:hAnsi="Arial" w:cs="Arial"/>
-          <w:noProof/>
-        </w:rPr>
-        <w:t>&lt;&lt;URAIAN_PEKERJAAN&gt;&gt;</w:t>
-      </w:r>
-      <w:r>
-        <w:rPr>
-          <w:rFonts w:ascii="Arial" w:hAnsi="Arial" w:cs="Arial"/>
-        </w:rPr>
-        <w:t xml:space="preserve"> </w:t>
-      </w:r>
-      <w:r>
-        <w:rPr>
-          <w:rFonts w:ascii="Bookman Old Style" w:hAnsi="Bookman Old Style"/>
-          <w:sz w:val="24"/>
-          <w:szCs w:val="24"/>
-          <w:lang w:val="en-ID"/>
-        </w:rPr>
-        <w:t xml:space="preserve">di Badan Pusat Statistik Kota Subulussalam </w:t>
-      </w:r>
-      <w:r>
-        <w:rPr>
-          <w:rFonts w:ascii="Bookman Old Style" w:hAnsi="Bookman Old Style"/>
-          <w:sz w:val="24"/>
-          <w:szCs w:val="24"/>
-        </w:rPr>
-        <w:t>yang selanjutnya disebut Perjanjian. dengan ketentuan-ketentuan sebagai berikut:</w:t>
-      </w:r>
-    </w:p>
-    <w:p>
-      <w:pPr>
-        <w:jc w:val="both"/>
-        <w:rPr>
-          <w:rFonts w:ascii="Bookman Old Style" w:hAnsi="Bookman Old Style"/>
-          <w:sz w:val="24"/>
-          <w:szCs w:val="24"/>
-        </w:rPr>
-      </w:pPr>
-    </w:p>
-    <w:p>
-      <w:pPr>
-        <w:spacing w:after="120"/>
-        <w:jc w:val="center"/>
-        <w:rPr>
-          <w:rFonts w:ascii="Bookman Old Style" w:hAnsi="Bookman Old Style"/>
-          <w:b/>
-          <w:sz w:val="24"/>
-          <w:szCs w:val="24"/>
-        </w:rPr>
-      </w:pPr>
-      <w:r>
-        <w:rPr>
-          <w:rFonts w:ascii="Bookman Old Style" w:hAnsi="Bookman Old Style"/>
-          <w:b/>
-          <w:sz w:val="24"/>
-          <w:szCs w:val="24"/>
-        </w:rPr>
-        <w:t>Pasal 1</w:t>
-      </w:r>
-    </w:p>
-    <w:p>
-      <w:pPr>
-        <w:jc w:val="both"/>
-        <w:rPr>
-          <w:rFonts w:ascii="Bookman Old Style" w:hAnsi="Bookman Old Style"/>
-          <w:sz w:val="24"/>
-          <w:szCs w:val="24"/>
-        </w:rPr>
-      </w:pPr>
-      <w:r>
-        <w:rPr>
-          <w:rFonts w:ascii="Bookman Old Style" w:hAnsi="Bookman Old Style"/>
-          <w:b/>
-          <w:sz w:val="24"/>
-          <w:szCs w:val="24"/>
-        </w:rPr>
-        <w:t>PIHAK PERTAMA</w:t>
-      </w:r>
-      <w:r>
-        <w:rPr>
-          <w:rFonts w:ascii="Bookman Old Style" w:hAnsi="Bookman Old Style"/>
-          <w:sz w:val="24"/>
-          <w:szCs w:val="24"/>
-        </w:rPr>
-        <w:t xml:space="preserve"> memberikan pekerjaan kepada </w:t>
-      </w:r>
-      <w:r>
-        <w:rPr>
-          <w:rFonts w:ascii="Bookman Old Style" w:hAnsi="Bookman Old Style"/>
-          <w:b/>
-          <w:sz w:val="24"/>
-          <w:szCs w:val="24"/>
-        </w:rPr>
-        <w:t>PIHAK KEDUA</w:t>
-      </w:r>
-      <w:r>
-        <w:rPr>
-          <w:rFonts w:ascii="Bookman Old Style" w:hAnsi="Bookman Old Style"/>
-          <w:sz w:val="24"/>
-          <w:szCs w:val="24"/>
-        </w:rPr>
-        <w:t xml:space="preserve"> dan </w:t>
-      </w:r>
-      <w:r>
-        <w:rPr>
-          <w:rFonts w:ascii="Bookman Old Style" w:hAnsi="Bookman Old Style"/>
-          <w:b/>
-          <w:sz w:val="24"/>
-          <w:szCs w:val="24"/>
-        </w:rPr>
-        <w:t>PIHAK KEDUA</w:t>
-      </w:r>
-      <w:r>
-        <w:rPr>
-          <w:rFonts w:ascii="Bookman Old Style" w:hAnsi="Bookman Old Style"/>
-          <w:sz w:val="24"/>
-          <w:szCs w:val="24"/>
-        </w:rPr>
-        <w:t xml:space="preserve"> menerima pekerjaan dari </w:t>
-      </w:r>
-      <w:r>
-        <w:rPr>
-          <w:rFonts w:ascii="Bookman Old Style" w:hAnsi="Bookman Old Style"/>
-          <w:b/>
-          <w:sz w:val="24"/>
-          <w:szCs w:val="24"/>
-        </w:rPr>
-        <w:t>PIHAK PERTAMA</w:t>
-      </w:r>
-      <w:r>
-        <w:rPr>
-          <w:rFonts w:ascii="Bookman Old Style" w:hAnsi="Bookman Old Style"/>
-          <w:sz w:val="24"/>
-          <w:szCs w:val="24"/>
-        </w:rPr>
-        <w:t xml:space="preserve"> sebagai </w:t>
-      </w:r>
-      <w:r>
-        <w:rPr>
-          <w:rFonts w:ascii="Bookman Old Style" w:hAnsi="Bookman Old Style"/>
-          <w:sz w:val="24"/>
-          <w:szCs w:val="24"/>
-        </w:rPr>
-        <w:t>Petugas</w:t>
-      </w:r>
-      <w:r>
-        <w:rPr>
-          <w:rFonts w:ascii="Bookman Old Style" w:hAnsi="Bookman Old Style"/>
-          <w:sz w:val="24"/>
-          <w:szCs w:val="24"/>
-        </w:rPr>
-        <w:t xml:space="preserve"> </w:t>
-      </w:r>
-      <w:r>
-        <w:rPr>
-          <w:rFonts w:ascii="Arial" w:hAnsi="Arial" w:cs="Arial"/>
-          <w:noProof/>
-        </w:rPr>
-        <w:t>&lt;&lt;URAIAN_PEKERJAAN&gt;&gt;</w:t>
-      </w:r>
-      <w:r>
-        <w:rPr>
-          <w:rFonts w:ascii="Arial" w:hAnsi="Arial" w:cs="Arial"/>
-        </w:rPr>
-        <w:t xml:space="preserve"> </w:t>
-      </w:r>
-      <w:r>
-        <w:rPr>
-          <w:rFonts w:ascii="Bookman Old Style" w:hAnsi="Bookman Old Style"/>
-          <w:sz w:val="24"/>
-          <w:szCs w:val="24"/>
-        </w:rPr>
-        <w:t xml:space="preserve"> </w:t>
-      </w:r>
-      <w:r>
-        <w:rPr>
-          <w:rFonts w:ascii="Bookman Old Style" w:hAnsi="Bookman Old Style"/>
-          <w:sz w:val="24"/>
-          <w:szCs w:val="24"/>
-        </w:rPr>
-        <w:t xml:space="preserve">dengan lingkup pekerjaan yang ditetapkan oleh </w:t>
-      </w:r>
-      <w:r>
-        <w:rPr>
-          <w:rFonts w:ascii="Bookman Old Style" w:hAnsi="Bookman Old Style"/>
-          <w:b/>
-          <w:sz w:val="24"/>
-          <w:szCs w:val="24"/>
-        </w:rPr>
-        <w:t>PIHAK PERTAMA</w:t>
-      </w:r>
-      <w:r>
-        <w:rPr>
-          <w:rFonts w:ascii="Bookman Old Style" w:hAnsi="Bookman Old Style"/>
-          <w:sz w:val="24"/>
-          <w:szCs w:val="24"/>
-        </w:rPr>
-        <w:t>.</w:t>
-      </w:r>
-    </w:p>
-    <w:p>
-      <w:pPr>
-        <w:jc w:val="center"/>
-        <w:rPr>
-          <w:rFonts w:ascii="Bookman Old Style" w:hAnsi="Bookman Old Style"/>
-          <w:b/>
-          <w:sz w:val="24"/>
-          <w:szCs w:val="24"/>
-        </w:rPr>
-      </w:pPr>
-    </w:p>
-    <w:p>
-      <w:pPr>
-        <w:spacing w:after="120"/>
-        <w:jc w:val="center"/>
-        <w:rPr>
-          <w:rFonts w:ascii="Bookman Old Style" w:hAnsi="Bookman Old Style"/>
-          <w:b/>
-          <w:sz w:val="24"/>
-          <w:szCs w:val="24"/>
-        </w:rPr>
-      </w:pPr>
-      <w:r>
-        <w:rPr>
-          <w:rFonts w:ascii="Bookman Old Style" w:hAnsi="Bookman Old Style"/>
-          <w:b/>
-          <w:sz w:val="24"/>
-          <w:szCs w:val="24"/>
-        </w:rPr>
-        <w:t>Pasal 2</w:t>
-      </w:r>
-    </w:p>
-    <w:p>
-      <w:pPr>
-        <w:jc w:val="both"/>
-        <w:rPr>
-          <w:rFonts w:ascii="Bookman Old Style" w:hAnsi="Bookman Old Style"/>
-          <w:strike/>
-          <w:color w:val="FF0000"/>
-          <w:sz w:val="24"/>
-          <w:szCs w:val="24"/>
-        </w:rPr>
-      </w:pPr>
-      <w:r>
-        <w:rPr>
-          <w:rFonts w:ascii="Bookman Old Style" w:hAnsi="Bookman Old Style"/>
-          <w:sz w:val="24"/>
-          <w:szCs w:val="24"/>
-        </w:rPr>
-        <w:t xml:space="preserve">Ruang lingkup pekerjaan dalam Perjanjian ini mengacu pada wilayah kerja. </w:t>
-      </w:r>
-      <w:r>
-        <w:rPr>
-          <w:rFonts w:ascii="Bookman Old Style" w:hAnsi="Bookman Old Style"/>
-          <w:sz w:val="24"/>
-          <w:szCs w:val="24"/>
-        </w:rPr>
-        <w:t>&lt;&lt;BUKU_PEDOMAN&gt;&gt;</w:t>
-      </w:r>
-      <w:r>
-        <w:rPr>
-          <w:rFonts w:ascii="Bookman Old Style" w:hAnsi="Bookman Old Style"/>
-          <w:sz w:val="24"/>
-          <w:szCs w:val="24"/>
-        </w:rPr>
-        <w:t xml:space="preserve"> </w:t>
-      </w:r>
-      <w:r>
-        <w:rPr>
-          <w:rFonts w:ascii="Bookman Old Style" w:hAnsi="Bookman Old Style"/>
-          <w:color w:val="000000"/>
-          <w:sz w:val="24"/>
-          <w:szCs w:val="24"/>
-          <w:lang w:val="en-ID"/>
-        </w:rPr>
-        <w:t xml:space="preserve">dan </w:t>
-      </w:r>
-      <w:r>
-        <w:rPr>
-          <w:rFonts w:ascii="Bookman Old Style" w:hAnsi="Bookman Old Style"/>
-          <w:sz w:val="24"/>
-          <w:szCs w:val="24"/>
-        </w:rPr>
-        <w:t xml:space="preserve">ketentuan-ketentuan yang ditetapkan oleh </w:t>
-      </w:r>
-      <w:r>
-        <w:rPr>
-          <w:rFonts w:ascii="Bookman Old Style" w:hAnsi="Bookman Old Style"/>
-          <w:b/>
-          <w:sz w:val="24"/>
-          <w:szCs w:val="24"/>
-        </w:rPr>
-        <w:t>PIHAK PERTAMA</w:t>
-      </w:r>
-      <w:r>
-        <w:rPr>
-          <w:rFonts w:ascii="Bookman Old Style" w:hAnsi="Bookman Old Style"/>
-          <w:sz w:val="24"/>
-          <w:szCs w:val="24"/>
-        </w:rPr>
-        <w:t>.</w:t>
-      </w:r>
-      <w:r>
-        <w:rPr>
-          <w:rFonts w:ascii="Bookman Old Style" w:hAnsi="Bookman Old Style"/>
-          <w:strike/>
-          <w:color w:val="FF0000"/>
-          <w:sz w:val="24"/>
-          <w:szCs w:val="24"/>
-        </w:rPr>
-        <w:t xml:space="preserve"> </w:t>
-      </w:r>
-    </w:p>
-    <w:p>
-      <w:pPr>
-        <w:jc w:val="both"/>
-        <w:rPr>
-          <w:rFonts w:ascii="Bookman Old Style" w:hAnsi="Bookman Old Style"/>
-          <w:sz w:val="24"/>
-          <w:szCs w:val="24"/>
-        </w:rPr>
-      </w:pPr>
-    </w:p>
-    <w:p>
-      <w:pPr>
-        <w:spacing w:after="120"/>
-        <w:jc w:val="center"/>
-        <w:rPr>
-          <w:rFonts w:ascii="Bookman Old Style" w:hAnsi="Bookman Old Style"/>
-          <w:b/>
-          <w:sz w:val="24"/>
-          <w:szCs w:val="24"/>
-        </w:rPr>
-      </w:pPr>
-      <w:r>
-        <w:rPr>
-          <w:rFonts w:ascii="Bookman Old Style" w:hAnsi="Bookman Old Style"/>
-          <w:b/>
-          <w:sz w:val="24"/>
-          <w:szCs w:val="24"/>
-        </w:rPr>
-        <w:t>Pasal 3</w:t>
-      </w:r>
-    </w:p>
-    <w:p>
-      <w:pPr>
-        <w:jc w:val="both"/>
-        <w:rPr>
-          <w:rFonts w:ascii="Bookman Old Style" w:hAnsi="Bookman Old Style"/>
-          <w:color w:val="000000"/>
-          <w:sz w:val="24"/>
-          <w:szCs w:val="24"/>
-        </w:rPr>
-      </w:pPr>
-      <w:r>
-        <w:rPr>
-          <w:rFonts w:ascii="Bookman Old Style" w:hAnsi="Bookman Old Style"/>
-          <w:sz w:val="24"/>
-          <w:szCs w:val="24"/>
-        </w:rPr>
-        <w:lastRenderedPageBreak/>
-        <w:t xml:space="preserve">Jangka Waktu Perjanjian terhitung sejak </w:t>
-      </w:r>
-      <w:r>
-        <w:rPr>
-          <w:rFonts w:ascii="Bookman Old Style" w:hAnsi="Bookman Old Style"/>
-          <w:sz w:val="24"/>
-          <w:szCs w:val="24"/>
-        </w:rPr>
-        <w:t>ditandatangani</w:t>
-      </w:r>
-      <w:r>
-        <w:rPr>
-          <w:rFonts w:ascii="Bookman Old Style" w:hAnsi="Bookman Old Style"/>
-          <w:sz w:val="24"/>
-          <w:szCs w:val="24"/>
-        </w:rPr>
-        <w:t xml:space="preserve"> </w:t>
-      </w:r>
-      <w:r>
-        <w:rPr>
-          <w:rFonts w:ascii="Bookman Old Style" w:hAnsi="Bookman Old Style"/>
-          <w:sz w:val="24"/>
-          <w:szCs w:val="24"/>
-        </w:rPr>
-        <w:t xml:space="preserve">sampai dengan tanggal </w:t>
-      </w:r>
-      <w:r>
-        <w:rPr>
-          <w:rFonts w:ascii="Bookman Old Style" w:hAnsi="Bookman Old Style"/>
-          <w:sz w:val="24"/>
-          <w:szCs w:val="24"/>
-        </w:rPr>
-        <w:t>&lt;&lt;TANGGAL_SELESAI&gt;&gt;.</w:t>
-      </w:r>
-    </w:p>
-    <w:p>
-      <w:pPr>
-        <w:tabs>
-          <w:tab w:val="left" w:pos="2964"/>
-        </w:tabs>
-        <w:rPr>
-          <w:rFonts w:ascii="Bookman Old Style" w:hAnsi="Bookman Old Style"/>
-          <w:sz w:val="24"/>
-          <w:szCs w:val="24"/>
-        </w:rPr>
-      </w:pPr>
-    </w:p>
-    <w:p>
-      <w:pPr>
-        <w:spacing w:after="120"/>
-        <w:jc w:val="center"/>
-        <w:rPr>
-          <w:rFonts w:ascii="Bookman Old Style" w:hAnsi="Bookman Old Style"/>
-          <w:b/>
-          <w:sz w:val="24"/>
-          <w:szCs w:val="24"/>
-        </w:rPr>
-      </w:pPr>
-      <w:r>
-        <w:rPr>
-          <w:rFonts w:ascii="Bookman Old Style" w:hAnsi="Bookman Old Style"/>
-          <w:b/>
-          <w:sz w:val="24"/>
-          <w:szCs w:val="24"/>
-        </w:rPr>
-        <w:t>Pasal 4</w:t>
-      </w:r>
-    </w:p>
-    <w:p>
-      <w:pPr>
-        <w:jc w:val="both"/>
-        <w:rPr>
-          <w:rFonts w:ascii="Bookman Old Style" w:hAnsi="Bookman Old Style"/>
-          <w:sz w:val="24"/>
-          <w:szCs w:val="24"/>
-        </w:rPr>
-      </w:pPr>
-      <w:r>
-        <w:rPr>
-          <w:rFonts w:ascii="Bookman Old Style" w:hAnsi="Bookman Old Style"/>
-          <w:b/>
-          <w:sz w:val="24"/>
-          <w:szCs w:val="24"/>
-        </w:rPr>
-        <w:t>PIHAK KEDUA</w:t>
-      </w:r>
-      <w:r>
-        <w:rPr>
-          <w:rFonts w:ascii="Bookman Old Style" w:hAnsi="Bookman Old Style"/>
-          <w:sz w:val="24"/>
-          <w:szCs w:val="24"/>
-        </w:rPr>
-        <w:t xml:space="preserve"> berkewajiban melaksanakan seluruh pekerjaan yang diberikan oleh </w:t>
-      </w:r>
-      <w:r>
-        <w:rPr>
-          <w:rFonts w:ascii="Bookman Old Style" w:hAnsi="Bookman Old Style"/>
-          <w:b/>
-          <w:sz w:val="24"/>
-          <w:szCs w:val="24"/>
-        </w:rPr>
-        <w:t>PIHAK PERTAMA</w:t>
-      </w:r>
-      <w:r>
-        <w:rPr>
-          <w:rFonts w:ascii="Bookman Old Style" w:hAnsi="Bookman Old Style"/>
-          <w:sz w:val="24"/>
-          <w:szCs w:val="24"/>
-        </w:rPr>
-        <w:t xml:space="preserve"> sampai selesai. sesuai ruang lingkup pekerjaan sebagaimana dimaksud dalam Pasal 2.</w:t>
-      </w:r>
-    </w:p>
-    <w:p>
-      <w:pPr>
-        <w:jc w:val="both"/>
-        <w:rPr>
-          <w:rFonts w:ascii="Bookman Old Style" w:hAnsi="Bookman Old Style"/>
-          <w:sz w:val="24"/>
-          <w:szCs w:val="24"/>
-        </w:rPr>
-      </w:pPr>
-    </w:p>
-    <w:p>
-      <w:pPr>
-        <w:spacing w:after="120"/>
-        <w:jc w:val="center"/>
-        <w:rPr>
-          <w:rFonts w:ascii="Bookman Old Style" w:hAnsi="Bookman Old Style"/>
-          <w:b/>
-          <w:sz w:val="24"/>
-          <w:szCs w:val="24"/>
-        </w:rPr>
-      </w:pPr>
-      <w:r>
-        <w:rPr>
-          <w:rFonts w:ascii="Bookman Old Style" w:hAnsi="Bookman Old Style"/>
-          <w:b/>
-          <w:sz w:val="24"/>
-          <w:szCs w:val="24"/>
-        </w:rPr>
-        <w:t>Pasal 5</w:t>
-      </w:r>
-    </w:p>
-    <w:p>
-      <w:pPr>
-        <w:pStyle w:val="ListParagraph"/>
-        <w:numPr>
-          <w:ilvl w:val="0"/>
-          <w:numId w:val="40"/>
-        </w:numPr>
-        <w:tabs>
-          <w:tab w:val="left" w:pos="540"/>
-        </w:tabs>
-        <w:ind w:left="547" w:hanging="547"/>
-        <w:contextualSpacing w:val="0"/>
-        <w:jc w:val="both"/>
-        <w:rPr>
-          <w:rFonts w:ascii="Bookman Old Style" w:hAnsi="Bookman Old Style"/>
-          <w:color w:val="000000"/>
-          <w:sz w:val="24"/>
-          <w:szCs w:val="24"/>
-        </w:rPr>
-      </w:pPr>
-      <w:r>
-        <w:rPr>
-          <w:rFonts w:ascii="Bookman Old Style" w:hAnsi="Bookman Old Style"/>
-          <w:b/>
-          <w:sz w:val="24"/>
-          <w:szCs w:val="24"/>
-        </w:rPr>
-        <w:t>PIHAK KEDUA</w:t>
-      </w:r>
-      <w:r>
-        <w:rPr>
-          <w:rFonts w:ascii="Bookman Old Style" w:hAnsi="Bookman Old Style"/>
-          <w:sz w:val="24"/>
-          <w:szCs w:val="24"/>
-        </w:rPr>
-        <w:t xml:space="preserve"> berhak untuk mendapatkan honorarium petugas dari </w:t>
-      </w:r>
-      <w:r>
-        <w:rPr>
-          <w:rFonts w:ascii="Bookman Old Style" w:hAnsi="Bookman Old Style"/>
-          <w:b/>
-          <w:sz w:val="24"/>
-          <w:szCs w:val="24"/>
-        </w:rPr>
-        <w:t xml:space="preserve">PIHAK PERTAMA </w:t>
-      </w:r>
-      <w:r>
-        <w:rPr>
-          <w:rFonts w:ascii="Bookman Old Style" w:hAnsi="Bookman Old Style"/>
-          <w:sz w:val="24"/>
-          <w:szCs w:val="24"/>
-        </w:rPr>
-        <w:t xml:space="preserve">sebesar </w:t>
-      </w:r>
-      <w:r>
-        <w:rPr>
-          <w:rFonts w:ascii="Bookman Old Style" w:hAnsi="Bookman Old Style"/>
-          <w:spacing w:val="-2"/>
-          <w:w w:val="105"/>
-          <w:sz w:val="24"/>
-          <w:szCs w:val="24"/>
-        </w:rPr>
-        <w:t xml:space="preserve">Rp. </w:t>
-      </w:r>
-      <w:r>
-        <w:rPr>
-          <w:rFonts w:ascii="Bookman Old Style" w:hAnsi="Bookman Old Style"/>
-          <w:color w:val="000000" w:themeColor="text1"/>
-          <w:spacing w:val="-2"/>
-          <w:w w:val="105"/>
-          <w:sz w:val="24"/>
-          <w:szCs w:val="24"/>
-        </w:rPr>
-        <w:t>&lt;&lt;TOTAL_HONOR&gt;&gt;</w:t>
-      </w:r>
-      <w:r>
-        <w:rPr>
-          <w:rFonts w:ascii="Bookman Old Style" w:hAnsi="Bookman Old Style"/>
-          <w:color w:val="000000" w:themeColor="text1"/>
-          <w:spacing w:val="-2"/>
-          <w:w w:val="105"/>
-          <w:sz w:val="24"/>
-          <w:szCs w:val="24"/>
-        </w:rPr>
-        <w:t>,-</w:t>
-      </w:r>
-      <w:r>
-        <w:rPr>
-          <w:rFonts w:ascii="Bookman Old Style" w:hAnsi="Bookman Old Style"/>
-          <w:color w:val="000000" w:themeColor="text1"/>
-          <w:sz w:val="24"/>
-          <w:szCs w:val="24"/>
-        </w:rPr>
-        <w:t xml:space="preserve"> </w:t>
-      </w:r>
-      <w:r>
-        <w:rPr>
-          <w:rFonts w:ascii="Bookman Old Style" w:hAnsi="Bookman Old Style"/>
-          <w:color w:val="000000" w:themeColor="text1"/>
-          <w:sz w:val="24"/>
-          <w:szCs w:val="24"/>
-        </w:rPr>
-        <w:t>(</w:t>
-      </w:r>
-      <w:r>
-        <w:rPr>
-          <w:rFonts w:ascii="Bookman Old Style" w:hAnsi="Bookman Old Style"/>
-          <w:spacing w:val="-7"/>
-          <w:w w:val="105"/>
-          <w:sz w:val="24"/>
-          <w:szCs w:val="24"/>
-        </w:rPr>
-        <w:t>&lt;&lt;TERBILANG_TOTAL_HONOR&gt;&gt;</w:t>
-      </w:r>
-      <w:r>
-        <w:rPr>
-          <w:rFonts w:ascii="Bookman Old Style" w:hAnsi="Bookman Old Style"/>
-          <w:sz w:val="24"/>
-          <w:szCs w:val="24"/>
-        </w:rPr>
-        <w:t>).</w:t>
-      </w:r>
-      <w:r>
-        <w:rPr>
-          <w:rFonts w:ascii="Bookman Old Style" w:hAnsi="Bookman Old Style"/>
-          <w:sz w:val="24"/>
-          <w:szCs w:val="24"/>
-        </w:rPr>
-        <w:t xml:space="preserve"> </w:t>
-      </w:r>
-      <w:r>
-        <w:rPr>
-          <w:rFonts w:ascii="Bookman Old Style" w:hAnsi="Bookman Old Style"/>
-          <w:sz w:val="24"/>
-          <w:szCs w:val="24"/>
-        </w:rPr>
-        <w:t xml:space="preserve">yang dibayarkan </w:t>
-      </w:r>
-      <w:r>
-        <w:rPr>
-          <w:rFonts w:ascii="Bookman Old Style" w:hAnsi="Bookman Old Style"/>
-          <w:b/>
-          <w:sz w:val="24"/>
-          <w:szCs w:val="24"/>
-        </w:rPr>
-        <w:t>PIHAK PERTAMA</w:t>
-      </w:r>
-      <w:r>
-        <w:rPr>
-          <w:rFonts w:ascii="Bookman Old Style" w:hAnsi="Bookman Old Style"/>
-          <w:sz w:val="24"/>
-          <w:szCs w:val="24"/>
-        </w:rPr>
-        <w:t xml:space="preserve"> kepada </w:t>
-      </w:r>
-      <w:r>
-        <w:rPr>
-          <w:rFonts w:ascii="Bookman Old Style" w:hAnsi="Bookman Old Style"/>
-          <w:b/>
-          <w:sz w:val="24"/>
-          <w:szCs w:val="24"/>
-        </w:rPr>
-        <w:t>PIHAK KEDUA</w:t>
-      </w:r>
-      <w:r>
-        <w:rPr>
-          <w:rFonts w:ascii="Bookman Old Style" w:hAnsi="Bookman Old Style"/>
-          <w:sz w:val="24"/>
-          <w:szCs w:val="24"/>
-        </w:rPr>
-        <w:t xml:space="preserve"> sesuai pencapaian target pekerjaan </w:t>
-      </w:r>
-      <w:r>
-        <w:rPr>
-          <w:rFonts w:ascii="Bookman Old Style" w:hAnsi="Bookman Old Style"/>
-          <w:b/>
-          <w:sz w:val="24"/>
-          <w:szCs w:val="24"/>
-        </w:rPr>
-        <w:t>PIHAK KEDUA</w:t>
-      </w:r>
-      <w:r>
-        <w:rPr>
-          <w:rFonts w:ascii="Bookman Old Style" w:hAnsi="Bookman Old Style"/>
-          <w:sz w:val="24"/>
-          <w:szCs w:val="24"/>
-        </w:rPr>
-        <w:t>.</w:t>
-      </w:r>
-      <w:r>
-        <w:rPr>
-          <w:rFonts w:ascii="Bookman Old Style" w:hAnsi="Bookman Old Style"/>
-          <w:color w:val="000000"/>
-          <w:sz w:val="24"/>
-          <w:szCs w:val="24"/>
-        </w:rPr>
-        <w:t xml:space="preserve"> sudah termasuk biaya pajak. bea materai. pulsa dan kuota internet untuk komunikasi. dan jasa pelayanan keuangan.</w:t>
-      </w:r>
-    </w:p>
-    <w:p>
-      <w:pPr>
-        <w:pStyle w:val="ListParagraph"/>
-        <w:tabs>
-          <w:tab w:val="left" w:pos="540"/>
-        </w:tabs>
-        <w:ind w:left="547"/>
-        <w:jc w:val="both"/>
-        <w:rPr>
-          <w:rFonts w:ascii="Bookman Old Style" w:hAnsi="Bookman Old Style"/>
-          <w:color w:val="000000"/>
-          <w:sz w:val="24"/>
-          <w:szCs w:val="24"/>
-        </w:rPr>
-      </w:pPr>
-    </w:p>
-    <w:p>
-      <w:pPr>
-        <w:pStyle w:val="ListParagraph"/>
-        <w:numPr>
-          <w:ilvl w:val="0"/>
-          <w:numId w:val="40"/>
-        </w:numPr>
-        <w:tabs>
-          <w:tab w:val="left" w:pos="540"/>
-        </w:tabs>
-        <w:ind w:left="547" w:hanging="547"/>
-        <w:contextualSpacing w:val="0"/>
-        <w:jc w:val="both"/>
-        <w:rPr>
-          <w:rFonts w:ascii="Bookman Old Style" w:hAnsi="Bookman Old Style"/>
-          <w:color w:val="000000"/>
-          <w:sz w:val="24"/>
-          <w:szCs w:val="24"/>
-        </w:rPr>
-      </w:pPr>
-      <w:r>
-        <w:rPr>
-          <w:rFonts w:ascii="Bookman Old Style" w:hAnsi="Bookman Old Style"/>
-          <w:b/>
-          <w:sz w:val="24"/>
-          <w:szCs w:val="24"/>
-        </w:rPr>
-        <w:t>PIHAK KEDUA</w:t>
-      </w:r>
-      <w:r>
-        <w:rPr>
-          <w:rFonts w:ascii="Bookman Old Style" w:hAnsi="Bookman Old Style"/>
-          <w:sz w:val="24"/>
-          <w:szCs w:val="24"/>
-        </w:rPr>
-        <w:t xml:space="preserve"> </w:t>
-      </w:r>
-      <w:r>
-        <w:rPr>
-          <w:rFonts w:ascii="Bookman Old Style" w:hAnsi="Bookman Old Style"/>
-          <w:sz w:val="24"/>
-          <w:szCs w:val="24"/>
-          <w:lang w:val="en-ID"/>
-        </w:rPr>
-        <w:t>t</w:t>
-      </w:r>
-      <w:r>
-        <w:rPr>
-          <w:rFonts w:ascii="Bookman Old Style" w:hAnsi="Bookman Old Style"/>
-          <w:sz w:val="24"/>
-          <w:szCs w:val="24"/>
-        </w:rPr>
-        <w:t xml:space="preserve">idak </w:t>
-      </w:r>
-      <w:r>
-        <w:rPr>
-          <w:rFonts w:ascii="Bookman Old Style" w:hAnsi="Bookman Old Style"/>
-          <w:sz w:val="24"/>
-          <w:szCs w:val="24"/>
-          <w:lang w:val="en-ID"/>
-        </w:rPr>
-        <w:t>diberikan</w:t>
-      </w:r>
-      <w:r>
-        <w:rPr>
-          <w:rFonts w:ascii="Bookman Old Style" w:hAnsi="Bookman Old Style"/>
-          <w:sz w:val="24"/>
-          <w:szCs w:val="24"/>
-        </w:rPr>
-        <w:t xml:space="preserve"> honorarium tambahan apabila </w:t>
-      </w:r>
-      <w:r>
-        <w:rPr>
-          <w:rFonts w:ascii="Bookman Old Style" w:hAnsi="Bookman Old Style"/>
-          <w:sz w:val="24"/>
-          <w:szCs w:val="24"/>
-          <w:lang w:val="en-ID"/>
-        </w:rPr>
-        <w:t>melakukan</w:t>
-      </w:r>
-      <w:r>
-        <w:rPr>
-          <w:rFonts w:ascii="Bookman Old Style" w:hAnsi="Bookman Old Style"/>
-          <w:sz w:val="24"/>
-          <w:szCs w:val="24"/>
-        </w:rPr>
-        <w:t xml:space="preserve"> kunjungan di luar jadwal pelaksanaan </w:t>
-      </w:r>
-      <w:r>
-        <w:rPr>
-          <w:rFonts w:ascii="Bookman Old Style" w:hAnsi="Bookman Old Style"/>
-          <w:sz w:val="24"/>
-          <w:szCs w:val="24"/>
-          <w:lang w:val="en-ID"/>
-        </w:rPr>
-        <w:t xml:space="preserve">pekerjaan </w:t>
-      </w:r>
-      <w:r>
-        <w:rPr>
-          <w:rFonts w:ascii="Bookman Old Style" w:hAnsi="Bookman Old Style"/>
-          <w:sz w:val="24"/>
-          <w:szCs w:val="24"/>
-        </w:rPr>
-        <w:t>lapangan.</w:t>
-      </w:r>
-    </w:p>
-    <w:p>
-      <w:pPr>
-        <w:jc w:val="center"/>
-        <w:rPr>
-          <w:rFonts w:ascii="Bookman Old Style" w:hAnsi="Bookman Old Style"/>
-          <w:b/>
-          <w:sz w:val="24"/>
-          <w:szCs w:val="24"/>
-        </w:rPr>
-      </w:pPr>
-    </w:p>
-    <w:p>
-      <w:pPr>
-        <w:spacing w:after="120"/>
-        <w:jc w:val="center"/>
-        <w:rPr>
-          <w:rFonts w:ascii="Bookman Old Style" w:hAnsi="Bookman Old Style"/>
-          <w:b/>
-          <w:sz w:val="24"/>
-          <w:szCs w:val="24"/>
-        </w:rPr>
-      </w:pPr>
-      <w:r>
-        <w:rPr>
-          <w:rFonts w:ascii="Bookman Old Style" w:hAnsi="Bookman Old Style"/>
-          <w:b/>
-          <w:sz w:val="24"/>
-          <w:szCs w:val="24"/>
-        </w:rPr>
-        <w:t>Pasal 6</w:t>
-      </w:r>
-    </w:p>
-    <w:p>
-      <w:pPr>
-        <w:jc w:val="both"/>
-        <w:rPr>
-          <w:rFonts w:ascii="Bookman Old Style" w:hAnsi="Bookman Old Style"/>
-          <w:sz w:val="24"/>
-          <w:szCs w:val="24"/>
-        </w:rPr>
-      </w:pPr>
-      <w:r>
-        <w:rPr>
-          <w:rFonts w:ascii="Bookman Old Style" w:hAnsi="Bookman Old Style"/>
-          <w:sz w:val="24"/>
-          <w:szCs w:val="24"/>
-        </w:rPr>
-        <w:t xml:space="preserve">Pembayaran honorarium sebagaimana dimaksud dalam Pasal 5 dilakukan setelah </w:t>
-      </w:r>
-      <w:r>
-        <w:rPr>
-          <w:rFonts w:ascii="Bookman Old Style" w:hAnsi="Bookman Old Style"/>
-          <w:b/>
-          <w:sz w:val="24"/>
-          <w:szCs w:val="24"/>
-        </w:rPr>
-        <w:t>PIHAK KEDUA</w:t>
-      </w:r>
-      <w:r>
-        <w:rPr>
-          <w:rFonts w:ascii="Bookman Old Style" w:hAnsi="Bookman Old Style"/>
-          <w:sz w:val="24"/>
-          <w:szCs w:val="24"/>
-        </w:rPr>
-        <w:t xml:space="preserve"> menyelesaikan dan menyerahkan seluruh hasil pekerjaan sebagaimana dimaksud dalam Pasal 2 kepada </w:t>
-      </w:r>
-      <w:r>
-        <w:rPr>
-          <w:rFonts w:ascii="Bookman Old Style" w:hAnsi="Bookman Old Style"/>
-          <w:b/>
-          <w:sz w:val="24"/>
-          <w:szCs w:val="24"/>
-        </w:rPr>
-        <w:t>PIHAK PERTAMA</w:t>
-      </w:r>
-      <w:r>
-        <w:rPr>
-          <w:rFonts w:ascii="Bookman Old Style" w:hAnsi="Bookman Old Style"/>
-          <w:sz w:val="24"/>
-          <w:szCs w:val="24"/>
-        </w:rPr>
-        <w:t>.</w:t>
-      </w:r>
-    </w:p>
-    <w:p>
-      <w:pPr>
-        <w:jc w:val="both"/>
-        <w:rPr>
-          <w:rFonts w:ascii="Bookman Old Style" w:hAnsi="Bookman Old Style"/>
-          <w:sz w:val="24"/>
-          <w:szCs w:val="24"/>
-        </w:rPr>
-      </w:pPr>
-    </w:p>
-    <w:p>
-      <w:pPr>
-        <w:spacing w:after="120"/>
-        <w:jc w:val="center"/>
-        <w:rPr>
-          <w:rFonts w:ascii="Bookman Old Style" w:hAnsi="Bookman Old Style"/>
-          <w:b/>
-          <w:sz w:val="24"/>
-          <w:szCs w:val="24"/>
-        </w:rPr>
-      </w:pPr>
-      <w:r>
-        <w:rPr>
-          <w:rFonts w:ascii="Bookman Old Style" w:hAnsi="Bookman Old Style"/>
-          <w:b/>
-          <w:sz w:val="24"/>
-          <w:szCs w:val="24"/>
-        </w:rPr>
-        <w:t>Pasal 7</w:t>
-      </w:r>
-    </w:p>
-    <w:p>
-      <w:pPr>
-        <w:pStyle w:val="ListParagraph"/>
-        <w:numPr>
-          <w:ilvl w:val="0"/>
-          <w:numId w:val="44"/>
-        </w:numPr>
-        <w:ind w:hanging="720"/>
-        <w:jc w:val="both"/>
-        <w:rPr>
-          <w:rFonts w:ascii="Bookman Old Style" w:hAnsi="Bookman Old Style"/>
-          <w:color w:val="FF0000"/>
-          <w:sz w:val="24"/>
-          <w:szCs w:val="24"/>
-        </w:rPr>
-      </w:pPr>
-      <w:r>
-        <w:rPr>
-          <w:rFonts w:ascii="Bookman Old Style" w:hAnsi="Bookman Old Style"/>
-          <w:sz w:val="24"/>
-          <w:szCs w:val="24"/>
-        </w:rPr>
-        <w:t xml:space="preserve">Penyerahan seluruh hasil pekerjaan lapangan sebagaimana dimaksud dalam Pasal 2 dilaksanakan oleh </w:t>
-      </w:r>
-      <w:r>
-        <w:rPr>
-          <w:rFonts w:ascii="Bookman Old Style" w:hAnsi="Bookman Old Style"/>
-          <w:b/>
-          <w:sz w:val="24"/>
-          <w:szCs w:val="24"/>
-        </w:rPr>
-        <w:t>PIHAK KEDUA</w:t>
-      </w:r>
-      <w:r>
-        <w:rPr>
-          <w:rFonts w:ascii="Bookman Old Style" w:hAnsi="Bookman Old Style"/>
-          <w:sz w:val="24"/>
-          <w:szCs w:val="24"/>
-        </w:rPr>
-        <w:t xml:space="preserve"> kepada </w:t>
-      </w:r>
-      <w:r>
-        <w:rPr>
-          <w:rFonts w:ascii="Bookman Old Style" w:hAnsi="Bookman Old Style"/>
-          <w:b/>
-          <w:sz w:val="24"/>
-          <w:szCs w:val="24"/>
-        </w:rPr>
-        <w:t>PIHAK PERTAMA</w:t>
-      </w:r>
-      <w:r>
-        <w:rPr>
-          <w:rFonts w:ascii="Bookman Old Style" w:hAnsi="Bookman Old Style"/>
-          <w:sz w:val="24"/>
-          <w:szCs w:val="24"/>
-        </w:rPr>
-        <w:t xml:space="preserve"> yang dinyatakan dalam Berita Acara Serah Terima Hasil Pekerjaan dan ditandatangani oleh </w:t>
-      </w:r>
-      <w:r>
-        <w:rPr>
-          <w:rFonts w:ascii="Bookman Old Style" w:hAnsi="Bookman Old Style"/>
-          <w:b/>
-          <w:sz w:val="24"/>
-          <w:szCs w:val="24"/>
-        </w:rPr>
-        <w:t>PARA PIHAK</w:t>
-      </w:r>
-      <w:r>
-        <w:rPr>
-          <w:rFonts w:ascii="Bookman Old Style" w:hAnsi="Bookman Old Style"/>
-          <w:sz w:val="24"/>
-          <w:szCs w:val="24"/>
-        </w:rPr>
-        <w:t>. pa</w:t>
-      </w:r>
-      <w:r>
-        <w:rPr>
-          <w:rFonts w:ascii="Bookman Old Style" w:hAnsi="Bookman Old Style"/>
-          <w:sz w:val="24"/>
-          <w:szCs w:val="24"/>
-        </w:rPr>
-        <w:t xml:space="preserve">ling lambat pada tanggal </w:t>
-      </w:r>
-      <w:r>
-        <w:rPr>
-          <w:rFonts w:ascii="Bookman Old Style" w:hAnsi="Bookman Old Style"/>
-          <w:sz w:val="24"/>
-          <w:szCs w:val="24"/>
-        </w:rPr>
-        <w:t>&lt;&lt;TANGGAL_SELESAI&gt;&gt;.</w:t>
-      </w:r>
-    </w:p>
-    <w:p>
-      <w:pPr>
-        <w:pStyle w:val="ListParagraph"/>
-        <w:numPr>
-          <w:ilvl w:val="0"/>
-          <w:numId w:val="44"/>
-        </w:numPr>
-        <w:spacing w:line="240" w:lineRule="auto"/>
-        <w:ind w:hanging="720"/>
-        <w:jc w:val="both"/>
-        <w:rPr>
-          <w:rFonts w:ascii="Bookman Old Style" w:hAnsi="Bookman Old Style"/>
-          <w:color w:val="000000"/>
-          <w:sz w:val="24"/>
-          <w:szCs w:val="24"/>
-        </w:rPr>
-      </w:pPr>
-      <w:r>
-        <w:rPr>
-          <w:rFonts w:ascii="Bookman Old Style" w:hAnsi="Bookman Old Style"/>
-          <w:color w:val="000000"/>
-          <w:sz w:val="24"/>
-          <w:szCs w:val="24"/>
-        </w:rPr>
-        <w:t xml:space="preserve">Apabila terdapat hambatan dalam penyerahan hasil pekerjaan sebagaimana dimaksud pada ayat (1). </w:t>
-      </w:r>
-      <w:r>
-        <w:rPr>
-          <w:rFonts w:ascii="Bookman Old Style" w:hAnsi="Bookman Old Style"/>
-          <w:b/>
-          <w:bCs/>
-          <w:color w:val="000000"/>
-          <w:sz w:val="24"/>
-          <w:szCs w:val="24"/>
-        </w:rPr>
-        <w:t>PIHAK PERTAMA</w:t>
-      </w:r>
-      <w:r>
-        <w:rPr>
-          <w:rFonts w:ascii="Bookman Old Style" w:hAnsi="Bookman Old Style"/>
-          <w:color w:val="000000"/>
-          <w:sz w:val="24"/>
-          <w:szCs w:val="24"/>
-        </w:rPr>
-        <w:t xml:space="preserve"> dapat memberikan tambahan waktu penyerahan seluruh hasil pekerjaan apangan paling lambat pada </w:t>
-      </w:r>
-      <w:r>
-        <w:rPr>
-          <w:rFonts w:ascii="Bookman Old Style" w:hAnsi="Bookman Old Style"/>
-          <w:sz w:val="24"/>
-          <w:szCs w:val="24"/>
-        </w:rPr>
-        <w:t xml:space="preserve">tanggal </w:t>
-      </w:r>
-      <w:r>
-        <w:rPr>
-          <w:rFonts w:ascii="Bookman Old Style" w:hAnsi="Bookman Old Style"/>
-          <w:sz w:val="24"/>
-          <w:szCs w:val="24"/>
-        </w:rPr>
-        <w:t>&lt;&lt;BATAS_PENYERAHAN&gt;&gt;.</w:t>
-      </w:r>
-    </w:p>
-    <w:p>
-      <w:pPr>
-        <w:spacing w:after="120"/>
-        <w:rPr>
-          <w:rFonts w:ascii="Bookman Old Style" w:hAnsi="Bookman Old Style"/>
-          <w:b/>
-          <w:sz w:val="24"/>
-          <w:szCs w:val="24"/>
-        </w:rPr>
-      </w:pPr>
-    </w:p>
-    <w:p>
-      <w:pPr>
-        <w:spacing w:after="120"/>
-        <w:jc w:val="center"/>
-        <w:rPr>
-          <w:rFonts w:ascii="Bookman Old Style" w:hAnsi="Bookman Old Style"/>
-          <w:b/>
-          <w:sz w:val="24"/>
-          <w:szCs w:val="24"/>
-        </w:rPr>
-      </w:pPr>
-      <w:r>
-        <w:rPr>
-          <w:rFonts w:ascii="Bookman Old Style" w:hAnsi="Bookman Old Style"/>
-          <w:b/>
-          <w:sz w:val="24"/>
-          <w:szCs w:val="24"/>
-        </w:rPr>
-        <w:t>Pasal 8</w:t>
-      </w:r>
-    </w:p>
-    <w:p>
-      <w:pPr>
-        <w:jc w:val="both"/>
-        <w:rPr>
-          <w:rFonts w:ascii="Bookman Old Style" w:hAnsi="Bookman Old Style"/>
-          <w:sz w:val="24"/>
-          <w:szCs w:val="24"/>
-        </w:rPr>
-      </w:pPr>
-      <w:r>
-        <w:rPr>
-          <w:rFonts w:ascii="Bookman Old Style" w:hAnsi="Bookman Old Style"/>
-          <w:b/>
-          <w:sz w:val="24"/>
-          <w:szCs w:val="24"/>
-        </w:rPr>
-        <w:t>PIHAK PERTAMA</w:t>
-      </w:r>
-      <w:r>
-        <w:rPr>
-          <w:rFonts w:ascii="Bookman Old Style" w:hAnsi="Bookman Old Style"/>
-          <w:sz w:val="24"/>
-          <w:szCs w:val="24"/>
-        </w:rPr>
-        <w:t xml:space="preserve"> dapat memutuskan Perjanjian ini secara sepihak sewaktu-waktu dalam hal </w:t>
-      </w:r>
-      <w:r>
-        <w:rPr>
-          <w:rFonts w:ascii="Bookman Old Style" w:hAnsi="Bookman Old Style"/>
-          <w:b/>
-          <w:sz w:val="24"/>
-          <w:szCs w:val="24"/>
-        </w:rPr>
-        <w:t>PIHAK KEDUA</w:t>
-      </w:r>
-      <w:r>
-        <w:rPr>
-          <w:rFonts w:ascii="Bookman Old Style" w:hAnsi="Bookman Old Style"/>
-          <w:sz w:val="24"/>
-          <w:szCs w:val="24"/>
-        </w:rPr>
-        <w:t xml:space="preserve"> tidak dapat melaksanakan kewajibannya sebagaimana dimaksud dalam Pasal 4. dengan menerbitkan Surat Pemutusan Perjanjian Kerja.</w:t>
-      </w:r>
-    </w:p>
-    <w:p>
-      <w:pPr>
-        <w:jc w:val="both"/>
-        <w:rPr>
-          <w:rFonts w:ascii="Bookman Old Style" w:hAnsi="Bookman Old Style"/>
-          <w:sz w:val="24"/>
-          <w:szCs w:val="24"/>
-        </w:rPr>
-      </w:pPr>
-    </w:p>
-    <w:p>
-      <w:pPr>
-        <w:spacing w:after="120"/>
-        <w:jc w:val="center"/>
-        <w:rPr>
-          <w:rFonts w:ascii="Bookman Old Style" w:hAnsi="Bookman Old Style"/>
-          <w:b/>
-          <w:sz w:val="24"/>
-          <w:szCs w:val="24"/>
-        </w:rPr>
-      </w:pPr>
-      <w:r>
-        <w:rPr>
-          <w:rFonts w:ascii="Bookman Old Style" w:hAnsi="Bookman Old Style"/>
-          <w:b/>
-          <w:sz w:val="24"/>
-          <w:szCs w:val="24"/>
-        </w:rPr>
-        <w:t>Pasal 9</w:t>
-      </w:r>
-    </w:p>
-    <w:p>
-      <w:pPr>
-        <w:pStyle w:val="ListParagraph"/>
-        <w:numPr>
-          <w:ilvl w:val="0"/>
-          <w:numId w:val="41"/>
-        </w:numPr>
-        <w:tabs>
-          <w:tab w:val="left" w:pos="567"/>
-        </w:tabs>
-        <w:ind w:left="562" w:hanging="562"/>
-        <w:contextualSpacing w:val="0"/>
-        <w:jc w:val="both"/>
-        <w:rPr>
-          <w:rFonts w:ascii="Bookman Old Style" w:hAnsi="Bookman Old Style"/>
-          <w:sz w:val="24"/>
-          <w:szCs w:val="24"/>
-        </w:rPr>
-      </w:pPr>
-      <w:r>
-        <w:rPr>
-          <w:rFonts w:ascii="Bookman Old Style" w:hAnsi="Bookman Old Style"/>
-          <w:sz w:val="24"/>
-          <w:szCs w:val="24"/>
-        </w:rPr>
-        <w:t xml:space="preserve">Apabila </w:t>
-      </w:r>
-      <w:r>
-        <w:rPr>
-          <w:rFonts w:ascii="Bookman Old Style" w:hAnsi="Bookman Old Style"/>
-          <w:b/>
-          <w:sz w:val="24"/>
-          <w:szCs w:val="24"/>
-        </w:rPr>
-        <w:t>PIHAK KEDUA</w:t>
-      </w:r>
-      <w:r>
-        <w:rPr>
-          <w:rFonts w:ascii="Bookman Old Style" w:hAnsi="Bookman Old Style"/>
-          <w:sz w:val="24"/>
-          <w:szCs w:val="24"/>
-        </w:rPr>
-        <w:t xml:space="preserve"> mengundurkan diri pada saat/setelah pelaksanaan pelatihan atau saat pendataan dengan tidak menyelesaikan pekerjaan yang menjadi tanggung jawabnya. maka wajib membayar ganti rugi kepada </w:t>
-      </w:r>
-      <w:r>
-        <w:rPr>
-          <w:rFonts w:ascii="Bookman Old Style" w:hAnsi="Bookman Old Style"/>
-          <w:b/>
-          <w:sz w:val="24"/>
-          <w:szCs w:val="24"/>
-        </w:rPr>
-        <w:t>PIHAK PERTAMA</w:t>
-      </w:r>
-      <w:r>
-        <w:rPr>
-          <w:rFonts w:ascii="Bookman Old Style" w:hAnsi="Bookman Old Style"/>
-          <w:sz w:val="24"/>
-          <w:szCs w:val="24"/>
-        </w:rPr>
-        <w:t>.</w:t>
-      </w:r>
-    </w:p>
-    <w:p>
-      <w:pPr>
-        <w:pStyle w:val="ListParagraph"/>
-        <w:tabs>
-          <w:tab w:val="left" w:pos="567"/>
-        </w:tabs>
-        <w:ind w:left="562"/>
-        <w:contextualSpacing w:val="0"/>
-        <w:jc w:val="both"/>
-        <w:rPr>
-          <w:rFonts w:ascii="Bookman Old Style" w:hAnsi="Bookman Old Style"/>
-          <w:sz w:val="24"/>
-          <w:szCs w:val="24"/>
-        </w:rPr>
-      </w:pPr>
-    </w:p>
-    <w:p>
-      <w:pPr>
-        <w:pStyle w:val="ListParagraph"/>
-        <w:numPr>
-          <w:ilvl w:val="0"/>
-          <w:numId w:val="41"/>
-        </w:numPr>
-        <w:tabs>
-          <w:tab w:val="left" w:pos="567"/>
-        </w:tabs>
-        <w:ind w:left="562" w:hanging="562"/>
-        <w:contextualSpacing w:val="0"/>
-        <w:jc w:val="both"/>
-        <w:rPr>
-          <w:rFonts w:ascii="Bookman Old Style" w:hAnsi="Bookman Old Style"/>
-          <w:sz w:val="24"/>
-          <w:szCs w:val="24"/>
-        </w:rPr>
-      </w:pPr>
-      <w:r>
-        <w:rPr>
-          <w:rFonts w:ascii="Bookman Old Style" w:hAnsi="Bookman Old Style"/>
-          <w:sz w:val="24"/>
-          <w:szCs w:val="24"/>
-        </w:rPr>
-        <w:t xml:space="preserve">Dikecualikan tidak membayar ganti rugi sebagaimana dimaksud pada ayat (1) kepada </w:t>
-      </w:r>
-      <w:r>
-        <w:rPr>
-          <w:rFonts w:ascii="Bookman Old Style" w:hAnsi="Bookman Old Style"/>
-          <w:b/>
-          <w:sz w:val="24"/>
-          <w:szCs w:val="24"/>
-        </w:rPr>
-        <w:t>PIHAK PERTAMA</w:t>
-      </w:r>
-      <w:r>
-        <w:rPr>
-          <w:rFonts w:ascii="Bookman Old Style" w:hAnsi="Bookman Old Style"/>
-          <w:sz w:val="24"/>
-          <w:szCs w:val="24"/>
-        </w:rPr>
-        <w:t xml:space="preserve">. apabila </w:t>
-      </w:r>
-      <w:r>
-        <w:rPr>
-          <w:rFonts w:ascii="Bookman Old Style" w:hAnsi="Bookman Old Style"/>
-          <w:b/>
-          <w:sz w:val="24"/>
-          <w:szCs w:val="24"/>
-        </w:rPr>
-        <w:t>PIHAK KEDUA</w:t>
-      </w:r>
-      <w:r>
-        <w:rPr>
-          <w:rFonts w:ascii="Bookman Old Style" w:hAnsi="Bookman Old Style"/>
-          <w:sz w:val="24"/>
-          <w:szCs w:val="24"/>
-        </w:rPr>
-        <w:t xml:space="preserve"> meninggal dunia. mengundurkan diri karena sakit dengan keterangan rawat inap. kecelakaan dengan keterangan kepolisian. dan/atau telah diberikan Surat Pemutusan Perjanjian Kerja dari </w:t>
-      </w:r>
-      <w:r>
-        <w:rPr>
-          <w:rFonts w:ascii="Bookman Old Style" w:hAnsi="Bookman Old Style"/>
-          <w:b/>
-          <w:sz w:val="24"/>
-          <w:szCs w:val="24"/>
-        </w:rPr>
-        <w:t>PIHAK PERTAMA</w:t>
-      </w:r>
-      <w:r>
-        <w:rPr>
-          <w:rFonts w:ascii="Bookman Old Style" w:hAnsi="Bookman Old Style"/>
-          <w:sz w:val="24"/>
-          <w:szCs w:val="24"/>
-        </w:rPr>
-        <w:t>.</w:t>
-      </w:r>
-    </w:p>
-    <w:p>
-      <w:pPr>
-        <w:pStyle w:val="ListParagraph"/>
-        <w:tabs>
-          <w:tab w:val="left" w:pos="567"/>
-        </w:tabs>
-        <w:ind w:left="562"/>
-        <w:jc w:val="both"/>
-        <w:rPr>
-          <w:rFonts w:ascii="Bookman Old Style" w:hAnsi="Bookman Old Style"/>
-          <w:sz w:val="24"/>
-          <w:szCs w:val="24"/>
-        </w:rPr>
-      </w:pPr>
-    </w:p>
-    <w:p>
-      <w:pPr>
-        <w:pStyle w:val="ListParagraph"/>
-        <w:numPr>
-          <w:ilvl w:val="0"/>
-          <w:numId w:val="41"/>
-        </w:numPr>
-        <w:tabs>
-          <w:tab w:val="left" w:pos="567"/>
-        </w:tabs>
-        <w:ind w:left="562" w:hanging="562"/>
-        <w:contextualSpacing w:val="0"/>
-        <w:jc w:val="both"/>
-        <w:rPr>
-          <w:rFonts w:ascii="Bookman Old Style" w:hAnsi="Bookman Old Style"/>
-          <w:sz w:val="24"/>
-          <w:szCs w:val="24"/>
-        </w:rPr>
-      </w:pPr>
-      <w:r>
-        <w:rPr>
-          <w:rFonts w:ascii="Bookman Old Style" w:hAnsi="Bookman Old Style"/>
-          <w:sz w:val="24"/>
-          <w:szCs w:val="24"/>
-        </w:rPr>
-        <w:t xml:space="preserve">Dalam hal terjadi peristiwa sebagaimana dimaksud pada ayat (2). </w:t>
-      </w:r>
-      <w:r>
-        <w:rPr>
-          <w:rFonts w:ascii="Bookman Old Style" w:hAnsi="Bookman Old Style"/>
-          <w:b/>
-          <w:sz w:val="24"/>
-          <w:szCs w:val="24"/>
-        </w:rPr>
-        <w:t>PIHAK PERTAMA</w:t>
-      </w:r>
-      <w:r>
-        <w:rPr>
-          <w:rFonts w:ascii="Bookman Old Style" w:hAnsi="Bookman Old Style"/>
-          <w:sz w:val="24"/>
-          <w:szCs w:val="24"/>
-        </w:rPr>
-        <w:t xml:space="preserve"> membayarkan honorarium kepada </w:t>
-      </w:r>
-      <w:r>
-        <w:rPr>
-          <w:rFonts w:ascii="Bookman Old Style" w:hAnsi="Bookman Old Style"/>
-          <w:b/>
-          <w:sz w:val="24"/>
-          <w:szCs w:val="24"/>
-        </w:rPr>
-        <w:t>PIHAK KEDUA</w:t>
-      </w:r>
-      <w:r>
-        <w:rPr>
-          <w:rFonts w:ascii="Bookman Old Style" w:hAnsi="Bookman Old Style"/>
-          <w:sz w:val="24"/>
-          <w:szCs w:val="24"/>
-        </w:rPr>
-        <w:t xml:space="preserve"> secara proporsional sesuai pekerjaan yang telah dilaksanakan.</w:t>
-      </w:r>
-    </w:p>
-    <w:p>
-      <w:pPr>
-        <w:jc w:val="both"/>
-        <w:rPr>
-          <w:rFonts w:ascii="Bookman Old Style" w:hAnsi="Bookman Old Style"/>
-          <w:sz w:val="24"/>
-          <w:szCs w:val="24"/>
-        </w:rPr>
-      </w:pPr>
-    </w:p>
-    <w:p>
-      <w:pPr>
-        <w:spacing w:after="120"/>
-        <w:jc w:val="center"/>
-        <w:rPr>
-          <w:rFonts w:ascii="Bookman Old Style" w:hAnsi="Bookman Old Style"/>
-          <w:b/>
-          <w:sz w:val="24"/>
-          <w:szCs w:val="24"/>
-        </w:rPr>
-      </w:pPr>
-      <w:r>
-        <w:rPr>
-          <w:rFonts w:ascii="Bookman Old Style" w:hAnsi="Bookman Old Style"/>
-          <w:b/>
-          <w:sz w:val="24"/>
-          <w:szCs w:val="24"/>
-        </w:rPr>
-        <w:t>Pasal 10</w:t>
-      </w:r>
-    </w:p>
-    <w:p>
-      <w:pPr>
-        <w:numPr>
-          <w:ilvl w:val="0"/>
-          <w:numId w:val="42"/>
-        </w:numPr>
-        <w:ind w:left="567" w:hanging="567"/>
-        <w:jc w:val="both"/>
-        <w:rPr>
-          <w:rFonts w:ascii="Bookman Old Style" w:hAnsi="Bookman Old Style"/>
-          <w:sz w:val="24"/>
-          <w:szCs w:val="24"/>
-        </w:rPr>
-      </w:pPr>
-      <w:r>
-        <w:rPr>
-          <w:rFonts w:ascii="Bookman Old Style" w:hAnsi="Bookman Old Style"/>
-          <w:sz w:val="24"/>
-          <w:szCs w:val="24"/>
-        </w:rPr>
-        <w:t xml:space="preserve">Apabila terjadi Keadaan Kahar. yang meliputi bencana alam dan bencana sosial. </w:t>
-      </w:r>
-      <w:r>
-        <w:rPr>
-          <w:rFonts w:ascii="Bookman Old Style" w:hAnsi="Bookman Old Style"/>
-          <w:b/>
-          <w:sz w:val="24"/>
-          <w:szCs w:val="24"/>
-        </w:rPr>
-        <w:t xml:space="preserve">PIHAK KEDUA </w:t>
-      </w:r>
-      <w:r>
-        <w:rPr>
-          <w:rFonts w:ascii="Bookman Old Style" w:hAnsi="Bookman Old Style"/>
-          <w:bCs/>
-          <w:sz w:val="24"/>
-          <w:szCs w:val="24"/>
-        </w:rPr>
-        <w:t xml:space="preserve">memberitahukan kepada </w:t>
-      </w:r>
-      <w:r>
-        <w:rPr>
-          <w:rFonts w:ascii="Bookman Old Style" w:hAnsi="Bookman Old Style"/>
-          <w:b/>
-          <w:sz w:val="24"/>
-          <w:szCs w:val="24"/>
-        </w:rPr>
-        <w:t xml:space="preserve">PIHAK PERTAMA </w:t>
-      </w:r>
-      <w:r>
-        <w:rPr>
-          <w:rFonts w:ascii="Bookman Old Style" w:hAnsi="Bookman Old Style"/>
-          <w:bCs/>
-          <w:sz w:val="24"/>
-          <w:szCs w:val="24"/>
-        </w:rPr>
-        <w:t xml:space="preserve">dalam waktu </w:t>
-      </w:r>
-      <w:r>
-        <w:rPr>
-          <w:rFonts w:ascii="Bookman Old Style" w:hAnsi="Bookman Old Style"/>
-          <w:bCs/>
-          <w:color w:val="000000"/>
-          <w:sz w:val="24"/>
-          <w:szCs w:val="24"/>
-        </w:rPr>
-        <w:t xml:space="preserve">paling lambat 7 (tujuh) hari </w:t>
-      </w:r>
-      <w:r>
-        <w:rPr>
-          <w:rFonts w:ascii="Bookman Old Style" w:hAnsi="Bookman Old Style"/>
-          <w:bCs/>
-          <w:sz w:val="24"/>
-          <w:szCs w:val="24"/>
-        </w:rPr>
-        <w:t>sejak mengetahui atas kejadian Keadaan Kahar dengan menyertakan bukti.</w:t>
-      </w:r>
-    </w:p>
-    <w:p>
-      <w:pPr>
-        <w:ind w:left="567"/>
-        <w:jc w:val="both"/>
-        <w:rPr>
-          <w:rFonts w:ascii="Bookman Old Style" w:hAnsi="Bookman Old Style"/>
-          <w:sz w:val="24"/>
-          <w:szCs w:val="24"/>
-        </w:rPr>
-      </w:pPr>
-    </w:p>
-    <w:p>
-      <w:pPr>
-        <w:pStyle w:val="ListParagraph"/>
-        <w:numPr>
-          <w:ilvl w:val="0"/>
-          <w:numId w:val="42"/>
-        </w:numPr>
-        <w:jc w:val="both"/>
-        <w:rPr>
-          <w:rFonts w:ascii="Bookman Old Style" w:hAnsi="Bookman Old Style"/>
-          <w:sz w:val="24"/>
-          <w:szCs w:val="24"/>
-        </w:rPr>
-      </w:pPr>
-      <w:r>
-        <w:rPr>
-          <w:rFonts w:ascii="Bookman Old Style" w:hAnsi="Bookman Old Style"/>
-          <w:bCs/>
-          <w:sz w:val="24"/>
-          <w:szCs w:val="24"/>
-        </w:rPr>
-        <w:t xml:space="preserve">Pada saat terjadi Keadaan Kahar. pelaksanaan pekerjaan oleh </w:t>
-      </w:r>
-      <w:r>
-        <w:rPr>
-          <w:rFonts w:ascii="Bookman Old Style" w:hAnsi="Bookman Old Style"/>
-          <w:b/>
-          <w:sz w:val="24"/>
-          <w:szCs w:val="24"/>
-        </w:rPr>
-        <w:t xml:space="preserve">PIHAK KEDUA </w:t>
-      </w:r>
-      <w:r>
-        <w:rPr>
-          <w:rFonts w:ascii="Bookman Old Style" w:hAnsi="Bookman Old Style"/>
-          <w:bCs/>
-          <w:sz w:val="24"/>
-          <w:szCs w:val="24"/>
-        </w:rPr>
-        <w:t xml:space="preserve">dihentikan sementara dan dilanjutkan kembali setelah Keadaan Kahar berakhir. namun apabila akibat Keadaan Kahar tidak memungkinkan dilanjutkan/diselesaikannya pelaksanaan pekerjaan. </w:t>
-      </w:r>
-      <w:r>
-        <w:rPr>
-          <w:rFonts w:ascii="Bookman Old Style" w:hAnsi="Bookman Old Style"/>
-          <w:b/>
-          <w:sz w:val="24"/>
-          <w:szCs w:val="24"/>
-        </w:rPr>
-        <w:t xml:space="preserve">PIHAK KEDUA </w:t>
-      </w:r>
-      <w:r>
-        <w:rPr>
-          <w:rFonts w:ascii="Bookman Old Style" w:hAnsi="Bookman Old Style"/>
-          <w:bCs/>
-          <w:sz w:val="24"/>
-          <w:szCs w:val="24"/>
-        </w:rPr>
-        <w:t xml:space="preserve">berhak menerima </w:t>
-      </w:r>
-      <w:r>
-        <w:rPr>
-          <w:rFonts w:ascii="Bookman Old Style" w:hAnsi="Bookman Old Style"/>
-          <w:sz w:val="24"/>
-          <w:szCs w:val="24"/>
-        </w:rPr>
-        <w:t>honorarium secara proporsional sesuai pekerjaan yang telah dilaksanakan.</w:t>
-      </w:r>
-    </w:p>
-    <w:p>
-      <w:pPr>
-        <w:pStyle w:val="ListParagraph"/>
-        <w:jc w:val="both"/>
-        <w:rPr>
-          <w:rFonts w:ascii="Bookman Old Style" w:hAnsi="Bookman Old Style"/>
-          <w:b/>
-          <w:sz w:val="24"/>
-          <w:szCs w:val="24"/>
-        </w:rPr>
-      </w:pPr>
-    </w:p>
-    <w:p>
-      <w:pPr>
-        <w:spacing w:after="120"/>
-        <w:jc w:val="center"/>
-        <w:rPr>
-          <w:rFonts w:ascii="Bookman Old Style" w:hAnsi="Bookman Old Style"/>
-          <w:b/>
-          <w:sz w:val="24"/>
-          <w:szCs w:val="24"/>
-        </w:rPr>
-      </w:pPr>
-      <w:r>
-        <w:rPr>
-          <w:rFonts w:ascii="Bookman Old Style" w:hAnsi="Bookman Old Style"/>
-          <w:b/>
-          <w:sz w:val="24"/>
-          <w:szCs w:val="24"/>
-        </w:rPr>
-        <w:t>Pasal 11</w:t>
-      </w:r>
-    </w:p>
-    <w:p>
-      <w:pPr>
-        <w:jc w:val="both"/>
-        <w:rPr>
-          <w:rFonts w:ascii="Bookman Old Style" w:hAnsi="Bookman Old Style"/>
-          <w:sz w:val="24"/>
-          <w:szCs w:val="24"/>
-        </w:rPr>
-      </w:pPr>
-      <w:r>
-        <w:rPr>
-          <w:rFonts w:ascii="Bookman Old Style" w:hAnsi="Bookman Old Style"/>
-          <w:sz w:val="24"/>
-          <w:szCs w:val="24"/>
-        </w:rPr>
-        <w:t>Segala sesuatu yang belum atau tidak cukup diatur dalam Perjanjian ini. dituangkan dalam perjanjian tambahan/</w:t>
-      </w:r>
-      <w:r>
-        <w:rPr>
-          <w:rFonts w:ascii="Bookman Old Style" w:hAnsi="Bookman Old Style"/>
-          <w:i/>
-          <w:sz w:val="24"/>
-          <w:szCs w:val="24"/>
-        </w:rPr>
-        <w:t>addendum</w:t>
-      </w:r>
-      <w:r>
-        <w:rPr>
-          <w:rFonts w:ascii="Bookman Old Style" w:hAnsi="Bookman Old Style"/>
-          <w:sz w:val="24"/>
-          <w:szCs w:val="24"/>
-        </w:rPr>
-        <w:t xml:space="preserve"> dan merupakan bagian tidak terpisahkan dari Perjanjian ini.</w:t>
-      </w:r>
-    </w:p>
-    <w:p>
-      <w:pPr>
-        <w:jc w:val="both"/>
-        <w:rPr>
-          <w:rFonts w:ascii="Bookman Old Style" w:hAnsi="Bookman Old Style"/>
-          <w:sz w:val="24"/>
-          <w:szCs w:val="24"/>
-        </w:rPr>
-      </w:pPr>
-    </w:p>
-    <w:p>
-      <w:pPr>
-        <w:jc w:val="both"/>
-        <w:rPr>
-          <w:rFonts w:ascii="Bookman Old Style" w:hAnsi="Bookman Old Style"/>
-          <w:sz w:val="24"/>
-          <w:szCs w:val="24"/>
-        </w:rPr>
-      </w:pPr>
-    </w:p>
-    <w:p>
-      <w:pPr>
-        <w:spacing w:after="120"/>
-        <w:jc w:val="center"/>
-        <w:rPr>
-          <w:rFonts w:ascii="Bookman Old Style" w:hAnsi="Bookman Old Style"/>
-          <w:b/>
-          <w:sz w:val="24"/>
-          <w:szCs w:val="24"/>
-        </w:rPr>
-      </w:pPr>
-      <w:r>
-        <w:rPr>
-          <w:rFonts w:ascii="Bookman Old Style" w:hAnsi="Bookman Old Style"/>
-          <w:b/>
-          <w:sz w:val="24"/>
-          <w:szCs w:val="24"/>
-        </w:rPr>
-        <w:t>Pasal 12</w:t>
-      </w:r>
-    </w:p>
-    <w:p>
-      <w:pPr>
-        <w:pStyle w:val="ListParagraph"/>
-        <w:numPr>
-          <w:ilvl w:val="0"/>
-          <w:numId w:val="43"/>
-        </w:numPr>
-        <w:ind w:left="431" w:hanging="431"/>
-        <w:contextualSpacing w:val="0"/>
-        <w:jc w:val="both"/>
-        <w:rPr>
-          <w:rFonts w:ascii="Bookman Old Style" w:hAnsi="Bookman Old Style"/>
-          <w:sz w:val="24"/>
-          <w:szCs w:val="24"/>
-        </w:rPr>
-      </w:pPr>
-      <w:r>
-        <w:rPr>
-          <w:rFonts w:ascii="Bookman Old Style" w:hAnsi="Bookman Old Style"/>
-          <w:sz w:val="24"/>
-          <w:szCs w:val="24"/>
-        </w:rPr>
-        <w:t xml:space="preserve">Segala perselisihan atau perbedaan pendapat yang timbul sebagai akibat adanya Perjanjian ini akan diselesaikan secara musyawarah untuk mufakat. </w:t>
-      </w:r>
-    </w:p>
-    <w:p>
-      <w:pPr>
-        <w:pStyle w:val="ListParagraph"/>
-        <w:ind w:left="431"/>
-        <w:jc w:val="both"/>
-        <w:rPr>
-          <w:rFonts w:ascii="Bookman Old Style" w:hAnsi="Bookman Old Style"/>
-          <w:sz w:val="24"/>
-          <w:szCs w:val="24"/>
-        </w:rPr>
-      </w:pPr>
-    </w:p>
-    <w:p>
-      <w:pPr>
-        <w:pStyle w:val="ListParagraph"/>
-        <w:numPr>
-          <w:ilvl w:val="0"/>
-          <w:numId w:val="43"/>
-        </w:numPr>
-        <w:ind w:left="426" w:hanging="426"/>
-        <w:contextualSpacing w:val="0"/>
-        <w:jc w:val="both"/>
-        <w:rPr>
-          <w:rFonts w:ascii="Bookman Old Style" w:hAnsi="Bookman Old Style"/>
-          <w:sz w:val="24"/>
-          <w:szCs w:val="24"/>
-        </w:rPr>
-      </w:pPr>
-      <w:r>
-        <w:rPr>
-          <w:rFonts w:ascii="Bookman Old Style" w:hAnsi="Bookman Old Style"/>
-          <w:sz w:val="24"/>
-          <w:szCs w:val="24"/>
-        </w:rPr>
-        <w:t xml:space="preserve">Apabila perselisihan tidak dapat diselesaikan sebagaimana dimaksud pada ayat (1). </w:t>
-      </w:r>
-      <w:r>
-        <w:rPr>
-          <w:rFonts w:ascii="Bookman Old Style" w:hAnsi="Bookman Old Style"/>
-          <w:b/>
-          <w:sz w:val="24"/>
-          <w:szCs w:val="24"/>
-        </w:rPr>
-        <w:t>PARA PIHAK</w:t>
-      </w:r>
-      <w:r>
-        <w:rPr>
-          <w:rFonts w:ascii="Bookman Old Style" w:hAnsi="Bookman Old Style"/>
-          <w:sz w:val="24"/>
-          <w:szCs w:val="24"/>
-        </w:rPr>
-        <w:t xml:space="preserve"> sepakat menyelesaikan perselisihan dengan memilih kedudukan/domisili hukum di Panitera Pengadilan Negeri </w:t>
-      </w:r>
-      <w:r>
-        <w:rPr>
-          <w:rFonts w:ascii="Bookman Old Style" w:hAnsi="Bookman Old Style"/>
-          <w:noProof/>
-          <w:sz w:val="24"/>
-          <w:szCs w:val="24"/>
-        </w:rPr>
-        <w:t>Kota Subulussalam</w:t>
-      </w:r>
-    </w:p>
-    <w:p>
-      <w:pPr>
-        <w:jc w:val="both"/>
-        <w:rPr>
-          <w:rFonts w:ascii="Bookman Old Style" w:hAnsi="Bookman Old Style"/>
-          <w:sz w:val="24"/>
-          <w:szCs w:val="24"/>
-        </w:rPr>
-      </w:pPr>
-    </w:p>
-    <w:p>
-      <w:pPr>
-        <w:jc w:val="both"/>
-        <w:rPr>
-          <w:rFonts w:ascii="Bookman Old Style" w:hAnsi="Bookman Old Style"/>
-          <w:sz w:val="24"/>
-          <w:szCs w:val="24"/>
-        </w:rPr>
-      </w:pPr>
-      <w:r>
-        <w:rPr>
-          <w:rFonts w:ascii="Bookman Old Style" w:hAnsi="Bookman Old Style"/>
-          <w:sz w:val="24"/>
-          <w:szCs w:val="24"/>
-        </w:rPr>
-        <w:t xml:space="preserve">Demikian Perjanjian ini dibuat dan ditandatangani oleh </w:t>
-      </w:r>
-      <w:r>
-        <w:rPr>
-          <w:rFonts w:ascii="Bookman Old Style" w:hAnsi="Bookman Old Style"/>
-          <w:b/>
-          <w:sz w:val="24"/>
-          <w:szCs w:val="24"/>
-        </w:rPr>
-        <w:t>PARA PIHAK</w:t>
-      </w:r>
-      <w:r>
-        <w:rPr>
-          <w:rFonts w:ascii="Bookman Old Style" w:hAnsi="Bookman Old Style"/>
-          <w:sz w:val="24"/>
-          <w:szCs w:val="24"/>
-        </w:rPr>
-        <w:t xml:space="preserve"> dalam 2 (dua) rangkap asli bermeterai cukup. tanpa paksaan dari </w:t>
-      </w:r>
-      <w:r>
-        <w:rPr>
-          <w:rFonts w:ascii="Bookman Old Style" w:hAnsi="Bookman Old Style"/>
-          <w:b/>
-          <w:sz w:val="24"/>
-          <w:szCs w:val="24"/>
-        </w:rPr>
-        <w:t>PIHAK</w:t>
-      </w:r>
-      <w:r>
-        <w:rPr>
-          <w:rFonts w:ascii="Bookman Old Style" w:hAnsi="Bookman Old Style"/>
-          <w:sz w:val="24"/>
-          <w:szCs w:val="24"/>
-        </w:rPr>
-        <w:t xml:space="preserve"> manapun dan untuk dilaksanakan oleh </w:t>
-      </w:r>
-      <w:r>
-        <w:rPr>
-          <w:rFonts w:ascii="Bookman Old Style" w:hAnsi="Bookman Old Style"/>
-          <w:b/>
-          <w:sz w:val="24"/>
-          <w:szCs w:val="24"/>
-        </w:rPr>
-        <w:t>PARA PIHAK</w:t>
-      </w:r>
-      <w:r>
-        <w:rPr>
-          <w:rFonts w:ascii="Bookman Old Style" w:hAnsi="Bookman Old Style"/>
-          <w:sz w:val="24"/>
-          <w:szCs w:val="24"/>
-        </w:rPr>
-        <w:t>.</w:t>
-      </w:r>
-    </w:p>
-    <w:p>
-      <w:pPr>
-        <w:jc w:val="both"/>
-        <w:rPr>
-          <w:rFonts w:ascii="Bookman Old Style" w:hAnsi="Bookman Old Style"/>
-          <w:sz w:val="24"/>
-          <w:szCs w:val="24"/>
-        </w:rPr>
-      </w:pPr>
-    </w:p>
-    <w:p>
-      <w:pPr>
-        <w:jc w:val="both"/>
-        <w:rPr>
-          <w:rFonts w:ascii="Bookman Old Style" w:hAnsi="Bookman Old Style"/>
-          <w:sz w:val="24"/>
-          <w:szCs w:val="24"/>
-        </w:rPr>
-      </w:pPr>
-    </w:p>
-    <w:tbl>
-      <w:tblPr>
-        <w:tblW w:w="0" w:type="auto"/>
-        <w:jc w:val="center"/>
-        <w:tblLayout w:type="fixed"/>
-        <w:tblCellMar>
-          <w:left w:w="0" w:type="dxa"/>
-          <w:right w:w="0" w:type="dxa"/>
-        </w:tblCellMar>
-        <w:tblLook w:val="04A0" w:firstRow="1" w:lastRow="0" w:firstColumn="1" w:lastColumn="0" w:noHBand="0" w:noVBand="1"/>
-      </w:tblPr>
-      <w:tblGrid>
-        <w:gridCol w:w="4998"/>
-        <w:gridCol w:w="4339"/>
-      </w:tblGrid>
-      <w:tr>
-        <w:trPr>
-          <w:jc w:val="center"/>
-        </w:trPr>
-        <w:tc>
-          <w:tcPr>
-            <w:tcW w:w="4998" w:type="dxa"/>
-          </w:tcPr>
-          <w:p>
-            <w:pPr>
-              <w:jc w:val="center"/>
-              <w:rPr>
-                <w:rFonts w:ascii="Bookman Old Style" w:hAnsi="Bookman Old Style"/>
-                <w:sz w:val="24"/>
-                <w:szCs w:val="24"/>
-              </w:rPr>
-            </w:pPr>
-            <w:r>
-              <w:rPr>
-                <w:rFonts w:ascii="Bookman Old Style" w:hAnsi="Bookman Old Style"/>
-                <w:b/>
-                <w:sz w:val="24"/>
-                <w:szCs w:val="24"/>
-              </w:rPr>
-              <w:t>PIHAK KEDUA</w:t>
-            </w:r>
-            <w:r>
-              <w:rPr>
-                <w:rFonts w:ascii="Bookman Old Style" w:hAnsi="Bookman Old Style"/>
-                <w:sz w:val="24"/>
-                <w:szCs w:val="24"/>
-              </w:rPr>
-              <w:t>.</w:t>
-            </w:r>
-          </w:p>
-          <w:p>
-            <w:pPr>
-              <w:jc w:val="center"/>
-              <w:rPr>
-                <w:rFonts w:ascii="Bookman Old Style" w:hAnsi="Bookman Old Style"/>
-                <w:sz w:val="24"/>
-                <w:szCs w:val="24"/>
-              </w:rPr>
-            </w:pPr>
-          </w:p>
-          <w:p>
-            <w:pPr>
-              <w:jc w:val="center"/>
-              <w:rPr>
-                <w:rFonts w:ascii="Bookman Old Style" w:hAnsi="Bookman Old Style"/>
-                <w:sz w:val="24"/>
-                <w:szCs w:val="24"/>
-              </w:rPr>
-            </w:pPr>
-          </w:p>
-          <w:p>
-            <w:pPr>
-              <w:jc w:val="center"/>
-              <w:rPr>
-                <w:rFonts w:ascii="Bookman Old Style" w:hAnsi="Bookman Old Style"/>
-                <w:sz w:val="24"/>
-                <w:szCs w:val="24"/>
-              </w:rPr>
-            </w:pPr>
-          </w:p>
-          <w:p>
-            <w:pPr>
-              <w:jc w:val="center"/>
-              <w:rPr>
-                <w:rFonts w:ascii="Bookman Old Style" w:hAnsi="Bookman Old Style"/>
-                <w:sz w:val="24"/>
-                <w:szCs w:val="24"/>
-              </w:rPr>
-            </w:pPr>
-          </w:p>
-          <w:p>
-            <w:pPr>
-              <w:jc w:val="center"/>
-              <w:rPr>
-                <w:rFonts w:ascii="Bookman Old Style" w:hAnsi="Bookman Old Style"/>
-                <w:sz w:val="24"/>
-                <w:szCs w:val="24"/>
-              </w:rPr>
-            </w:pPr>
-            <w:r>
-              <w:rPr>
-                <w:rFonts w:ascii="Bookman Old Style" w:hAnsi="Bookman Old Style"/>
-                <w:sz w:val="24"/>
-                <w:szCs w:val="24"/>
-              </w:rPr>
-              <w:t>&lt;&lt;NAMA_PIHAK_KEDUA&gt;&gt;</w:t>
-            </w:r>
-          </w:p>
-        </w:tc>
-        <w:tc>
-          <w:tcPr>
-            <w:tcW w:w="4339" w:type="dxa"/>
-          </w:tcPr>
-          <w:p>
-            <w:pPr>
-              <w:jc w:val="center"/>
-              <w:rPr>
-                <w:rFonts w:ascii="Bookman Old Style" w:hAnsi="Bookman Old Style"/>
-                <w:sz w:val="24"/>
-                <w:szCs w:val="24"/>
-              </w:rPr>
-            </w:pPr>
-            <w:r>
-              <w:rPr>
-                <w:rFonts w:ascii="Bookman Old Style" w:hAnsi="Bookman Old Style"/>
-                <w:b/>
-                <w:sz w:val="24"/>
-                <w:szCs w:val="24"/>
-              </w:rPr>
-              <w:t>PIHAK PERTAMA</w:t>
-            </w:r>
-            <w:r>
-              <w:rPr>
-                <w:rFonts w:ascii="Bookman Old Style" w:hAnsi="Bookman Old Style"/>
-                <w:sz w:val="24"/>
-                <w:szCs w:val="24"/>
-              </w:rPr>
-              <w:t>.</w:t>
-            </w:r>
-          </w:p>
-          <w:p>
-            <w:pPr>
-              <w:jc w:val="center"/>
-              <w:rPr>
-                <w:rFonts w:ascii="Bookman Old Style" w:hAnsi="Bookman Old Style"/>
-                <w:sz w:val="24"/>
-                <w:szCs w:val="24"/>
-              </w:rPr>
-            </w:pPr>
-          </w:p>
-          <w:p>
-            <w:pPr>
-              <w:jc w:val="center"/>
-              <w:rPr>
-                <w:rFonts w:ascii="Bookman Old Style" w:hAnsi="Bookman Old Style"/>
-                <w:sz w:val="24"/>
-                <w:szCs w:val="24"/>
-              </w:rPr>
-            </w:pPr>
-          </w:p>
-          <w:p>
-            <w:pPr>
-              <w:jc w:val="center"/>
-              <w:rPr>
-                <w:rFonts w:ascii="Bookman Old Style" w:hAnsi="Bookman Old Style"/>
-                <w:sz w:val="24"/>
-                <w:szCs w:val="24"/>
-              </w:rPr>
-            </w:pPr>
-          </w:p>
-          <w:p>
-            <w:pPr>
-              <w:jc w:val="center"/>
-              <w:rPr>
-                <w:rFonts w:ascii="Bookman Old Style" w:hAnsi="Bookman Old Style"/>
-                <w:sz w:val="24"/>
-                <w:szCs w:val="24"/>
-              </w:rPr>
-            </w:pPr>
-          </w:p>
-          <w:p>
-            <w:pPr>
-              <w:jc w:val="center"/>
-              <w:rPr>
-                <w:rFonts w:ascii="Bookman Old Style" w:hAnsi="Bookman Old Style"/>
-                <w:sz w:val="24"/>
-                <w:szCs w:val="24"/>
-              </w:rPr>
-            </w:pPr>
-            <w:r>
-              <w:rPr>
-                <w:rFonts w:ascii="Bookman Old Style" w:hAnsi="Bookman Old Style"/>
-                <w:sz w:val="24"/>
-                <w:szCs w:val="24"/>
-              </w:rPr>
-              <w:t>&lt;&lt;NAMA_PIHAK_PERTAMA&gt;&gt;</w:t>
-            </w:r>
-          </w:p>
-          <w:p>
-            <w:pPr>
-              <w:jc w:val="center"/>
-              <w:rPr>
-                <w:rFonts w:ascii="Bookman Old Style" w:hAnsi="Bookman Old Style"/>
-                <w:sz w:val="24"/>
-                <w:szCs w:val="24"/>
-              </w:rPr>
-            </w:pPr>
-          </w:p>
-        </w:tc>
-      </w:tr>
-    </w:tbl>
-    <w:p>
-      <w:pPr>
-        <w:rPr>
-          <w:rFonts w:ascii="Bookman Old Style" w:hAnsi="Bookman Old Style"/>
-          <w:sz w:val="24"/>
-          <w:szCs w:val="24"/>
-        </w:rPr>
-      </w:pPr>
-    </w:p>
-    <w:p>
-      <w:pPr>
-        <w:rPr>
-          <w:rFonts w:ascii="Bookman Old Style" w:hAnsi="Bookman Old Style"/>
-          <w:sz w:val="24"/>
-          <w:szCs w:val="24"/>
-        </w:rPr>
-      </w:pPr>
-    </w:p>
-    <w:p>
-      <w:pPr>
-        <w:tabs>
-          <w:tab w:val="left" w:pos="4155"/>
-        </w:tabs>
-        <w:rPr>
-          <w:rFonts w:ascii="Bookman Old Style" w:hAnsi="Bookman Old Style"/>
-          <w:sz w:val="24"/>
-          <w:szCs w:val="24"/>
-        </w:rPr>
-        <w:sectPr>
-          <w:headerReference w:type="default" r:id="rId8"/>
-          <w:pgSz w:w="11906" w:h="16838"/>
-          <w:pgMar w:top="1440" w:right="1134" w:bottom="1440" w:left="1247" w:header="709" w:footer="709" w:gutter="0"/>
-          <w:pgNumType w:fmt="numberInDash"/>
-          <w:cols w:space="708"/>
-          <w:titlePg/>
-          <w:docGrid w:linePitch="360"/>
-        </w:sectPr>
-      </w:pPr>
-    </w:p>
-    <w:p>
-      <w:pPr>
-        <w:pStyle w:val="BodyText"/>
-        <w:spacing w:line="285" w:lineRule="auto"/>
-        <w:ind w:left="5245" w:right="66"/>
-        <w:jc w:val="both"/>
-        <w:rPr>
-          <w:rFonts w:ascii="Bookman Old Style" w:hAnsi="Bookman Old Style"/>
-          <w:sz w:val="24"/>
-          <w:szCs w:val="24"/>
-        </w:rPr>
-      </w:pPr>
-      <w:r>
-        <w:rPr>
-          <w:rFonts w:ascii="Bookman Old Style" w:hAnsi="Bookman Old Style"/>
-          <w:sz w:val="24"/>
-          <w:szCs w:val="24"/>
-        </w:rPr>
-        <w:t>LAMPIRAN</w:t>
-      </w:r>
-    </w:p>
-    <w:p>
-      <w:pPr>
-        <w:pStyle w:val="BodyText"/>
-        <w:spacing w:line="285" w:lineRule="auto"/>
-        <w:ind w:left="5245" w:right="66"/>
-        <w:jc w:val="both"/>
-        <w:rPr>
-          <w:rFonts w:ascii="Bookman Old Style" w:hAnsi="Bookman Old Style"/>
-          <w:sz w:val="24"/>
-          <w:szCs w:val="24"/>
-        </w:rPr>
-      </w:pPr>
-      <w:r>
-        <w:rPr>
-          <w:rFonts w:ascii="Bookman Old Style" w:hAnsi="Bookman Old Style"/>
-          <w:sz w:val="24"/>
-          <w:szCs w:val="24"/>
-        </w:rPr>
-        <w:t xml:space="preserve">PERJANJIAN KERJA </w:t>
-      </w:r>
-      <w:r>
-        <w:rPr>
-          <w:rFonts w:ascii="Bookman Old Style" w:hAnsi="Bookman Old Style"/>
-          <w:sz w:val="24"/>
-          <w:szCs w:val="24"/>
-        </w:rPr>
-        <w:t>&lt;&lt;URAIAN_PEKERJAAN&gt;&gt;</w:t>
-      </w:r>
-      <w:r>
-        <w:rPr>
-          <w:rFonts w:ascii="Bookman Old Style" w:hAnsi="Bookman Old Style"/>
-          <w:sz w:val="24"/>
-          <w:szCs w:val="24"/>
-        </w:rPr>
-        <w:t xml:space="preserve"> </w:t>
-      </w:r>
-      <w:r>
-        <w:rPr>
-          <w:rFonts w:ascii="Bookman Old Style" w:hAnsi="Bookman Old Style"/>
-          <w:sz w:val="24"/>
-          <w:szCs w:val="24"/>
-        </w:rPr>
-        <w:t>PADA BADAN PUSAT STATISTIK KOTA SUBULUSSALAM</w:t>
-      </w:r>
-    </w:p>
-    <w:p>
-      <w:pPr>
-        <w:pStyle w:val="BodyText"/>
-        <w:spacing w:line="285" w:lineRule="auto"/>
-        <w:ind w:left="5245" w:right="66"/>
-        <w:jc w:val="both"/>
-        <w:rPr>
-          <w:rFonts w:ascii="Bookman Old Style" w:hAnsi="Bookman Old Style"/>
-          <w:sz w:val="24"/>
-          <w:szCs w:val="24"/>
-        </w:rPr>
-      </w:pPr>
-      <w:r>
-        <w:rPr>
-          <w:rFonts w:ascii="Bookman Old Style" w:hAnsi="Bookman Old Style"/>
-          <w:sz w:val="24"/>
-          <w:szCs w:val="24"/>
-        </w:rPr>
-        <w:t xml:space="preserve">NOMOR </w:t>
-      </w:r>
-      <w:r>
-        <w:rPr>
-          <w:rFonts w:ascii="Bookman Old Style" w:hAnsi="Bookman Old Style"/>
-          <w:sz w:val="24"/>
-          <w:szCs w:val="24"/>
-        </w:rPr>
-        <w:t>&lt;&lt;NO_SPK&gt;&gt;</w:t>
-      </w:r>
-    </w:p>
-    <w:p>
-      <w:pPr>
-        <w:pStyle w:val="BodyText"/>
-        <w:rPr>
-          <w:rFonts w:ascii="Bookman Old Style" w:hAnsi="Bookman Old Style"/>
-          <w:sz w:val="24"/>
-          <w:szCs w:val="24"/>
-        </w:rPr>
-      </w:pPr>
-    </w:p>
-    <w:p>
-      <w:pPr>
-        <w:pStyle w:val="BodyText"/>
-        <w:spacing w:before="69"/>
-        <w:rPr>
-          <w:rFonts w:ascii="Bookman Old Style" w:hAnsi="Bookman Old Style"/>
-          <w:sz w:val="24"/>
-          <w:szCs w:val="24"/>
-        </w:rPr>
-      </w:pPr>
-    </w:p>
-    <w:p>
-      <w:pPr>
-        <w:ind w:left="921" w:right="914"/>
-        <w:jc w:val="center"/>
-        <w:rPr>
-          <w:rFonts w:ascii="Bookman Old Style" w:hAnsi="Bookman Old Style"/>
-          <w:b/>
-          <w:sz w:val="24"/>
-          <w:szCs w:val="24"/>
-        </w:rPr>
-      </w:pPr>
-      <w:r>
-        <w:rPr>
-          <w:rFonts w:ascii="Bookman Old Style" w:hAnsi="Bookman Old Style"/>
-          <w:b/>
-          <w:sz w:val="24"/>
-          <w:szCs w:val="24"/>
-        </w:rPr>
-        <w:t>DAFTAR</w:t>
-      </w:r>
-      <w:r>
-        <w:rPr>
-          <w:rFonts w:ascii="Bookman Old Style" w:hAnsi="Bookman Old Style"/>
-          <w:spacing w:val="34"/>
-          <w:sz w:val="24"/>
-          <w:szCs w:val="24"/>
-        </w:rPr>
-        <w:t xml:space="preserve"> </w:t>
-      </w:r>
-      <w:r>
-        <w:rPr>
-          <w:rFonts w:ascii="Bookman Old Style" w:hAnsi="Bookman Old Style"/>
-          <w:b/>
-          <w:sz w:val="24"/>
-          <w:szCs w:val="24"/>
-        </w:rPr>
-        <w:t>URAIAN</w:t>
-      </w:r>
-      <w:r>
-        <w:rPr>
-          <w:rFonts w:ascii="Bookman Old Style" w:hAnsi="Bookman Old Style"/>
-          <w:spacing w:val="35"/>
-          <w:sz w:val="24"/>
-          <w:szCs w:val="24"/>
-        </w:rPr>
-        <w:t xml:space="preserve"> </w:t>
-      </w:r>
-      <w:r>
-        <w:rPr>
-          <w:rFonts w:ascii="Bookman Old Style" w:hAnsi="Bookman Old Style"/>
-          <w:b/>
-          <w:sz w:val="24"/>
-          <w:szCs w:val="24"/>
-        </w:rPr>
-        <w:t>TUGAS,</w:t>
-      </w:r>
-      <w:r>
-        <w:rPr>
-          <w:rFonts w:ascii="Bookman Old Style" w:hAnsi="Bookman Old Style"/>
-          <w:spacing w:val="36"/>
-          <w:sz w:val="24"/>
-          <w:szCs w:val="24"/>
-        </w:rPr>
-        <w:t xml:space="preserve"> </w:t>
-      </w:r>
-      <w:r>
-        <w:rPr>
-          <w:rFonts w:ascii="Bookman Old Style" w:hAnsi="Bookman Old Style"/>
-          <w:b/>
-          <w:sz w:val="24"/>
-          <w:szCs w:val="24"/>
-        </w:rPr>
-        <w:t>JANGKA</w:t>
-      </w:r>
-      <w:r>
-        <w:rPr>
-          <w:rFonts w:ascii="Bookman Old Style" w:hAnsi="Bookman Old Style"/>
-          <w:spacing w:val="33"/>
-          <w:sz w:val="24"/>
-          <w:szCs w:val="24"/>
-        </w:rPr>
-        <w:t xml:space="preserve"> </w:t>
-      </w:r>
-      <w:r>
-        <w:rPr>
-          <w:rFonts w:ascii="Bookman Old Style" w:hAnsi="Bookman Old Style"/>
-          <w:b/>
-          <w:sz w:val="24"/>
-          <w:szCs w:val="24"/>
-        </w:rPr>
-        <w:t>WAKTU,</w:t>
-      </w:r>
-      <w:r>
-        <w:rPr>
-          <w:rFonts w:ascii="Bookman Old Style" w:hAnsi="Bookman Old Style"/>
-          <w:spacing w:val="36"/>
-          <w:sz w:val="24"/>
-          <w:szCs w:val="24"/>
-        </w:rPr>
-        <w:t xml:space="preserve"> </w:t>
-      </w:r>
-      <w:r>
-        <w:rPr>
-          <w:rFonts w:ascii="Bookman Old Style" w:hAnsi="Bookman Old Style"/>
-          <w:b/>
-          <w:sz w:val="24"/>
-          <w:szCs w:val="24"/>
-        </w:rPr>
-        <w:t>NILAI</w:t>
-      </w:r>
-      <w:r>
-        <w:rPr>
-          <w:rFonts w:ascii="Bookman Old Style" w:hAnsi="Bookman Old Style"/>
-          <w:spacing w:val="34"/>
-          <w:sz w:val="24"/>
-          <w:szCs w:val="24"/>
-        </w:rPr>
-        <w:t xml:space="preserve"> </w:t>
-      </w:r>
-      <w:r>
-        <w:rPr>
-          <w:rFonts w:ascii="Bookman Old Style" w:hAnsi="Bookman Old Style"/>
-          <w:b/>
-          <w:sz w:val="24"/>
-          <w:szCs w:val="24"/>
-        </w:rPr>
-        <w:t>PERJANJIAN,</w:t>
-      </w:r>
-      <w:r>
-        <w:rPr>
-          <w:rFonts w:ascii="Bookman Old Style" w:hAnsi="Bookman Old Style"/>
-          <w:spacing w:val="36"/>
-          <w:sz w:val="24"/>
-          <w:szCs w:val="24"/>
-        </w:rPr>
-        <w:t xml:space="preserve"> </w:t>
-      </w:r>
-      <w:r>
-        <w:rPr>
-          <w:rFonts w:ascii="Bookman Old Style" w:hAnsi="Bookman Old Style"/>
-          <w:b/>
-          <w:sz w:val="24"/>
-          <w:szCs w:val="24"/>
-        </w:rPr>
-        <w:t>DAN</w:t>
-      </w:r>
-      <w:r>
-        <w:rPr>
-          <w:rFonts w:ascii="Bookman Old Style" w:hAnsi="Bookman Old Style"/>
-          <w:spacing w:val="35"/>
-          <w:sz w:val="24"/>
-          <w:szCs w:val="24"/>
-        </w:rPr>
-        <w:t xml:space="preserve"> </w:t>
-      </w:r>
-      <w:r>
-        <w:rPr>
-          <w:rFonts w:ascii="Bookman Old Style" w:hAnsi="Bookman Old Style"/>
-          <w:b/>
-          <w:sz w:val="24"/>
-          <w:szCs w:val="24"/>
-        </w:rPr>
-        <w:t>BEBAN</w:t>
-      </w:r>
-      <w:r>
-        <w:rPr>
-          <w:rFonts w:ascii="Bookman Old Style" w:hAnsi="Bookman Old Style"/>
-          <w:spacing w:val="37"/>
-          <w:sz w:val="24"/>
-          <w:szCs w:val="24"/>
-        </w:rPr>
-        <w:t xml:space="preserve"> </w:t>
-      </w:r>
-      <w:r>
-        <w:rPr>
-          <w:rFonts w:ascii="Bookman Old Style" w:hAnsi="Bookman Old Style"/>
-          <w:b/>
-          <w:spacing w:val="-2"/>
-          <w:sz w:val="24"/>
-          <w:szCs w:val="24"/>
-        </w:rPr>
-        <w:t>ANGGARAN</w:t>
-      </w:r>
-    </w:p>
-    <w:p>
-      <w:pPr>
-        <w:pStyle w:val="BodyText"/>
-        <w:spacing w:before="28" w:after="1"/>
-        <w:rPr>
-          <w:rFonts w:ascii="Bookman Old Style" w:hAnsi="Bookman Old Style"/>
-          <w:b/>
-          <w:sz w:val="24"/>
-          <w:szCs w:val="24"/>
-        </w:rPr>
-      </w:pPr>
-    </w:p>
-    <w:tbl>
-      <w:tblPr>
-        <w:tblW w:w="15794" w:type="dxa"/>
-        <w:jc w:val="center"/>
-        <w:tblBorders>
-          <w:top w:val="single" w:sz="4" w:space="0" w:color="000000"/>
-          <w:left w:val="single" w:sz="4" w:space="0" w:color="000000"/>
-          <w:bottom w:val="single" w:sz="4" w:space="0" w:color="000000"/>
-          <w:right w:val="single" w:sz="4" w:space="0" w:color="000000"/>
-          <w:insideH w:val="single" w:sz="4" w:space="0" w:color="000000"/>
-          <w:insideV w:val="single" w:sz="4" w:space="0" w:color="000000"/>
-        </w:tblBorders>
-        <w:tblLayout w:type="fixed"/>
-        <w:tblCellMar>
-          <w:left w:w="0" w:type="dxa"/>
-          <w:right w:w="0" w:type="dxa"/>
-        </w:tblCellMar>
-        <w:tblLook w:val="01E0" w:firstRow="1" w:lastRow="1" w:firstColumn="1" w:lastColumn="1" w:noHBand="0" w:noVBand="0"/>
-      </w:tblPr>
-      <w:tblGrid>
-        <w:gridCol w:w="472"/>
-        <w:gridCol w:w="858"/>
-        <w:gridCol w:w="2498"/>
-        <w:gridCol w:w="1866"/>
-        <w:gridCol w:w="1064"/>
-        <w:gridCol w:w="1599"/>
-        <w:gridCol w:w="1844"/>
-        <w:gridCol w:w="2036"/>
-        <w:gridCol w:w="3557"/>
-      </w:tblGrid>
-      <w:tr>
-        <w:trPr>
-          <w:trHeight w:val="241"/>
-          <w:jc w:val="center"/>
-        </w:trPr>
-        <w:tc>
-          <w:tcPr>
-            <w:tcW w:w="472" w:type="dxa"/>
-            <w:vMerge w:val="restart"/>
-          </w:tcPr>
-          <w:p>
-            <w:pPr>
-              <w:pStyle w:val="TableParagraph"/>
-              <w:ind w:left="100"/>
-              <w:rPr>
-                <w:rFonts w:ascii="Bookman Old Style" w:hAnsi="Bookman Old Style"/>
-                <w:sz w:val="24"/>
-                <w:szCs w:val="24"/>
-              </w:rPr>
-            </w:pPr>
-            <w:r>
-              <w:rPr>
-                <w:rFonts w:ascii="Bookman Old Style" w:hAnsi="Bookman Old Style"/>
-                <w:spacing w:val="-5"/>
-                <w:w w:val="105"/>
-                <w:sz w:val="24"/>
-                <w:szCs w:val="24"/>
-              </w:rPr>
-              <w:t>No</w:t>
-            </w:r>
-          </w:p>
-        </w:tc>
-        <w:tc>
-          <w:tcPr>
-            <w:tcW w:w="3356" w:type="dxa"/>
-            <w:gridSpan w:val="2"/>
-            <w:vMerge w:val="restart"/>
-          </w:tcPr>
-          <w:p>
-            <w:pPr>
-              <w:pStyle w:val="TableParagraph"/>
-              <w:ind w:left="677" w:right="701"/>
-              <w:rPr>
-                <w:rFonts w:ascii="Bookman Old Style" w:hAnsi="Bookman Old Style"/>
-                <w:sz w:val="24"/>
-                <w:szCs w:val="24"/>
-              </w:rPr>
-            </w:pPr>
-            <w:r>
-              <w:rPr>
-                <w:rFonts w:ascii="Bookman Old Style" w:hAnsi="Bookman Old Style"/>
-                <w:w w:val="105"/>
-                <w:sz w:val="24"/>
-                <w:szCs w:val="24"/>
-              </w:rPr>
-              <w:t>Uraian</w:t>
-            </w:r>
-            <w:r>
-              <w:rPr>
-                <w:rFonts w:ascii="Bookman Old Style" w:hAnsi="Bookman Old Style"/>
-                <w:spacing w:val="-5"/>
-                <w:w w:val="105"/>
-                <w:sz w:val="24"/>
-                <w:szCs w:val="24"/>
-              </w:rPr>
-              <w:t xml:space="preserve"> </w:t>
-            </w:r>
-            <w:r>
-              <w:rPr>
-                <w:rFonts w:ascii="Bookman Old Style" w:hAnsi="Bookman Old Style"/>
-                <w:spacing w:val="-4"/>
-                <w:w w:val="105"/>
-                <w:sz w:val="24"/>
-                <w:szCs w:val="24"/>
-              </w:rPr>
-              <w:t>Tugas</w:t>
-            </w:r>
-          </w:p>
-        </w:tc>
-        <w:tc>
-          <w:tcPr>
-            <w:tcW w:w="1866" w:type="dxa"/>
-            <w:vMerge w:val="restart"/>
-          </w:tcPr>
-          <w:p>
-            <w:pPr>
-              <w:pStyle w:val="TableParagraph"/>
-              <w:ind w:left="129"/>
-              <w:rPr>
-                <w:rFonts w:ascii="Bookman Old Style" w:hAnsi="Bookman Old Style"/>
-                <w:sz w:val="24"/>
-                <w:szCs w:val="24"/>
-              </w:rPr>
-            </w:pPr>
-            <w:r>
-              <w:rPr>
-                <w:rFonts w:ascii="Bookman Old Style" w:hAnsi="Bookman Old Style"/>
-                <w:spacing w:val="-2"/>
-                <w:w w:val="105"/>
-                <w:sz w:val="24"/>
-                <w:szCs w:val="24"/>
-              </w:rPr>
-              <w:t>Jangka</w:t>
-            </w:r>
-            <w:r>
-              <w:rPr>
-                <w:rFonts w:ascii="Bookman Old Style" w:hAnsi="Bookman Old Style"/>
-                <w:spacing w:val="1"/>
-                <w:w w:val="105"/>
-                <w:sz w:val="24"/>
-                <w:szCs w:val="24"/>
-              </w:rPr>
-              <w:t xml:space="preserve"> </w:t>
-            </w:r>
-            <w:r>
-              <w:rPr>
-                <w:rFonts w:ascii="Bookman Old Style" w:hAnsi="Bookman Old Style"/>
-                <w:spacing w:val="-4"/>
-                <w:w w:val="105"/>
-                <w:sz w:val="24"/>
-                <w:szCs w:val="24"/>
-              </w:rPr>
-              <w:t>Waktu</w:t>
-            </w:r>
-          </w:p>
-        </w:tc>
-        <w:tc>
-          <w:tcPr>
-            <w:tcW w:w="2663" w:type="dxa"/>
-            <w:gridSpan w:val="2"/>
-          </w:tcPr>
-          <w:p>
-            <w:pPr>
-              <w:pStyle w:val="TableParagraph"/>
-              <w:spacing w:line="214" w:lineRule="exact"/>
-              <w:ind w:left="480"/>
-              <w:rPr>
-                <w:rFonts w:ascii="Bookman Old Style" w:hAnsi="Bookman Old Style"/>
-                <w:sz w:val="24"/>
-                <w:szCs w:val="24"/>
-              </w:rPr>
-            </w:pPr>
-            <w:r>
-              <w:rPr>
-                <w:rFonts w:ascii="Bookman Old Style" w:hAnsi="Bookman Old Style"/>
-                <w:w w:val="105"/>
-                <w:sz w:val="24"/>
-                <w:szCs w:val="24"/>
-              </w:rPr>
-              <w:t>Target</w:t>
-            </w:r>
-            <w:r>
-              <w:rPr>
-                <w:rFonts w:ascii="Bookman Old Style" w:hAnsi="Bookman Old Style"/>
-                <w:spacing w:val="-5"/>
-                <w:w w:val="105"/>
-                <w:sz w:val="24"/>
-                <w:szCs w:val="24"/>
-              </w:rPr>
-              <w:t xml:space="preserve"> </w:t>
-            </w:r>
-            <w:r>
-              <w:rPr>
-                <w:rFonts w:ascii="Bookman Old Style" w:hAnsi="Bookman Old Style"/>
-                <w:spacing w:val="-2"/>
-                <w:w w:val="105"/>
-                <w:sz w:val="24"/>
-                <w:szCs w:val="24"/>
-              </w:rPr>
-              <w:t>Pekerjaan</w:t>
-            </w:r>
-          </w:p>
-        </w:tc>
-        <w:tc>
-          <w:tcPr>
-            <w:tcW w:w="1844" w:type="dxa"/>
-            <w:vMerge w:val="restart"/>
-          </w:tcPr>
-          <w:p>
-            <w:pPr>
-              <w:pStyle w:val="TableParagraph"/>
-              <w:spacing w:before="0" w:line="242" w:lineRule="exact"/>
-              <w:ind w:left="287"/>
-              <w:rPr>
-                <w:rFonts w:ascii="Bookman Old Style" w:hAnsi="Bookman Old Style"/>
-                <w:sz w:val="24"/>
-                <w:szCs w:val="24"/>
-              </w:rPr>
-            </w:pPr>
-            <w:r>
-              <w:rPr>
-                <w:rFonts w:ascii="Bookman Old Style" w:hAnsi="Bookman Old Style"/>
-                <w:spacing w:val="-4"/>
-                <w:w w:val="105"/>
-                <w:sz w:val="24"/>
-                <w:szCs w:val="24"/>
-              </w:rPr>
-              <w:t xml:space="preserve">Harga </w:t>
-            </w:r>
-            <w:r>
-              <w:rPr>
-                <w:rFonts w:ascii="Bookman Old Style" w:hAnsi="Bookman Old Style"/>
-                <w:spacing w:val="-2"/>
-                <w:sz w:val="24"/>
-                <w:szCs w:val="24"/>
-              </w:rPr>
-              <w:t>Satuan</w:t>
-            </w:r>
-          </w:p>
-        </w:tc>
-        <w:tc>
-          <w:tcPr>
-            <w:tcW w:w="2036" w:type="dxa"/>
-            <w:vMerge w:val="restart"/>
-          </w:tcPr>
-          <w:p>
-            <w:pPr>
-              <w:pStyle w:val="TableParagraph"/>
-              <w:ind w:left="159"/>
-              <w:rPr>
-                <w:rFonts w:ascii="Bookman Old Style" w:hAnsi="Bookman Old Style"/>
-                <w:sz w:val="24"/>
-                <w:szCs w:val="24"/>
-              </w:rPr>
-            </w:pPr>
-            <w:r>
-              <w:rPr>
-                <w:rFonts w:ascii="Bookman Old Style" w:hAnsi="Bookman Old Style"/>
-                <w:w w:val="105"/>
-                <w:sz w:val="24"/>
-                <w:szCs w:val="24"/>
-              </w:rPr>
-              <w:t>Nilai</w:t>
-            </w:r>
-            <w:r>
-              <w:rPr>
-                <w:rFonts w:ascii="Bookman Old Style" w:hAnsi="Bookman Old Style"/>
-                <w:spacing w:val="2"/>
-                <w:w w:val="105"/>
-                <w:sz w:val="24"/>
-                <w:szCs w:val="24"/>
-              </w:rPr>
-              <w:t xml:space="preserve"> </w:t>
-            </w:r>
-            <w:r>
-              <w:rPr>
-                <w:rFonts w:ascii="Bookman Old Style" w:hAnsi="Bookman Old Style"/>
-                <w:spacing w:val="-2"/>
-                <w:w w:val="105"/>
-                <w:sz w:val="24"/>
-                <w:szCs w:val="24"/>
-              </w:rPr>
-              <w:t>Perjanjian</w:t>
-            </w:r>
-          </w:p>
-        </w:tc>
-        <w:tc>
-          <w:tcPr>
-            <w:tcW w:w="3557" w:type="dxa"/>
-            <w:vMerge w:val="restart"/>
-          </w:tcPr>
-          <w:p>
-            <w:pPr>
-              <w:pStyle w:val="TableParagraph"/>
-              <w:ind w:left="0"/>
-              <w:rPr>
-                <w:rFonts w:ascii="Bookman Old Style" w:hAnsi="Bookman Old Style"/>
-                <w:sz w:val="24"/>
-                <w:szCs w:val="24"/>
-              </w:rPr>
-            </w:pPr>
-            <w:r>
-              <w:rPr>
-                <w:rFonts w:ascii="Bookman Old Style" w:hAnsi="Bookman Old Style"/>
-                <w:w w:val="105"/>
-                <w:sz w:val="24"/>
-                <w:szCs w:val="24"/>
-              </w:rPr>
-              <w:t>Beban</w:t>
-            </w:r>
-            <w:r>
-              <w:rPr>
-                <w:rFonts w:ascii="Bookman Old Style" w:hAnsi="Bookman Old Style"/>
-                <w:spacing w:val="-4"/>
-                <w:w w:val="105"/>
-                <w:sz w:val="24"/>
-                <w:szCs w:val="24"/>
-              </w:rPr>
-              <w:t xml:space="preserve"> </w:t>
-            </w:r>
-            <w:r>
-              <w:rPr>
-                <w:rFonts w:ascii="Bookman Old Style" w:hAnsi="Bookman Old Style"/>
-                <w:spacing w:val="-2"/>
-                <w:w w:val="105"/>
-                <w:sz w:val="24"/>
-                <w:szCs w:val="24"/>
-              </w:rPr>
-              <w:t>Anggaran</w:t>
-            </w:r>
-          </w:p>
-        </w:tc>
-      </w:tr>
-      <w:tr>
-        <w:trPr>
-          <w:trHeight w:val="241"/>
-          <w:jc w:val="center"/>
-        </w:trPr>
-        <w:tc>
-          <w:tcPr>
-            <w:tcW w:w="472" w:type="dxa"/>
-            <w:vMerge/>
-            <w:tcBorders>
-              <w:top w:val="nil"/>
-            </w:tcBorders>
-          </w:tcPr>
-          <w:p>
-            <w:pPr>
-              <w:rPr>
-                <w:rFonts w:ascii="Bookman Old Style" w:hAnsi="Bookman Old Style"/>
-                <w:sz w:val="24"/>
-                <w:szCs w:val="24"/>
-              </w:rPr>
-            </w:pPr>
-          </w:p>
-        </w:tc>
-        <w:tc>
-          <w:tcPr>
-            <w:tcW w:w="3356" w:type="dxa"/>
-            <w:gridSpan w:val="2"/>
-            <w:vMerge/>
-            <w:tcBorders>
-              <w:top w:val="nil"/>
-            </w:tcBorders>
-          </w:tcPr>
-          <w:p>
-            <w:pPr>
-              <w:rPr>
-                <w:rFonts w:ascii="Bookman Old Style" w:hAnsi="Bookman Old Style"/>
-                <w:sz w:val="24"/>
-                <w:szCs w:val="24"/>
-              </w:rPr>
-            </w:pPr>
-          </w:p>
-        </w:tc>
-        <w:tc>
-          <w:tcPr>
-            <w:tcW w:w="1866" w:type="dxa"/>
-            <w:vMerge/>
-            <w:tcBorders>
-              <w:top w:val="nil"/>
-            </w:tcBorders>
-          </w:tcPr>
-          <w:p>
-            <w:pPr>
-              <w:rPr>
-                <w:rFonts w:ascii="Bookman Old Style" w:hAnsi="Bookman Old Style"/>
-                <w:sz w:val="24"/>
-                <w:szCs w:val="24"/>
-              </w:rPr>
-            </w:pPr>
-          </w:p>
-        </w:tc>
-        <w:tc>
-          <w:tcPr>
-            <w:tcW w:w="1064" w:type="dxa"/>
-          </w:tcPr>
-          <w:p>
-            <w:pPr>
-              <w:pStyle w:val="TableParagraph"/>
-              <w:spacing w:line="214" w:lineRule="exact"/>
-              <w:ind w:left="10" w:right="5"/>
-              <w:rPr>
-                <w:rFonts w:ascii="Bookman Old Style" w:hAnsi="Bookman Old Style"/>
-                <w:sz w:val="24"/>
-                <w:szCs w:val="24"/>
-              </w:rPr>
-            </w:pPr>
-            <w:r>
-              <w:rPr>
-                <w:rFonts w:ascii="Bookman Old Style" w:hAnsi="Bookman Old Style"/>
-                <w:spacing w:val="-2"/>
-                <w:w w:val="105"/>
-                <w:sz w:val="24"/>
-                <w:szCs w:val="24"/>
-              </w:rPr>
-              <w:t>Volume</w:t>
-            </w:r>
-          </w:p>
-        </w:tc>
-        <w:tc>
-          <w:tcPr>
-            <w:tcW w:w="1599" w:type="dxa"/>
-          </w:tcPr>
-          <w:p>
-            <w:pPr>
-              <w:pStyle w:val="TableParagraph"/>
-              <w:spacing w:line="214" w:lineRule="exact"/>
-              <w:rPr>
-                <w:rFonts w:ascii="Bookman Old Style" w:hAnsi="Bookman Old Style"/>
-                <w:sz w:val="24"/>
-                <w:szCs w:val="24"/>
-              </w:rPr>
-            </w:pPr>
-            <w:r>
-              <w:rPr>
-                <w:rFonts w:ascii="Bookman Old Style" w:hAnsi="Bookman Old Style"/>
-                <w:spacing w:val="-2"/>
-                <w:w w:val="105"/>
-                <w:sz w:val="24"/>
-                <w:szCs w:val="24"/>
-              </w:rPr>
-              <w:t>Satuan</w:t>
-            </w:r>
-          </w:p>
-        </w:tc>
-        <w:tc>
-          <w:tcPr>
-            <w:tcW w:w="1844" w:type="dxa"/>
-            <w:vMerge/>
-            <w:tcBorders>
-              <w:top w:val="nil"/>
-            </w:tcBorders>
-          </w:tcPr>
-          <w:p>
-            <w:pPr>
-              <w:rPr>
-                <w:rFonts w:ascii="Bookman Old Style" w:hAnsi="Bookman Old Style"/>
-                <w:sz w:val="24"/>
-                <w:szCs w:val="24"/>
-              </w:rPr>
-            </w:pPr>
-          </w:p>
-        </w:tc>
-        <w:tc>
-          <w:tcPr>
-            <w:tcW w:w="2036" w:type="dxa"/>
-            <w:vMerge/>
-            <w:tcBorders>
-              <w:top w:val="nil"/>
-            </w:tcBorders>
-          </w:tcPr>
-          <w:p>
-            <w:pPr>
-              <w:rPr>
-                <w:rFonts w:ascii="Bookman Old Style" w:hAnsi="Bookman Old Style"/>
-                <w:sz w:val="24"/>
-                <w:szCs w:val="24"/>
-              </w:rPr>
-            </w:pPr>
-          </w:p>
-        </w:tc>
-        <w:tc>
-          <w:tcPr>
-            <w:tcW w:w="3557" w:type="dxa"/>
-            <w:vMerge/>
-            <w:tcBorders>
-              <w:top w:val="nil"/>
-            </w:tcBorders>
-          </w:tcPr>
-          <w:p>
-            <w:pPr>
-              <w:rPr>
-                <w:rFonts w:ascii="Bookman Old Style" w:hAnsi="Bookman Old Style"/>
-                <w:sz w:val="24"/>
-                <w:szCs w:val="24"/>
-              </w:rPr>
-            </w:pPr>
-          </w:p>
-        </w:tc>
-      </w:tr>
-      <w:tr>
-        <w:trPr>
-          <w:trHeight w:val="241"/>
-          <w:jc w:val="center"/>
-        </w:trPr>
-        <w:tc>
-          <w:tcPr>
-            <w:tcW w:w="472" w:type="dxa"/>
-          </w:tcPr>
-          <w:p>
-            <w:pPr>
-              <w:pStyle w:val="TableParagraph"/>
-              <w:spacing w:line="214" w:lineRule="exact"/>
-              <w:ind w:left="7" w:right="2"/>
-              <w:rPr>
-                <w:rFonts w:ascii="Bookman Old Style" w:hAnsi="Bookman Old Style"/>
-                <w:sz w:val="18"/>
-                <w:szCs w:val="24"/>
-              </w:rPr>
-            </w:pPr>
-            <w:r>
-              <w:rPr>
-                <w:rFonts w:ascii="Bookman Old Style" w:hAnsi="Bookman Old Style"/>
-                <w:spacing w:val="-5"/>
-                <w:w w:val="105"/>
-                <w:sz w:val="18"/>
-                <w:szCs w:val="24"/>
-              </w:rPr>
-              <w:t>(1)</w:t>
-            </w:r>
-          </w:p>
-        </w:tc>
-        <w:tc>
-          <w:tcPr>
-            <w:tcW w:w="3356" w:type="dxa"/>
-            <w:gridSpan w:val="2"/>
-          </w:tcPr>
-          <w:p>
-            <w:pPr>
-              <w:pStyle w:val="TableParagraph"/>
-              <w:spacing w:line="214" w:lineRule="exact"/>
-              <w:ind w:left="9"/>
-              <w:rPr>
-                <w:rFonts w:ascii="Bookman Old Style" w:hAnsi="Bookman Old Style"/>
-                <w:sz w:val="18"/>
-                <w:szCs w:val="24"/>
-              </w:rPr>
-            </w:pPr>
-            <w:r>
-              <w:rPr>
-                <w:rFonts w:ascii="Bookman Old Style" w:hAnsi="Bookman Old Style"/>
-                <w:spacing w:val="-5"/>
-                <w:w w:val="105"/>
-                <w:sz w:val="18"/>
-                <w:szCs w:val="24"/>
-              </w:rPr>
-              <w:t>(2)</w:t>
-            </w:r>
-          </w:p>
-        </w:tc>
-        <w:tc>
-          <w:tcPr>
-            <w:tcW w:w="1866" w:type="dxa"/>
-          </w:tcPr>
-          <w:p>
-            <w:pPr>
-              <w:pStyle w:val="TableParagraph"/>
-              <w:spacing w:line="214" w:lineRule="exact"/>
-              <w:ind w:left="7"/>
-              <w:rPr>
-                <w:rFonts w:ascii="Bookman Old Style" w:hAnsi="Bookman Old Style"/>
-                <w:sz w:val="18"/>
-                <w:szCs w:val="24"/>
-              </w:rPr>
-            </w:pPr>
-            <w:r>
-              <w:rPr>
-                <w:rFonts w:ascii="Bookman Old Style" w:hAnsi="Bookman Old Style"/>
-                <w:spacing w:val="-5"/>
-                <w:w w:val="105"/>
-                <w:sz w:val="18"/>
-                <w:szCs w:val="24"/>
-              </w:rPr>
-              <w:t>(3)</w:t>
-            </w:r>
-          </w:p>
-        </w:tc>
-        <w:tc>
-          <w:tcPr>
-            <w:tcW w:w="1064" w:type="dxa"/>
-          </w:tcPr>
-          <w:p>
-            <w:pPr>
-              <w:pStyle w:val="TableParagraph"/>
-              <w:spacing w:line="214" w:lineRule="exact"/>
-              <w:ind w:left="10"/>
-              <w:rPr>
-                <w:rFonts w:ascii="Bookman Old Style" w:hAnsi="Bookman Old Style"/>
-                <w:sz w:val="18"/>
-                <w:szCs w:val="24"/>
-              </w:rPr>
-            </w:pPr>
-            <w:r>
-              <w:rPr>
-                <w:rFonts w:ascii="Bookman Old Style" w:hAnsi="Bookman Old Style"/>
-                <w:spacing w:val="-5"/>
-                <w:w w:val="105"/>
-                <w:sz w:val="18"/>
-                <w:szCs w:val="24"/>
-              </w:rPr>
-              <w:t>(3)</w:t>
-            </w:r>
-          </w:p>
-        </w:tc>
-        <w:tc>
-          <w:tcPr>
-            <w:tcW w:w="1599" w:type="dxa"/>
-          </w:tcPr>
-          <w:p>
-            <w:pPr>
-              <w:pStyle w:val="TableParagraph"/>
-              <w:spacing w:line="214" w:lineRule="exact"/>
-              <w:ind w:right="5"/>
-              <w:rPr>
-                <w:rFonts w:ascii="Bookman Old Style" w:hAnsi="Bookman Old Style"/>
-                <w:sz w:val="18"/>
-                <w:szCs w:val="24"/>
-              </w:rPr>
-            </w:pPr>
-            <w:r>
-              <w:rPr>
-                <w:rFonts w:ascii="Bookman Old Style" w:hAnsi="Bookman Old Style"/>
-                <w:spacing w:val="-5"/>
-                <w:w w:val="105"/>
-                <w:sz w:val="18"/>
-                <w:szCs w:val="24"/>
-              </w:rPr>
-              <w:t>(4)</w:t>
-            </w:r>
-          </w:p>
-        </w:tc>
-        <w:tc>
-          <w:tcPr>
-            <w:tcW w:w="1844" w:type="dxa"/>
-          </w:tcPr>
-          <w:p>
-            <w:pPr>
-              <w:pStyle w:val="TableParagraph"/>
-              <w:spacing w:line="214" w:lineRule="exact"/>
-              <w:ind w:right="1"/>
-              <w:rPr>
-                <w:rFonts w:ascii="Bookman Old Style" w:hAnsi="Bookman Old Style"/>
-                <w:sz w:val="18"/>
-                <w:szCs w:val="24"/>
-              </w:rPr>
-            </w:pPr>
-            <w:r>
-              <w:rPr>
-                <w:rFonts w:ascii="Bookman Old Style" w:hAnsi="Bookman Old Style"/>
-                <w:spacing w:val="-5"/>
-                <w:w w:val="105"/>
-                <w:sz w:val="18"/>
-                <w:szCs w:val="24"/>
-              </w:rPr>
-              <w:t>(5)</w:t>
-            </w:r>
-          </w:p>
-        </w:tc>
-        <w:tc>
-          <w:tcPr>
-            <w:tcW w:w="2036" w:type="dxa"/>
-          </w:tcPr>
-          <w:p>
-            <w:pPr>
-              <w:pStyle w:val="TableParagraph"/>
-              <w:spacing w:line="214" w:lineRule="exact"/>
-              <w:ind w:left="13"/>
-              <w:rPr>
-                <w:rFonts w:ascii="Bookman Old Style" w:hAnsi="Bookman Old Style"/>
-                <w:sz w:val="18"/>
-                <w:szCs w:val="24"/>
-              </w:rPr>
-            </w:pPr>
-            <w:r>
-              <w:rPr>
-                <w:rFonts w:ascii="Bookman Old Style" w:hAnsi="Bookman Old Style"/>
-                <w:spacing w:val="-5"/>
-                <w:w w:val="105"/>
-                <w:sz w:val="18"/>
-                <w:szCs w:val="24"/>
-              </w:rPr>
-              <w:t>(6)</w:t>
-            </w:r>
-          </w:p>
-        </w:tc>
-        <w:tc>
-          <w:tcPr>
-            <w:tcW w:w="3557" w:type="dxa"/>
-          </w:tcPr>
-          <w:p>
-            <w:pPr>
-              <w:pStyle w:val="TableParagraph"/>
-              <w:spacing w:line="214" w:lineRule="exact"/>
-              <w:ind w:left="17"/>
-              <w:rPr>
-                <w:rFonts w:ascii="Bookman Old Style" w:hAnsi="Bookman Old Style"/>
-                <w:sz w:val="18"/>
-                <w:szCs w:val="24"/>
-              </w:rPr>
-            </w:pPr>
-            <w:r>
-              <w:rPr>
-                <w:rFonts w:ascii="Bookman Old Style" w:hAnsi="Bookman Old Style"/>
-                <w:spacing w:val="-5"/>
-                <w:w w:val="105"/>
-                <w:sz w:val="18"/>
-                <w:szCs w:val="24"/>
-              </w:rPr>
-              <w:t>(7)</w:t>
-            </w:r>
-          </w:p>
-        </w:tc>
-      </w:tr>
-      <w:tr>
-        <w:trPr>
-          <w:trHeight w:val="484"/>
-          <w:jc w:val="center"/>
-        </w:trPr>
-        <w:tc>
-          <w:tcPr>
-            <w:tcW w:w="472" w:type="dxa"/>
-            <w:vAlign w:val="center"/>
-          </w:tcPr>
-          <w:p>
-            <w:pPr>
-              <w:pStyle w:val="TableParagraph"/>
-              <w:ind w:left="7"/>
-              <w:jc w:val="left"/>
-              <w:rPr>
-                <w:rFonts w:ascii="Bookman Old Style" w:hAnsi="Bookman Old Style"/>
-                <w:sz w:val="24"/>
-                <w:szCs w:val="24"/>
-              </w:rPr>
-            </w:pPr>
-            <w:r>
-              <w:rPr>
-                <w:rFonts w:ascii="Bookman Old Style" w:hAnsi="Bookman Old Style"/>
-                <w:sz w:val="24"/>
-                <w:szCs w:val="24"/>
-              </w:rPr>
-              <w:t>&lt;&lt;NO_URUT&gt;&gt;</w:t>
-            </w:r>
-          </w:p>
-        </w:tc>
-        <w:tc>
-          <w:tcPr>
-            <w:tcW w:w="3356" w:type="dxa"/>
-            <w:gridSpan w:val="2"/>
-            <w:vAlign w:val="center"/>
-          </w:tcPr>
-          <w:p>
-            <w:pPr>
-              <w:pStyle w:val="TableParagraph"/>
-              <w:spacing w:before="0" w:line="242" w:lineRule="exact"/>
-              <w:ind w:left="103" w:right="159"/>
-              <w:jc w:val="left"/>
-              <w:rPr>
-                <w:rFonts w:ascii="Bookman Old Style" w:hAnsi="Bookman Old Style"/>
-                <w:sz w:val="24"/>
-                <w:szCs w:val="24"/>
-              </w:rPr>
-            </w:pPr>
-            <w:r>
-              <w:rPr>
-                <w:rFonts w:ascii="Bookman Old Style" w:hAnsi="Bookman Old Style"/>
-                <w:sz w:val="24"/>
-                <w:szCs w:val="24"/>
-              </w:rPr>
-              <w:t>&lt;&lt;URAIAN_TUGAS&gt;&gt;</w:t>
-            </w:r>
-          </w:p>
-        </w:tc>
-        <w:tc>
-          <w:tcPr>
-            <w:tcW w:w="1866" w:type="dxa"/>
-            <w:vAlign w:val="center"/>
-          </w:tcPr>
-          <w:p>
-            <w:pPr>
-              <w:pStyle w:val="TableParagraph"/>
-              <w:spacing w:before="9" w:line="214" w:lineRule="exact"/>
-              <w:ind w:left="84"/>
-              <w:jc w:val="left"/>
-              <w:rPr>
-                <w:rFonts w:ascii="Bookman Old Style" w:hAnsi="Bookman Old Style"/>
-                <w:sz w:val="24"/>
-                <w:szCs w:val="24"/>
-              </w:rPr>
-            </w:pPr>
-            <w:r>
-              <w:rPr>
-                <w:rFonts w:ascii="Bookman Old Style" w:hAnsi="Bookman Old Style"/>
-                <w:sz w:val="24"/>
-                <w:szCs w:val="24"/>
-              </w:rPr>
-              <w:t>&lt;&lt;JANGKA_WAKTU&gt;&gt;</w:t>
-            </w:r>
-          </w:p>
-        </w:tc>
-        <w:tc>
-          <w:tcPr>
-            <w:tcW w:w="1064" w:type="dxa"/>
-            <w:vAlign w:val="center"/>
-          </w:tcPr>
-          <w:p>
-            <w:pPr>
-              <w:pStyle w:val="TableParagraph"/>
-              <w:ind w:left="10" w:right="4"/>
-              <w:rPr>
-                <w:rFonts w:ascii="Bookman Old Style" w:hAnsi="Bookman Old Style"/>
-                <w:sz w:val="24"/>
-                <w:szCs w:val="24"/>
-              </w:rPr>
-            </w:pPr>
-            <w:r>
-              <w:rPr>
-                <w:rFonts w:ascii="Bookman Old Style" w:hAnsi="Bookman Old Style"/>
-                <w:sz w:val="24"/>
-                <w:szCs w:val="24"/>
-              </w:rPr>
-              <w:t>&lt;&lt;VOLUME&gt;&gt;</w:t>
-            </w:r>
-          </w:p>
-        </w:tc>
-        <w:tc>
-          <w:tcPr>
-            <w:tcW w:w="1599" w:type="dxa"/>
-            <w:vAlign w:val="center"/>
-          </w:tcPr>
-          <w:p>
-            <w:pPr>
-              <w:pStyle w:val="TableParagraph"/>
-              <w:jc w:val="left"/>
-              <w:rPr>
-                <w:rFonts w:ascii="Bookman Old Style" w:hAnsi="Bookman Old Style"/>
-                <w:sz w:val="24"/>
-                <w:szCs w:val="24"/>
-              </w:rPr>
-            </w:pPr>
-            <w:r>
-              <w:rPr>
-                <w:rFonts w:ascii="Bookman Old Style" w:hAnsi="Bookman Old Style"/>
-                <w:sz w:val="24"/>
-                <w:szCs w:val="24"/>
-              </w:rPr>
-              <w:t>&lt;&lt;SATUAN&gt;&gt;</w:t>
-            </w:r>
-          </w:p>
-        </w:tc>
-        <w:tc>
-          <w:tcPr>
-            <w:tcW w:w="1844" w:type="dxa"/>
-            <w:vAlign w:val="center"/>
-          </w:tcPr>
-          <w:p>
-            <w:pPr>
-              <w:pStyle w:val="TableParagraph"/>
-              <w:ind w:left="143" w:right="5"/>
-              <w:jc w:val="left"/>
-              <w:rPr>
-                <w:rFonts w:ascii="Bookman Old Style" w:hAnsi="Bookman Old Style"/>
-                <w:sz w:val="24"/>
-                <w:szCs w:val="24"/>
-              </w:rPr>
-            </w:pPr>
-            <w:r>
-              <w:rPr>
-                <w:rFonts w:ascii="Bookman Old Style" w:hAnsi="Bookman Old Style"/>
-                <w:sz w:val="24"/>
-                <w:szCs w:val="24"/>
-              </w:rPr>
-              <w:t>&lt;&lt;HARGA_SATUAN&gt;&gt;</w:t>
-            </w:r>
-          </w:p>
-        </w:tc>
-        <w:tc>
-          <w:tcPr>
-            <w:tcW w:w="2036" w:type="dxa"/>
-            <w:vAlign w:val="center"/>
-          </w:tcPr>
-          <w:p>
-            <w:pPr>
-              <w:pStyle w:val="TableParagraph"/>
-              <w:ind w:left="0" w:right="86"/>
-              <w:rPr>
-                <w:rFonts w:ascii="Bookman Old Style" w:hAnsi="Bookman Old Style"/>
-                <w:sz w:val="24"/>
-                <w:szCs w:val="24"/>
-              </w:rPr>
-            </w:pPr>
-            <w:r>
-              <w:rPr>
-                <w:rFonts w:ascii="Bookman Old Style" w:hAnsi="Bookman Old Style"/>
-                <w:sz w:val="24"/>
-                <w:szCs w:val="24"/>
-              </w:rPr>
-              <w:t>&lt;&lt;NILAI_PERJANJIAN&gt;&gt;</w:t>
-            </w:r>
-          </w:p>
-        </w:tc>
-        <w:tc>
-          <w:tcPr>
-            <w:tcW w:w="3557" w:type="dxa"/>
-            <w:vAlign w:val="center"/>
-          </w:tcPr>
-          <w:p>
-            <w:pPr>
-              <w:pStyle w:val="TableParagraph"/>
-              <w:ind w:left="17" w:right="1"/>
-              <w:rPr>
-                <w:rFonts w:ascii="Bookman Old Style" w:hAnsi="Bookman Old Style"/>
-                <w:sz w:val="24"/>
-                <w:szCs w:val="24"/>
-              </w:rPr>
-            </w:pPr>
-            <w:r>
-              <w:rPr>
-                <w:rFonts w:ascii="Bookman Old Style" w:hAnsi="Bookman Old Style"/>
-                <w:sz w:val="24"/>
-                <w:szCs w:val="24"/>
-              </w:rPr>
-              <w:t>&lt;&lt;BEBAN_ANGGARAN&gt;&gt;</w:t>
-            </w:r>
-          </w:p>
-        </w:tc>
-      </w:tr>
-      <w:tr>
-        <w:trPr>
-          <w:trHeight w:val="527"/>
-          <w:jc w:val="center"/>
-        </w:trPr>
-        <w:tc>
-          <w:tcPr>
-            <w:tcW w:w="1330" w:type="dxa"/>
-            <w:gridSpan w:val="2"/>
-            <w:vAlign w:val="center"/>
-          </w:tcPr>
-          <w:p>
-            <w:pPr>
-              <w:pStyle w:val="TableParagraph"/>
-              <w:spacing w:before="0"/>
-              <w:ind w:left="0"/>
-              <w:rPr>
-                <w:rFonts w:ascii="Bookman Old Style" w:hAnsi="Bookman Old Style"/>
-                <w:sz w:val="24"/>
-                <w:szCs w:val="24"/>
-              </w:rPr>
-            </w:pPr>
-          </w:p>
-        </w:tc>
-        <w:tc>
-          <w:tcPr>
-            <w:tcW w:w="8871" w:type="dxa"/>
-            <w:gridSpan w:val="5"/>
-            <w:vAlign w:val="center"/>
-          </w:tcPr>
-          <w:p>
-            <w:pPr>
-              <w:pStyle w:val="TableParagraph"/>
-              <w:spacing w:before="159"/>
-              <w:ind w:left="544"/>
-              <w:jc w:val="left"/>
-              <w:rPr>
-                <w:rFonts w:ascii="Bookman Old Style" w:hAnsi="Bookman Old Style"/>
-                <w:i/>
-                <w:sz w:val="24"/>
-                <w:szCs w:val="24"/>
-              </w:rPr>
-            </w:pPr>
-            <w:r>
-              <w:rPr>
-                <w:rFonts w:ascii="Bookman Old Style" w:hAnsi="Bookman Old Style"/>
-                <w:i/>
-                <w:w w:val="105"/>
-                <w:sz w:val="24"/>
-                <w:szCs w:val="24"/>
-              </w:rPr>
-              <w:t>Terbilang:</w:t>
-            </w:r>
-            <w:r>
-              <w:rPr>
-                <w:rFonts w:ascii="Bookman Old Style" w:hAnsi="Bookman Old Style"/>
-                <w:spacing w:val="-7"/>
-                <w:w w:val="105"/>
-                <w:sz w:val="24"/>
-                <w:szCs w:val="24"/>
-              </w:rPr>
-              <w:t xml:space="preserve"> </w:t>
-            </w:r>
-            <w:r>
-              <w:rPr>
-                <w:rFonts w:ascii="Bookman Old Style" w:hAnsi="Bookman Old Style"/>
-                <w:spacing w:val="-7"/>
-                <w:w w:val="105"/>
-                <w:sz w:val="24"/>
-                <w:szCs w:val="24"/>
-              </w:rPr>
-              <w:t>&lt;&lt;TERBILANG&gt;&gt;</w:t>
-            </w:r>
-          </w:p>
-        </w:tc>
-        <w:tc>
-          <w:tcPr>
-            <w:tcW w:w="2036" w:type="dxa"/>
-            <w:vAlign w:val="center"/>
-          </w:tcPr>
-          <w:p>
-            <w:pPr>
-              <w:pStyle w:val="TableParagraph"/>
-              <w:spacing w:before="152"/>
-              <w:ind w:left="0" w:right="86"/>
-              <w:jc w:val="left"/>
-              <w:rPr>
-                <w:rFonts w:ascii="Bookman Old Style" w:hAnsi="Bookman Old Style"/>
-                <w:sz w:val="24"/>
-                <w:szCs w:val="24"/>
-              </w:rPr>
-            </w:pPr>
-            <w:r>
-              <w:rPr>
-                <w:rFonts w:ascii="Bookman Old Style" w:hAnsi="Bookman Old Style"/>
-                <w:sz w:val="24"/>
-                <w:szCs w:val="24"/>
-              </w:rPr>
-              <w:t>Rp &lt;&lt;TOTAL_HONOR&gt;&gt;,-</w:t>
-            </w:r>
-          </w:p>
-        </w:tc>
-        <w:tc>
-          <w:tcPr>
-            <w:tcW w:w="3557" w:type="dxa"/>
-            <w:vAlign w:val="center"/>
-          </w:tcPr>
-          <w:p>
-            <w:pPr>
-              <w:pStyle w:val="TableParagraph"/>
-              <w:spacing w:before="0"/>
-              <w:ind w:left="0"/>
-              <w:rPr>
-                <w:rFonts w:ascii="Bookman Old Style" w:hAnsi="Bookman Old Style"/>
-                <w:sz w:val="24"/>
-                <w:szCs w:val="24"/>
-              </w:rPr>
-            </w:pPr>
-          </w:p>
-        </w:tc>
-      </w:tr>
-    </w:tbl>
-    <w:p>
-      <w:pPr>
-        <w:pStyle w:val="BodyText"/>
-        <w:tabs>
-          <w:tab w:val="left" w:pos="450"/>
-        </w:tabs>
-        <w:spacing w:after="120" w:line="276" w:lineRule="auto"/>
-        <w:rPr>
-          <w:rFonts w:ascii="Bookman Old Style" w:hAnsi="Bookman Old Style" w:cs="Times New Roman"/>
-          <w:color w:val="000000" w:themeColor="text1"/>
-          <w:sz w:val="24"/>
-          <w:szCs w:val="24"/>
-          <w:lang w:val="id-ID"/>
-        </w:rPr>
-      </w:pPr>
-    </w:p>
-    <w:sectPr>
-      <w:pgSz w:w="16838" w:h="11906" w:orient="landscape"/>
-      <w:pgMar w:top="1134" w:right="1440" w:bottom="1247" w:left="1440" w:header="709" w:footer="709" w:gutter="0"/>
-      <w:pgNumType w:fmt="numberInDash"/>
-      <w:cols w:space="708"/>
-      <w:titlePg/>
-      <w:docGrid w:linePitch="360"/>
-    </w:sectPr>
-  </w:body>
-</w:document>
+<file path=word/document.xml><?xml version="1.0" encoding="UTF-8" standalone="yes"?>
+<w:document xmlns:wpc="http://schemas.microsoft.com/office/word/2010/wordprocessingCanvas" xmlns:cx="http://schemas.microsoft.com/office/drawing/2014/chartex" xmlns:cx1="http://schemas.microsoft.com/office/drawing/2015/9/8/chartex" xmlns:cx2="http://schemas.microsoft.com/office/drawing/2015/10/21/chartex" xmlns:cx3="http://schemas.microsoft.com/office/drawing/2016/5/9/chartex" xmlns:cx4="http://schemas.microsoft.com/office/drawing/2016/5/10/chartex" xmlns:cx5="http://schemas.microsoft.com/office/drawing/2016/5/11/chartex" xmlns:cx6="http://schemas.microsoft.com/office/drawing/2016/5/12/chartex" xmlns:cx7="http://schemas.microsoft.com/office/drawing/2016/5/13/chartex" xmlns:cx8="http://schemas.microsoft.com/office/drawing/2016/5/14/chartex" xmlns:mc="http://schemas.openxmlformats.org/markup-compatibility/2006" xmlns:aink="http://schemas.microsoft.com/office/drawing/2016/ink" xmlns:am3d="http://schemas.microsoft.com/office/drawing/2017/model3d" xmlns:o="urn:schemas-microsoft-com:office:office" xmlns:oel="http://schemas.microsoft.com/office/2019/extlst" xmlns:r="http://schemas.openxmlformats.org/officeDocument/2006/relationships" xmlns:m="http://schemas.openxmlformats.org/officeDocument/2006/math" xmlns:v="urn:schemas-microsoft-com:vml" xmlns:wp14="http://schemas.microsoft.com/office/word/2010/wordprocessingDrawing" xmlns:wp="http://schemas.openxmlformats.org/drawingml/2006/wordprocessingDrawing" xmlns:w10="urn:schemas-microsoft-com:office:word" xmlns:w="http://schemas.openxmlformats.org/wordprocessingml/2006/main" xmlns:w14="http://schemas.microsoft.com/office/word/2010/wordml" xmlns:w15="http://schemas.microsoft.com/office/word/2012/wordml" xmlns:w16cex="http://schemas.microsoft.com/office/word/2018/wordml/cex" xmlns:w16cid="http://schemas.microsoft.com/office/word/2016/wordml/cid" xmlns:w16="http://schemas.microsoft.com/office/word/2018/wordml" xmlns:w16du="http://schemas.microsoft.com/office/word/2023/wordml/word16du" xmlns:w16sdtdh="http://schemas.microsoft.com/office/word/2020/wordml/sdtdatahash" xmlns:w16sdtfl="http://schemas.microsoft.com/office/word/2024/wordml/sdtformatlock" xmlns:w16se="http://schemas.microsoft.com/office/word/2015/wordml/symex" xmlns:wpg="http://schemas.microsoft.com/office/word/2010/wordprocessingGroup" xmlns:wpi="http://schemas.microsoft.com/office/word/2010/wordprocessingInk" xmlns:wne="http://schemas.microsoft.com/office/word/2006/wordml" xmlns:wps="http://schemas.microsoft.com/office/word/2010/wordprocessingShape" mc:Ignorable="w14 w15 w16se w16cid w16 w16cex w16sdtdh w16sdtfl w16du wp14"><w:body><w:tbl><w:tblPr><w:tblW w:w="10348" w:type="dxa"/><w:tblInd w:w="-567" w:type="dxa"/><w:tblLook w:val="04A0" w:firstRow="1" w:lastRow="0" w:firstColumn="1" w:lastColumn="0" w:noHBand="0" w:noVBand="1"/></w:tblPr><w:tblGrid><w:gridCol w:w="10348"/></w:tblGrid><w:tr><w:tc><w:tcPr><w:tcW w:w="10348" w:type="dxa"/></w:tcPr><w:p><w:pPr><w:tabs><w:tab w:val="left" w:pos="7830"/></w:tabs><w:spacing w:after="120"/><w:ind w:right="34"/><w:jc w:val="center"/><w:rPr><w:rFonts w:ascii="Bookman Old Style" w:hAnsi="Bookman Old Style"/><w:b/><w:sz w:val="24"/><w:szCs w:val="24"/></w:rPr></w:pPr><w:r><w:rPr><w:rFonts w:ascii="Bookman Old Style" w:hAnsi="Bookman Old Style"/><w:b/><w:sz w:val="24"/><w:szCs w:val="24"/></w:rPr><w:t>PERJANJIAN KERJA</w:t></w:r></w:p><w:p><w:pPr><w:tabs><w:tab w:val="left" w:pos="7830"/></w:tabs><w:ind w:right="34"/><w:jc w:val="center"/><w:rPr><w:rFonts w:ascii="Bookman Old Style" w:hAnsi="Bookman Old Style"/><w:b/><w:sz w:val="24"/><w:szCs w:val="24"/></w:rPr></w:pPr><w:r><w:rPr><w:rFonts w:ascii="Bookman Old Style" w:hAnsi="Bookman Old Style" w:cs="Arial"/><w:b/><w:noProof/><w:sz w:val="24"/><w:szCs w:val="24"/></w:rPr><w:t>&lt;&lt;JUDUL_PEKERJAAN_DOKUMEN&gt;&gt;</w:t></w:r></w:p><w:p><w:pPr><w:tabs><w:tab w:val="left" w:pos="7830"/></w:tabs><w:ind w:right="34"/><w:jc w:val="center"/><w:rPr><w:rFonts w:ascii="Bookman Old Style" w:hAnsi="Bookman Old Style"/><w:b/><w:sz w:val="24"/><w:szCs w:val="24"/></w:rPr></w:pPr><w:r><w:rPr><w:rFonts w:ascii="Bookman Old Style" w:hAnsi="Bookman Old Style"/><w:b/><w:sz w:val="24"/><w:szCs w:val="24"/></w:rPr><w:t>BADAN PUSAT STATISTIK KOTA SUBULUSSALAM</w:t></w:r></w:p><w:p><w:pPr><w:tabs><w:tab w:val="left" w:pos="7830"/></w:tabs><w:ind w:right="34"/><w:jc w:val="center"/><w:rPr><w:rFonts w:ascii="Bookman Old Style" w:hAnsi="Bookman Old Style" w:cs="Arial"/><w:b/><w:sz w:val="24"/><w:szCs w:val="24"/></w:rPr></w:pPr><w:r><w:rPr><w:rFonts w:ascii="Bookman Old Style" w:hAnsi="Bookman Old Style" w:cs="Arial"/><w:b/><w:sz w:val="24"/><w:szCs w:val="24"/></w:rPr><w:t xml:space="preserve">NOMOR </w:t></w:r><w:r><w:rPr><w:rFonts w:ascii="Bookman Old Style" w:hAnsi="Bookman Old Style" w:cs="Arial"/><w:b/><w:noProof/><w:sz w:val="24"/><w:szCs w:val="24"/></w:rPr><w:t>&lt;&lt;NO_SPK&gt;&gt;</w:t></w:r></w:p></w:tc></w:tr></w:tbl><w:p><w:pPr><w:tabs><w:tab w:val="left" w:pos="2512"/></w:tabs><w:jc w:val="center"/><w:rPr><w:rFonts w:ascii="Bookman Old Style" w:hAnsi="Bookman Old Style" w:cs="Arial"/><w:b/><w:sz w:val="24"/><w:szCs w:val="24"/></w:rPr></w:pPr></w:p><w:p><w:pPr><w:jc w:val="both"/><w:rPr><w:rFonts w:ascii="Bookman Old Style" w:hAnsi="Bookman Old Style"/><w:sz w:val="24"/><w:szCs w:val="24"/></w:rPr></w:pPr><w:r><w:rPr><w:rFonts w:ascii="Bookman Old Style" w:hAnsi="Bookman Old Style"/><w:sz w:val="24"/><w:szCs w:val="24"/></w:rPr><w:t xml:space="preserve">Pada Hari ini. </w:t></w:r><w:r><w:rPr><w:rFonts w:ascii="Bookman Old Style" w:hAnsi="Bookman Old Style" w:cs="Arial"/><w:noProof/><w:sz w:val="24"/><w:szCs w:val="24"/></w:rPr><w:t>&lt;&lt;HARI_TERBILANG&gt;&gt;</w:t></w:r><w:r><w:rPr><w:rFonts w:ascii="Bookman Old Style" w:hAnsi="Bookman Old Style" w:cs="Arial"/><w:noProof/><w:sz w:val="24"/><w:szCs w:val="24"/></w:rPr><w:t xml:space="preserve"> </w:t></w:r><w:r><w:rPr><w:rFonts w:ascii="Bookman Old Style" w:hAnsi="Bookman Old Style"/><w:sz w:val="24"/><w:szCs w:val="24"/></w:rPr><w:t xml:space="preserve">tanggal </w:t></w:r><w:r><w:rPr><w:rFonts w:ascii="Bookman Old Style" w:hAnsi="Bookman Old Style" w:cs="Arial"/><w:noProof/><w:sz w:val="24"/><w:szCs w:val="24"/></w:rPr><w:t>&lt;&lt;TANGGAL_TERBILANG&gt;&gt;</w:t></w:r><w:r><w:rPr><w:rFonts w:ascii="Bookman Old Style" w:hAnsi="Bookman Old Style" w:cs="Arial"/><w:sz w:val="24"/><w:szCs w:val="24"/></w:rPr><w:t xml:space="preserve"> </w:t></w:r><w:r><w:rPr><w:rFonts w:ascii="Bookman Old Style" w:hAnsi="Bookman Old Style"/><w:sz w:val="24"/><w:szCs w:val="24"/></w:rPr><w:t xml:space="preserve">bulan </w:t></w:r><w:r><w:rPr><w:rFonts w:ascii="Bookman Old Style" w:hAnsi="Bookman Old Style" w:cs="Arial"/><w:noProof/><w:sz w:val="24"/><w:szCs w:val="24"/></w:rPr><w:t>&lt;&lt;BULAN_TERBILANG&gt;&gt;</w:t></w:r><w:r><w:rPr><w:rFonts w:ascii="Bookman Old Style" w:hAnsi="Bookman Old Style" w:cs="Arial"/><w:noProof/><w:sz w:val="24"/><w:szCs w:val="24"/></w:rPr><w:t xml:space="preserve"> </w:t></w:r><w:r><w:rPr><w:rFonts w:ascii="Bookman Old Style" w:hAnsi="Bookman Old Style"/><w:sz w:val="24"/><w:szCs w:val="24"/></w:rPr><w:t xml:space="preserve">tahun </w:t></w:r><w:r><w:rPr><w:rFonts w:ascii="Bookman Old Style" w:hAnsi="Bookman Old Style" w:cs="Arial"/><w:sz w:val="24"/><w:szCs w:val="24"/></w:rPr><w:t>&lt;&lt;TAHUN_TERBILANG&gt;&gt;</w:t></w:r><w:r><w:rPr><w:rFonts w:ascii="Bookman Old Style" w:hAnsi="Bookman Old Style"/><w:sz w:val="24"/><w:szCs w:val="24"/></w:rPr><w:t xml:space="preserve"> </w:t></w:r><w:r><w:rPr><w:rFonts w:ascii="Bookman Old Style" w:hAnsi="Bookman Old Style" w:cs="Arial"/><w:noProof/><w:sz w:val="24"/><w:szCs w:val="24"/></w:rPr><w:t>(<w:t>&lt;&lt;TANGGAL_BAST&gt;&gt;</w:t>)</w:t></w:r><w:r><w:rPr><w:rFonts w:ascii="Bookman Old Style" w:hAnsi="Bookman Old Style"/><w:sz w:val="24"/><w:szCs w:val="24"/></w:rPr><w:t xml:space="preserve">. bertempat di </w:t></w:r><w:r><w:rPr><w:rFonts w:ascii="Bookman Old Style" w:hAnsi="Bookman Old Style"/><w:noProof/><w:sz w:val="24"/><w:szCs w:val="24"/></w:rPr><w:t>Kantor BPS Kota Subulussalam</w:t></w:r><w:r><w:rPr><w:rFonts w:ascii="Bookman Old Style" w:hAnsi="Bookman Old Style"/><w:sz w:val="24"/><w:szCs w:val="24"/></w:rPr><w:t xml:space="preserve"> yang bertanda tangan di bawah ini:</w:t></w:r></w:p><w:p><w:pPr><w:jc w:val="both"/><w:rPr><w:rFonts w:ascii="Bookman Old Style" w:hAnsi="Bookman Old Style"/><w:sz w:val="24"/><w:szCs w:val="24"/></w:rPr></w:pPr></w:p><w:tbl><w:tblPr><w:tblStyle w:val="TableGrid"/><w:tblW w:w="0" w:type="auto"/><w:tblBorders><w:top w:val="none" w:sz="0" w:space="0" w:color="auto"/><w:left w:val="none" w:sz="0" w:space="0" w:color="auto"/><w:bottom w:val="none" w:sz="0" w:space="0" w:color="auto"/><w:right w:val="none" w:sz="0" w:space="0" w:color="auto"/><w:insideH w:val="none" w:sz="0" w:space="0" w:color="auto"/><w:insideV w:val="none" w:sz="0" w:space="0" w:color="auto"/></w:tblBorders><w:tblLook w:val="04A0" w:firstRow="1" w:lastRow="0" w:firstColumn="1" w:lastColumn="0" w:noHBand="0" w:noVBand="1"/></w:tblPr><w:tblGrid><w:gridCol w:w="3256"/><w:gridCol w:w="293"/><w:gridCol w:w="5944"/></w:tblGrid><w:tr><w:tc><w:tcPr><w:tcW w:w="3256" w:type="dxa"/></w:tcPr><w:p><w:pPr><w:pStyle w:val="ListParagraph"/><w:numPr><w:ilvl w:val="0"/><w:numId w:val="45"/></w:numPr><w:ind w:left="313"/><w:jc w:val="both"/><w:rPr><w:rFonts w:ascii="Bookman Old Style" w:hAnsi="Bookman Old Style"/><w:sz w:val="24"/><w:szCs w:val="24"/></w:rPr></w:pPr><w:r><w:rPr><w:rFonts w:ascii="Bookman Old Style" w:hAnsi="Bookman Old Style" w:cs="Times New Roman"/><w:color w:val="000000" w:themeColor="text1"/><w:sz w:val="24"/><w:szCs w:val="24"/></w:rPr><w:t>&lt;&lt;NAMA_PPK&gt;&gt;</w:t></w:r></w:p><w:p><w:pPr><w:jc w:val="both"/><w:rPr><w:rFonts w:ascii="Bookman Old Style" w:hAnsi="Bookman Old Style"/><w:sz w:val="24"/><w:szCs w:val="24"/></w:rPr></w:pPr></w:p><w:p><w:pPr><w:jc w:val="both"/><w:rPr><w:rFonts w:ascii="Bookman Old Style" w:hAnsi="Bookman Old Style"/><w:sz w:val="24"/><w:szCs w:val="24"/></w:rPr></w:pPr></w:p><w:p><w:pPr><w:jc w:val="both"/><w:rPr><w:rFonts w:ascii="Bookman Old Style" w:hAnsi="Bookman Old Style"/><w:sz w:val="24"/><w:szCs w:val="24"/></w:rPr></w:pPr></w:p><w:p><w:pPr><w:jc w:val="both"/><w:rPr><w:rFonts w:ascii="Bookman Old Style" w:hAnsi="Bookman Old Style"/><w:sz w:val="24"/><w:szCs w:val="24"/></w:rPr></w:pPr></w:p><w:p><w:pPr><w:jc w:val="both"/><w:rPr><w:rFonts w:ascii="Bookman Old Style" w:hAnsi="Bookman Old Style"/><w:sz w:val="24"/><w:szCs w:val="24"/></w:rPr></w:pPr></w:p><w:p><w:pPr><w:jc w:val="both"/><w:rPr><w:rFonts w:ascii="Bookman Old Style" w:hAnsi="Bookman Old Style"/><w:sz w:val="24"/><w:szCs w:val="24"/></w:rPr></w:pPr></w:p><w:p><w:pPr><w:pStyle w:val="ListParagraph"/><w:numPr><w:ilvl w:val="0"/><w:numId w:val="45"/></w:numPr><w:ind w:left="318"/><w:jc w:val="both"/><w:rPr><w:rFonts w:ascii="Bookman Old Style" w:hAnsi="Bookman Old Style"/><w:sz w:val="24"/><w:szCs w:val="24"/></w:rPr></w:pPr><w:r><w:rPr><w:rFonts w:ascii="Bookman Old Style" w:hAnsi="Bookman Old Style"/><w:sz w:val="24"/><w:szCs w:val="24"/></w:rPr><w:t>&lt;&lt;NAMA_PETUGAS&gt;&gt;</w:t></w:r></w:p></w:tc><w:tc><w:tcPr><w:tcW w:w="293" w:type="dxa"/></w:tcPr><w:p><w:pPr><w:jc w:val="both"/><w:rPr><w:rFonts w:ascii="Bookman Old Style" w:hAnsi="Bookman Old Style"/><w:sz w:val="24"/><w:szCs w:val="24"/></w:rPr></w:pPr><w:r><w:rPr><w:rFonts w:ascii="Bookman Old Style" w:hAnsi="Bookman Old Style"/><w:sz w:val="24"/><w:szCs w:val="24"/></w:rPr><w:t>:</w:t></w:r></w:p><w:p><w:pPr><w:jc w:val="both"/><w:rPr><w:rFonts w:ascii="Bookman Old Style" w:hAnsi="Bookman Old Style"/><w:sz w:val="24"/><w:szCs w:val="24"/></w:rPr></w:pPr></w:p><w:p><w:pPr><w:jc w:val="both"/><w:rPr><w:rFonts w:ascii="Bookman Old Style" w:hAnsi="Bookman Old Style"/><w:sz w:val="24"/><w:szCs w:val="24"/></w:rPr></w:pPr></w:p><w:p><w:pPr><w:jc w:val="both"/><w:rPr><w:rFonts w:ascii="Bookman Old Style" w:hAnsi="Bookman Old Style"/><w:sz w:val="24"/><w:szCs w:val="24"/></w:rPr></w:pPr></w:p><w:p><w:pPr><w:jc w:val="both"/><w:rPr><w:rFonts w:ascii="Bookman Old Style" w:hAnsi="Bookman Old Style"/><w:sz w:val="24"/><w:szCs w:val="24"/></w:rPr></w:pPr></w:p><w:p><w:pPr><w:jc w:val="both"/><w:rPr><w:rFonts w:ascii="Bookman Old Style" w:hAnsi="Bookman Old Style"/><w:sz w:val="24"/><w:szCs w:val="24"/></w:rPr></w:pPr></w:p><w:p><w:pPr><w:jc w:val="both"/><w:rPr><w:rFonts w:ascii="Bookman Old Style" w:hAnsi="Bookman Old Style"/><w:sz w:val="24"/><w:szCs w:val="24"/></w:rPr></w:pPr></w:p><w:p><w:pPr><w:jc w:val="both"/><w:rPr><w:rFonts w:ascii="Bookman Old Style" w:hAnsi="Bookman Old Style"/><w:sz w:val="24"/><w:szCs w:val="24"/></w:rPr></w:pPr><w:r><w:rPr><w:rFonts w:ascii="Bookman Old Style" w:hAnsi="Bookman Old Style"/><w:sz w:val="24"/><w:szCs w:val="24"/></w:rPr><w:t>:</w:t></w:r></w:p></w:tc><w:tc><w:tcPr><w:tcW w:w="5944" w:type="dxa"/></w:tcPr><w:p><w:pPr><w:jc w:val="both"/><w:rPr><w:rFonts w:ascii="Bookman Old Style" w:hAnsi="Bookman Old Style"/><w:sz w:val="24"/><w:szCs w:val="24"/></w:rPr></w:pPr><w:r><w:rPr><w:rFonts w:ascii="Bookman Old Style" w:hAnsi="Bookman Old Style"/><w:sz w:val="24"/><w:szCs w:val="24"/></w:rPr><w:t xml:space="preserve">Pejabat Pembuat Komitmen Badan Pusat Statistik </w:t></w:r><w:r><w:rPr><w:rFonts w:ascii="Bookman Old Style" w:hAnsi="Bookman Old Style"/><w:sz w:val="24"/><w:szCs w:val="24"/><w:lang w:val="en-ID"/></w:rPr><w:t>BPS Kota Subulussalam</w:t></w:r><w:r><w:rPr><w:rFonts w:ascii="Bookman Old Style" w:hAnsi="Bookman Old Style"/><w:sz w:val="24"/><w:szCs w:val="24"/></w:rPr><w:t xml:space="preserve"> alamat Jl. Raja Tua Lae Oram </w:t></w:r><w:r><w:rPr><w:rFonts w:ascii="Bookman Old Style" w:hAnsi="Bookman Old Style"/><w:sz w:val="24"/><w:szCs w:val="24"/><w:lang w:val="en-ID"/></w:rPr><w:t>Komplek Perkantoran Walikota Subulussalam</w:t></w:r><w:r><w:rPr><w:rFonts w:ascii="Bookman Old Style" w:hAnsi="Bookman Old Style"/><w:sz w:val="24"/><w:szCs w:val="24"/></w:rPr><w:t xml:space="preserve"> bertindak untuk dan atas nama Badan Pusat Statistik </w:t></w:r><w:r><w:rPr><w:rFonts w:ascii="Bookman Old Style" w:hAnsi="Bookman Old Style"/><w:sz w:val="24"/><w:szCs w:val="24"/><w:lang w:val="en-ID"/></w:rPr><w:t>BPS Kota Subulussalam</w:t></w:r><w:r><w:rPr><w:rFonts w:ascii="Bookman Old Style" w:hAnsi="Bookman Old Style"/><w:sz w:val="24"/><w:szCs w:val="24"/></w:rPr><w:t xml:space="preserve"> selanjutnya disebut </w:t></w:r><w:r><w:rPr><w:rFonts w:ascii="Bookman Old Style" w:hAnsi="Bookman Old Style"/><w:b/><w:sz w:val="24"/><w:szCs w:val="24"/></w:rPr><w:t>PIHAK PERTAMA</w:t></w:r><w:r><w:rPr><w:rFonts w:ascii="Bookman Old Style" w:hAnsi="Bookman Old Style"/><w:sz w:val="24"/><w:szCs w:val="24"/></w:rPr><w:t>.</w:t></w:r></w:p><w:p><w:pPr><w:jc w:val="both"/><w:rPr><w:rFonts w:ascii="Bookman Old Style" w:hAnsi="Bookman Old Style"/><w:sz w:val="24"/><w:szCs w:val="24"/></w:rPr></w:pPr></w:p><w:p><w:pPr><w:tabs><w:tab w:val="left" w:pos="7830"/></w:tabs><w:ind w:right="34"/><w:jc w:val="both"/><w:rPr><w:rFonts w:ascii="Bookman Old Style" w:hAnsi="Bookman Old Style"/><w:sz w:val="24"/><w:szCs w:val="24"/></w:rPr></w:pPr><w:r><w:rPr><w:rFonts w:ascii="Bookman Old Style" w:hAnsi="Bookman Old Style"/><w:sz w:val="24"/><w:szCs w:val="24"/></w:rPr><w:t xml:space="preserve"><w:t>&lt;&lt;JABATAN_PETUGAS&gt;&gt;</w:t> </w:t></w:r><w:r><w:rPr><w:rFonts w:ascii="Bookman Old Style" w:hAnsi="Bookman Old Style" w:cs="Times New Roman"/><w:color w:val="000000" w:themeColor="text1"/><w:sz w:val="24"/><w:szCs w:val="24"/></w:rPr><w:t xml:space="preserve"><w:t>&lt;&lt;URAIAN_PEKERJAAN&gt;&gt;</w:t>; </w:t></w:r><w:r><w:rPr><w:rFonts w:ascii="Bookman Old Style" w:hAnsi="Bookman Old Style"/><w:sz w:val="24"/><w:szCs w:val="24"/></w:rPr><w:t xml:space="preserve">beralamat </w:t></w:r><w:r><w:rPr><w:rFonts w:ascii="Bookman Old Style" w:hAnsi="Bookman Old Style"/><w:sz w:val="24"/><w:szCs w:val="24"/></w:rPr><w:t>&lt;&lt;ASAL&gt;&gt;</w:t>.</w:t></w:r><w:r><w:rPr><w:rFonts w:ascii="Bookman Old Style" w:hAnsi="Bookman Old Style"/><w:sz w:val="24"/><w:szCs w:val="24"/></w:rPr><w:t xml:space="preserve"> Bertindak untuk dan atas nama diri sendiri. selanjutnya disebut </w:t></w:r><w:r><w:rPr><w:rFonts w:ascii="Bookman Old Style" w:hAnsi="Bookman Old Style"/><w:b/><w:sz w:val="24"/><w:szCs w:val="24"/></w:rPr><w:t>PIHAK</w:t></w:r><w:r><w:rPr><w:rFonts w:ascii="Bookman Old Style" w:hAnsi="Bookman Old Style"/><w:b/><w:sz w:val="24"/><w:szCs w:val="24"/></w:rPr><w:t xml:space="preserve"> </w:t></w:r><w:r><w:rPr><w:rFonts w:ascii="Bookman Old Style" w:hAnsi="Bookman Old Style"/><w:b/><w:sz w:val="24"/><w:szCs w:val="24"/></w:rPr><w:t>KEDUA</w:t></w:r><w:r><w:rPr><w:rFonts w:ascii="Bookman Old Style" w:hAnsi="Bookman Old Style"/><w:sz w:val="24"/><w:szCs w:val="24"/></w:rPr><w:t>.</w:t></w:r></w:p></w:tc></w:tr></w:tbl><w:p><w:pPr><w:jc w:val="both"/><w:rPr><w:rFonts w:ascii="Bookman Old Style" w:hAnsi="Bookman Old Style"/><w:sz w:val="24"/><w:szCs w:val="24"/></w:rPr></w:pPr></w:p><w:p><w:pPr><w:jc w:val="both"/><w:rPr><w:rFonts w:ascii="Bookman Old Style" w:hAnsi="Bookman Old Style"/><w:sz w:val="24"/><w:szCs w:val="24"/></w:rPr></w:pPr></w:p><w:p><w:pPr><w:tabs><w:tab w:val="left" w:pos="7830"/></w:tabs><w:ind w:right="34"/><w:jc w:val="both"/><w:rPr><w:rFonts w:ascii="Bookman Old Style" w:hAnsi="Bookman Old Style"/><w:b/><w:sz w:val="24"/><w:szCs w:val="24"/></w:rPr></w:pPr><w:r><w:rPr><w:rFonts w:ascii="Bookman Old Style" w:hAnsi="Bookman Old Style"/><w:sz w:val="24"/><w:szCs w:val="24"/></w:rPr><w:t xml:space="preserve">bahwa </w:t></w:r><w:r><w:rPr><w:rFonts w:ascii="Bookman Old Style" w:hAnsi="Bookman Old Style"/><w:b/><w:sz w:val="24"/><w:szCs w:val="24"/></w:rPr><w:t>PIHAK PERTAMA</w:t></w:r><w:r><w:rPr><w:rFonts w:ascii="Bookman Old Style" w:hAnsi="Bookman Old Style"/><w:sz w:val="24"/><w:szCs w:val="24"/></w:rPr><w:t xml:space="preserve"> dan </w:t></w:r><w:r><w:rPr><w:rFonts w:ascii="Bookman Old Style" w:hAnsi="Bookman Old Style"/><w:b/><w:sz w:val="24"/><w:szCs w:val="24"/></w:rPr><w:t>PIHAK KEDUA</w:t></w:r><w:r><w:rPr><w:rFonts w:ascii="Bookman Old Style" w:hAnsi="Bookman Old Style"/><w:sz w:val="24"/><w:szCs w:val="24"/></w:rPr><w:t xml:space="preserve"> yang secara bersama-sama disebut </w:t></w:r><w:r><w:rPr><w:rFonts w:ascii="Bookman Old Style" w:hAnsi="Bookman Old Style"/><w:b/><w:sz w:val="24"/><w:szCs w:val="24"/></w:rPr><w:t>PARA PIHAK</w:t></w:r><w:r><w:rPr><w:rFonts w:ascii="Bookman Old Style" w:hAnsi="Bookman Old Style"/><w:sz w:val="24"/><w:szCs w:val="24"/></w:rPr><w:t xml:space="preserve">. sepakat untuk mengikatkan diri dalam Perjanjian Kerja </w:t></w:r><w:r><w:rPr><w:rFonts w:ascii="Bookman Old Style" w:hAnsi="Bookman Old Style"/><w:sz w:val="24"/><w:szCs w:val="24"/></w:rPr><w:t>&lt;&lt;JABATAN_PIHAK_KEDUA&gt;&gt;</w:t></w:r><w:r><w:rPr><w:rFonts w:ascii="Bookman Old Style" w:hAnsi="Bookman Old Style"/><w:sz w:val="24"/><w:szCs w:val="24"/></w:rPr><w:t xml:space="preserve"> Kegiatan </w:t></w:r><w:r><w:rPr><w:rFonts w:ascii="Arial" w:hAnsi="Arial" w:cs="Arial"/><w:noProof/></w:rPr><w:t>&lt;&lt;URAIAN_PEKERJAAN&gt;&gt;</w:t></w:r><w:r><w:rPr><w:rFonts w:ascii="Arial" w:hAnsi="Arial" w:cs="Arial"/></w:rPr><w:t xml:space="preserve"> </w:t></w:r><w:r><w:rPr><w:rFonts w:ascii="Bookman Old Style" w:hAnsi="Bookman Old Style"/><w:sz w:val="24"/><w:szCs w:val="24"/><w:lang w:val="en-ID"/></w:rPr><w:t xml:space="preserve">di Badan Pusat Statistik Kota Subulussalam </w:t></w:r><w:r><w:rPr><w:rFonts w:ascii="Bookman Old Style" w:hAnsi="Bookman Old Style"/><w:sz w:val="24"/><w:szCs w:val="24"/></w:rPr><w:t>yang selanjutnya disebut Perjanjian. dengan ketentuan-ketentuan sebagai berikut:</w:t></w:r></w:p><w:p><w:pPr><w:jc w:val="both"/><w:rPr><w:rFonts w:ascii="Bookman Old Style" w:hAnsi="Bookman Old Style"/><w:sz w:val="24"/><w:szCs w:val="24"/></w:rPr></w:pPr></w:p><w:p><w:pPr><w:spacing w:after="120"/><w:jc w:val="center"/><w:rPr><w:rFonts w:ascii="Bookman Old Style" w:hAnsi="Bookman Old Style"/><w:b/><w:sz w:val="24"/><w:szCs w:val="24"/></w:rPr></w:pPr><w:r><w:rPr><w:rFonts w:ascii="Bookman Old Style" w:hAnsi="Bookman Old Style"/><w:b/><w:sz w:val="24"/><w:szCs w:val="24"/></w:rPr><w:t>Pasal 1</w:t></w:r></w:p><w:p><w:pPr><w:jc w:val="both"/><w:rPr><w:rFonts w:ascii="Bookman Old Style" w:hAnsi="Bookman Old Style"/><w:sz w:val="24"/><w:szCs w:val="24"/></w:rPr></w:pPr><w:r><w:rPr><w:rFonts w:ascii="Bookman Old Style" w:hAnsi="Bookman Old Style"/><w:b/><w:sz w:val="24"/><w:szCs w:val="24"/></w:rPr><w:t>PIHAK PERTAMA</w:t></w:r><w:r><w:rPr><w:rFonts w:ascii="Bookman Old Style" w:hAnsi="Bookman Old Style"/><w:sz w:val="24"/><w:szCs w:val="24"/></w:rPr><w:t xml:space="preserve"> memberikan pekerjaan kepada </w:t></w:r><w:r><w:rPr><w:rFonts w:ascii="Bookman Old Style" w:hAnsi="Bookman Old Style"/><w:b/><w:sz w:val="24"/><w:szCs w:val="24"/></w:rPr><w:t>PIHAK KEDUA</w:t></w:r><w:r><w:rPr><w:rFonts w:ascii="Bookman Old Style" w:hAnsi="Bookman Old Style"/><w:sz w:val="24"/><w:szCs w:val="24"/></w:rPr><w:t xml:space="preserve"> dan </w:t></w:r><w:r><w:rPr><w:rFonts w:ascii="Bookman Old Style" w:hAnsi="Bookman Old Style"/><w:b/><w:sz w:val="24"/><w:szCs w:val="24"/></w:rPr><w:t>PIHAK KEDUA</w:t></w:r><w:r><w:rPr><w:rFonts w:ascii="Bookman Old Style" w:hAnsi="Bookman Old Style"/><w:sz w:val="24"/><w:szCs w:val="24"/></w:rPr><w:t xml:space="preserve"> menerima pekerjaan dari </w:t></w:r><w:r><w:rPr><w:rFonts w:ascii="Bookman Old Style" w:hAnsi="Bookman Old Style"/><w:b/><w:sz w:val="24"/><w:szCs w:val="24"/></w:rPr><w:t>PIHAK PERTAMA</w:t></w:r><w:r><w:rPr><w:rFonts w:ascii="Bookman Old Style" w:hAnsi="Bookman Old Style"/><w:sz w:val="24"/><w:szCs w:val="24"/></w:rPr><w:t xml:space="preserve"> sebagai </w:t></w:r><w:r><w:rPr><w:rFonts w:ascii="Bookman Old Style" w:hAnsi="Bookman Old Style"/><w:sz w:val="24"/><w:szCs w:val="24"/></w:rPr><w:t>Petugas</w:t></w:r><w:r><w:rPr><w:rFonts w:ascii="Bookman Old Style" w:hAnsi="Bookman Old Style"/><w:sz w:val="24"/><w:szCs w:val="24"/></w:rPr><w:t xml:space="preserve"> </w:t></w:r><w:r><w:rPr><w:rFonts w:ascii="Arial" w:hAnsi="Arial" w:cs="Arial"/><w:noProof/></w:rPr><w:t>&lt;&lt;URAIAN_PEKERJAAN&gt;&gt;</w:t></w:r><w:r><w:rPr><w:rFonts w:ascii="Arial" w:hAnsi="Arial" w:cs="Arial"/></w:rPr><w:t xml:space="preserve"> </w:t></w:r><w:r><w:rPr><w:rFonts w:ascii="Bookman Old Style" w:hAnsi="Bookman Old Style"/><w:sz w:val="24"/><w:szCs w:val="24"/></w:rPr><w:t xml:space="preserve"> </w:t></w:r><w:r><w:rPr><w:rFonts w:ascii="Bookman Old Style" w:hAnsi="Bookman Old Style"/><w:sz w:val="24"/><w:szCs w:val="24"/></w:rPr><w:t xml:space="preserve">dengan lingkup pekerjaan yang ditetapkan oleh </w:t></w:r><w:r><w:rPr><w:rFonts w:ascii="Bookman Old Style" w:hAnsi="Bookman Old Style"/><w:b/><w:sz w:val="24"/><w:szCs w:val="24"/></w:rPr><w:t>PIHAK PERTAMA</w:t></w:r><w:r><w:rPr><w:rFonts w:ascii="Bookman Old Style" w:hAnsi="Bookman Old Style"/><w:sz w:val="24"/><w:szCs w:val="24"/></w:rPr><w:t>.</w:t></w:r></w:p><w:p><w:pPr><w:jc w:val="center"/><w:rPr><w:rFonts w:ascii="Bookman Old Style" w:hAnsi="Bookman Old Style"/><w:b/><w:sz w:val="24"/><w:szCs w:val="24"/></w:rPr></w:pPr></w:p><w:p><w:pPr><w:spacing w:after="120"/><w:jc w:val="center"/><w:rPr><w:rFonts w:ascii="Bookman Old Style" w:hAnsi="Bookman Old Style"/><w:b/><w:sz w:val="24"/><w:szCs w:val="24"/></w:rPr></w:pPr><w:r><w:rPr><w:rFonts w:ascii="Bookman Old Style" w:hAnsi="Bookman Old Style"/><w:b/><w:sz w:val="24"/><w:szCs w:val="24"/></w:rPr><w:t>Pasal 2</w:t></w:r></w:p><w:p><w:pPr><w:jc w:val="both"/><w:rPr><w:rFonts w:ascii="Bookman Old Style" w:hAnsi="Bookman Old Style"/><w:strike/><w:color w:val="FF0000"/><w:sz w:val="24"/><w:szCs w:val="24"/></w:rPr></w:pPr><w:r><w:rPr><w:rFonts w:ascii="Bookman Old Style" w:hAnsi="Bookman Old Style"/><w:sz w:val="24"/><w:szCs w:val="24"/></w:rPr><w:t xml:space="preserve">Ruang lingkup pekerjaan dalam Perjanjian ini mengacu pada wilayah kerja. </w:t></w:r><w:r><w:rPr><w:rFonts w:ascii="Bookman Old Style" w:hAnsi="Bookman Old Style"/><w:sz w:val="24"/><w:szCs w:val="24"/></w:rPr><w:t>&lt;&lt;BUKU_PEDOMAN&gt;&gt;</w:t></w:r><w:r><w:rPr><w:rFonts w:ascii="Bookman Old Style" w:hAnsi="Bookman Old Style"/><w:sz w:val="24"/><w:szCs w:val="24"/></w:rPr><w:t xml:space="preserve"> </w:t></w:r><w:r><w:rPr><w:rFonts w:ascii="Bookman Old Style" w:hAnsi="Bookman Old Style"/><w:color w:val="000000"/><w:sz w:val="24"/><w:szCs w:val="24"/><w:lang w:val="en-ID"/></w:rPr><w:t xml:space="preserve">dan </w:t></w:r><w:r><w:rPr><w:rFonts w:ascii="Bookman Old Style" w:hAnsi="Bookman Old Style"/><w:sz w:val="24"/><w:szCs w:val="24"/></w:rPr><w:t xml:space="preserve">ketentuan-ketentuan yang ditetapkan oleh </w:t></w:r><w:r><w:rPr><w:rFonts w:ascii="Bookman Old Style" w:hAnsi="Bookman Old Style"/><w:b/><w:sz w:val="24"/><w:szCs w:val="24"/></w:rPr><w:t>PIHAK PERTAMA</w:t></w:r><w:r><w:rPr><w:rFonts w:ascii="Bookman Old Style" w:hAnsi="Bookman Old Style"/><w:sz w:val="24"/><w:szCs w:val="24"/></w:rPr><w:t>.</w:t></w:r><w:r><w:rPr><w:rFonts w:ascii="Bookman Old Style" w:hAnsi="Bookman Old Style"/><w:strike/><w:color w:val="FF0000"/><w:sz w:val="24"/><w:szCs w:val="24"/></w:rPr><w:t xml:space="preserve"> </w:t></w:r></w:p><w:p><w:pPr><w:jc w:val="both"/><w:rPr><w:rFonts w:ascii="Bookman Old Style" w:hAnsi="Bookman Old Style"/><w:sz w:val="24"/><w:szCs w:val="24"/></w:rPr></w:pPr></w:p><w:p><w:pPr><w:spacing w:after="120"/><w:jc w:val="center"/><w:rPr><w:rFonts w:ascii="Bookman Old Style" w:hAnsi="Bookman Old Style"/><w:b/><w:sz w:val="24"/><w:szCs w:val="24"/></w:rPr></w:pPr><w:r><w:rPr><w:rFonts w:ascii="Bookman Old Style" w:hAnsi="Bookman Old Style"/><w:b/><w:sz w:val="24"/><w:szCs w:val="24"/></w:rPr><w:t>Pasal 3</w:t></w:r></w:p><w:p><w:pPr><w:jc w:val="both"/><w:rPr><w:rFonts w:ascii="Bookman Old Style" w:hAnsi="Bookman Old Style"/><w:color w:val="000000"/><w:sz w:val="24"/><w:szCs w:val="24"/></w:rPr></w:pPr><w:r><w:rPr><w:rFonts w:ascii="Bookman Old Style" w:hAnsi="Bookman Old Style"/><w:sz w:val="24"/><w:szCs w:val="24"/></w:rPr><w:lastRenderedPageBreak/><w:t xml:space="preserve">Jangka Waktu Perjanjian terhitung sejak </w:t></w:r><w:r><w:rPr><w:rFonts w:ascii="Bookman Old Style" w:hAnsi="Bookman Old Style"/><w:sz w:val="24"/><w:szCs w:val="24"/></w:rPr><w:t>ditandatangani</w:t></w:r><w:r><w:rPr><w:rFonts w:ascii="Bookman Old Style" w:hAnsi="Bookman Old Style"/><w:sz w:val="24"/><w:szCs w:val="24"/></w:rPr><w:t xml:space="preserve"> </w:t></w:r><w:r><w:rPr><w:rFonts w:ascii="Bookman Old Style" w:hAnsi="Bookman Old Style"/><w:sz w:val="24"/><w:szCs w:val="24"/></w:rPr><w:t xml:space="preserve">sampai dengan tanggal </w:t></w:r><w:r><w:rPr><w:rFonts w:ascii="Bookman Old Style" w:hAnsi="Bookman Old Style"/><w:sz w:val="24"/><w:szCs w:val="24"/></w:rPr><w:t>&lt;&lt;TANGGAL_SELESAI&gt;&gt;</w:t>.</w:t></w:r></w:p><w:p><w:pPr><w:tabs><w:tab w:val="left" w:pos="2964"/></w:tabs><w:rPr><w:rFonts w:ascii="Bookman Old Style" w:hAnsi="Bookman Old Style"/><w:sz w:val="24"/><w:szCs w:val="24"/></w:rPr></w:pPr></w:p><w:p><w:pPr><w:spacing w:after="120"/><w:jc w:val="center"/><w:rPr><w:rFonts w:ascii="Bookman Old Style" w:hAnsi="Bookman Old Style"/><w:b/><w:sz w:val="24"/><w:szCs w:val="24"/></w:rPr></w:pPr><w:r><w:rPr><w:rFonts w:ascii="Bookman Old Style" w:hAnsi="Bookman Old Style"/><w:b/><w:sz w:val="24"/><w:szCs w:val="24"/></w:rPr><w:t>Pasal 4</w:t></w:r></w:p><w:p><w:pPr><w:jc w:val="both"/><w:rPr><w:rFonts w:ascii="Bookman Old Style" w:hAnsi="Bookman Old Style"/><w:sz w:val="24"/><w:szCs w:val="24"/></w:rPr></w:pPr><w:r><w:rPr><w:rFonts w:ascii="Bookman Old Style" w:hAnsi="Bookman Old Style"/><w:b/><w:sz w:val="24"/><w:szCs w:val="24"/></w:rPr><w:t>PIHAK KEDUA</w:t></w:r><w:r><w:rPr><w:rFonts w:ascii="Bookman Old Style" w:hAnsi="Bookman Old Style"/><w:sz w:val="24"/><w:szCs w:val="24"/></w:rPr><w:t xml:space="preserve"> berkewajiban melaksanakan seluruh pekerjaan yang diberikan oleh </w:t></w:r><w:r><w:rPr><w:rFonts w:ascii="Bookman Old Style" w:hAnsi="Bookman Old Style"/><w:b/><w:sz w:val="24"/><w:szCs w:val="24"/></w:rPr><w:t>PIHAK PERTAMA</w:t></w:r><w:r><w:rPr><w:rFonts w:ascii="Bookman Old Style" w:hAnsi="Bookman Old Style"/><w:sz w:val="24"/><w:szCs w:val="24"/></w:rPr><w:t xml:space="preserve"> sampai selesai. sesuai ruang lingkup pekerjaan sebagaimana dimaksud dalam Pasal 2.</w:t></w:r></w:p><w:p><w:pPr><w:jc w:val="both"/><w:rPr><w:rFonts w:ascii="Bookman Old Style" w:hAnsi="Bookman Old Style"/><w:sz w:val="24"/><w:szCs w:val="24"/></w:rPr></w:pPr></w:p><w:p><w:pPr><w:spacing w:after="120"/><w:jc w:val="center"/><w:rPr><w:rFonts w:ascii="Bookman Old Style" w:hAnsi="Bookman Old Style"/><w:b/><w:sz w:val="24"/><w:szCs w:val="24"/></w:rPr></w:pPr><w:r><w:rPr><w:rFonts w:ascii="Bookman Old Style" w:hAnsi="Bookman Old Style"/><w:b/><w:sz w:val="24"/><w:szCs w:val="24"/></w:rPr><w:t>Pasal 5</w:t></w:r></w:p><w:p><w:pPr><w:pStyle w:val="ListParagraph"/><w:numPr><w:ilvl w:val="0"/><w:numId w:val="40"/></w:numPr><w:tabs><w:tab w:val="left" w:pos="540"/></w:tabs><w:ind w:left="547" w:hanging="547"/><w:contextualSpacing w:val="0"/><w:jc w:val="both"/><w:rPr><w:rFonts w:ascii="Bookman Old Style" w:hAnsi="Bookman Old Style"/><w:color w:val="000000"/><w:sz w:val="24"/><w:szCs w:val="24"/></w:rPr></w:pPr><w:r><w:rPr><w:rFonts w:ascii="Bookman Old Style" w:hAnsi="Bookman Old Style"/><w:b/><w:sz w:val="24"/><w:szCs w:val="24"/></w:rPr><w:t>PIHAK KEDUA</w:t></w:r><w:r><w:rPr><w:rFonts w:ascii="Bookman Old Style" w:hAnsi="Bookman Old Style"/><w:sz w:val="24"/><w:szCs w:val="24"/></w:rPr><w:t xml:space="preserve"> berhak untuk mendapatkan honorarium petugas dari </w:t></w:r><w:r><w:rPr><w:rFonts w:ascii="Bookman Old Style" w:hAnsi="Bookman Old Style"/><w:b/><w:sz w:val="24"/><w:szCs w:val="24"/></w:rPr><w:t xml:space="preserve">PIHAK PERTAMA </w:t></w:r><w:r><w:rPr><w:rFonts w:ascii="Bookman Old Style" w:hAnsi="Bookman Old Style"/><w:sz w:val="24"/><w:szCs w:val="24"/></w:rPr><w:t xml:space="preserve">sebesar </w:t></w:r><w:r><w:rPr><w:rFonts w:ascii="Bookman Old Style" w:hAnsi="Bookman Old Style"/><w:spacing w:val="-2"/><w:w w:val="105"/><w:sz w:val="24"/><w:szCs w:val="24"/></w:rPr><w:t xml:space="preserve">Rp. </w:t></w:r><w:r><w:rPr><w:rFonts w:ascii="Bookman Old Style" w:hAnsi="Bookman Old Style"/><w:color w:val="000000" w:themeColor="text1"/><w:spacing w:val="-2"/><w:w w:val="105"/><w:sz w:val="24"/><w:szCs w:val="24"/></w:rPr><w:t>&lt;&lt;TOTAL_HONOR&gt;&gt;</w:t></w:r><w:r><w:rPr><w:rFonts w:ascii="Bookman Old Style" w:hAnsi="Bookman Old Style"/><w:color w:val="000000" w:themeColor="text1"/><w:spacing w:val="-2"/><w:w w:val="105"/><w:sz w:val="24"/><w:szCs w:val="24"/></w:rPr><w:t>,-</w:t></w:r><w:r><w:rPr><w:rFonts w:ascii="Bookman Old Style" w:hAnsi="Bookman Old Style"/><w:color w:val="000000" w:themeColor="text1"/><w:sz w:val="24"/><w:szCs w:val="24"/></w:rPr><w:t xml:space="preserve"> </w:t></w:r><w:r><w:rPr><w:rFonts w:ascii="Bookman Old Style" w:hAnsi="Bookman Old Style"/><w:color w:val="000000" w:themeColor="text1"/><w:sz w:val="24"/><w:szCs w:val="24"/></w:rPr><w:t>(</w:t></w:r><w:r><w:rPr><w:rFonts w:ascii="Bookman Old Style" w:hAnsi="Bookman Old Style"/><w:spacing w:val="-7"/><w:w w:val="105"/><w:sz w:val="24"/><w:szCs w:val="24"/></w:rPr><w:t>&lt;&lt;TERBILANG_TOTAL_HONOR&gt;&gt;</w:t></w:r><w:r><w:rPr><w:rFonts w:ascii="Bookman Old Style" w:hAnsi="Bookman Old Style"/><w:sz w:val="24"/><w:szCs w:val="24"/></w:rPr><w:t>).</w:t></w:r><w:r><w:rPr><w:rFonts w:ascii="Bookman Old Style" w:hAnsi="Bookman Old Style"/><w:sz w:val="24"/><w:szCs w:val="24"/></w:rPr><w:t xml:space="preserve"> </w:t></w:r><w:r><w:rPr><w:rFonts w:ascii="Bookman Old Style" w:hAnsi="Bookman Old Style"/><w:sz w:val="24"/><w:szCs w:val="24"/></w:rPr><w:t xml:space="preserve">yang dibayarkan </w:t></w:r><w:r><w:rPr><w:rFonts w:ascii="Bookman Old Style" w:hAnsi="Bookman Old Style"/><w:b/><w:sz w:val="24"/><w:szCs w:val="24"/></w:rPr><w:t>PIHAK PERTAMA</w:t></w:r><w:r><w:rPr><w:rFonts w:ascii="Bookman Old Style" w:hAnsi="Bookman Old Style"/><w:sz w:val="24"/><w:szCs w:val="24"/></w:rPr><w:t xml:space="preserve"> kepada </w:t></w:r><w:r><w:rPr><w:rFonts w:ascii="Bookman Old Style" w:hAnsi="Bookman Old Style"/><w:b/><w:sz w:val="24"/><w:szCs w:val="24"/></w:rPr><w:t>PIHAK KEDUA</w:t></w:r><w:r><w:rPr><w:rFonts w:ascii="Bookman Old Style" w:hAnsi="Bookman Old Style"/><w:sz w:val="24"/><w:szCs w:val="24"/></w:rPr><w:t xml:space="preserve"> sesuai pencapaian target pekerjaan </w:t></w:r><w:r><w:rPr><w:rFonts w:ascii="Bookman Old Style" w:hAnsi="Bookman Old Style"/><w:b/><w:sz w:val="24"/><w:szCs w:val="24"/></w:rPr><w:t>PIHAK KEDUA</w:t></w:r><w:r><w:rPr><w:rFonts w:ascii="Bookman Old Style" w:hAnsi="Bookman Old Style"/><w:sz w:val="24"/><w:szCs w:val="24"/></w:rPr><w:t>.</w:t></w:r><w:r><w:rPr><w:rFonts w:ascii="Bookman Old Style" w:hAnsi="Bookman Old Style"/><w:color w:val="000000"/><w:sz w:val="24"/><w:szCs w:val="24"/></w:rPr><w:t xml:space="preserve"> sudah termasuk biaya pajak. bea materai. pulsa dan kuota internet untuk komunikasi. dan jasa pelayanan keuangan.</w:t></w:r></w:p><w:p><w:pPr><w:pStyle w:val="ListParagraph"/><w:tabs><w:tab w:val="left" w:pos="540"/></w:tabs><w:ind w:left="547"/><w:jc w:val="both"/><w:rPr><w:rFonts w:ascii="Bookman Old Style" w:hAnsi="Bookman Old Style"/><w:color w:val="000000"/><w:sz w:val="24"/><w:szCs w:val="24"/></w:rPr></w:pPr></w:p><w:p><w:pPr><w:pStyle w:val="ListParagraph"/><w:numPr><w:ilvl w:val="0"/><w:numId w:val="40"/></w:numPr><w:tabs><w:tab w:val="left" w:pos="540"/></w:tabs><w:ind w:left="547" w:hanging="547"/><w:contextualSpacing w:val="0"/><w:jc w:val="both"/><w:rPr><w:rFonts w:ascii="Bookman Old Style" w:hAnsi="Bookman Old Style"/><w:color w:val="000000"/><w:sz w:val="24"/><w:szCs w:val="24"/></w:rPr></w:pPr><w:r><w:rPr><w:rFonts w:ascii="Bookman Old Style" w:hAnsi="Bookman Old Style"/><w:b/><w:sz w:val="24"/><w:szCs w:val="24"/></w:rPr><w:t>PIHAK KEDUA</w:t></w:r><w:r><w:rPr><w:rFonts w:ascii="Bookman Old Style" w:hAnsi="Bookman Old Style"/><w:sz w:val="24"/><w:szCs w:val="24"/></w:rPr><w:t xml:space="preserve"> </w:t></w:r><w:r><w:rPr><w:rFonts w:ascii="Bookman Old Style" w:hAnsi="Bookman Old Style"/><w:sz w:val="24"/><w:szCs w:val="24"/><w:lang w:val="en-ID"/></w:rPr><w:t>t</w:t></w:r><w:r><w:rPr><w:rFonts w:ascii="Bookman Old Style" w:hAnsi="Bookman Old Style"/><w:sz w:val="24"/><w:szCs w:val="24"/></w:rPr><w:t xml:space="preserve">idak </w:t></w:r><w:r><w:rPr><w:rFonts w:ascii="Bookman Old Style" w:hAnsi="Bookman Old Style"/><w:sz w:val="24"/><w:szCs w:val="24"/><w:lang w:val="en-ID"/></w:rPr><w:t>diberikan</w:t></w:r><w:r><w:rPr><w:rFonts w:ascii="Bookman Old Style" w:hAnsi="Bookman Old Style"/><w:sz w:val="24"/><w:szCs w:val="24"/></w:rPr><w:t xml:space="preserve"> honorarium tambahan apabila </w:t></w:r><w:r><w:rPr><w:rFonts w:ascii="Bookman Old Style" w:hAnsi="Bookman Old Style"/><w:sz w:val="24"/><w:szCs w:val="24"/><w:lang w:val="en-ID"/></w:rPr><w:t>melakukan</w:t></w:r><w:r><w:rPr><w:rFonts w:ascii="Bookman Old Style" w:hAnsi="Bookman Old Style"/><w:sz w:val="24"/><w:szCs w:val="24"/></w:rPr><w:t xml:space="preserve"> kunjungan di luar jadwal pelaksanaan </w:t></w:r><w:r><w:rPr><w:rFonts w:ascii="Bookman Old Style" w:hAnsi="Bookman Old Style"/><w:sz w:val="24"/><w:szCs w:val="24"/><w:lang w:val="en-ID"/></w:rPr><w:t xml:space="preserve">pekerjaan </w:t></w:r><w:r><w:rPr><w:rFonts w:ascii="Bookman Old Style" w:hAnsi="Bookman Old Style"/><w:sz w:val="24"/><w:szCs w:val="24"/></w:rPr><w:t>lapangan.</w:t></w:r></w:p><w:p><w:pPr><w:jc w:val="center"/><w:rPr><w:rFonts w:ascii="Bookman Old Style" w:hAnsi="Bookman Old Style"/><w:b/><w:sz w:val="24"/><w:szCs w:val="24"/></w:rPr></w:pPr></w:p><w:p><w:pPr><w:spacing w:after="120"/><w:jc w:val="center"/><w:rPr><w:rFonts w:ascii="Bookman Old Style" w:hAnsi="Bookman Old Style"/><w:b/><w:sz w:val="24"/><w:szCs w:val="24"/></w:rPr></w:pPr><w:r><w:rPr><w:rFonts w:ascii="Bookman Old Style" w:hAnsi="Bookman Old Style"/><w:b/><w:sz w:val="24"/><w:szCs w:val="24"/></w:rPr><w:t>Pasal 6</w:t></w:r></w:p><w:p><w:pPr><w:jc w:val="both"/><w:rPr><w:rFonts w:ascii="Bookman Old Style" w:hAnsi="Bookman Old Style"/><w:sz w:val="24"/><w:szCs w:val="24"/></w:rPr></w:pPr><w:r><w:rPr><w:rFonts w:ascii="Bookman Old Style" w:hAnsi="Bookman Old Style"/><w:sz w:val="24"/><w:szCs w:val="24"/></w:rPr><w:t xml:space="preserve">Pembayaran honorarium sebagaimana dimaksud dalam Pasal 5 dilakukan setelah </w:t></w:r><w:r><w:rPr><w:rFonts w:ascii="Bookman Old Style" w:hAnsi="Bookman Old Style"/><w:b/><w:sz w:val="24"/><w:szCs w:val="24"/></w:rPr><w:t>PIHAK KEDUA</w:t></w:r><w:r><w:rPr><w:rFonts w:ascii="Bookman Old Style" w:hAnsi="Bookman Old Style"/><w:sz w:val="24"/><w:szCs w:val="24"/></w:rPr><w:t xml:space="preserve"> menyelesaikan dan menyerahkan seluruh hasil pekerjaan sebagaimana dimaksud dalam Pasal 2 kepada </w:t></w:r><w:r><w:rPr><w:rFonts w:ascii="Bookman Old Style" w:hAnsi="Bookman Old Style"/><w:b/><w:sz w:val="24"/><w:szCs w:val="24"/></w:rPr><w:t>PIHAK PERTAMA</w:t></w:r><w:r><w:rPr><w:rFonts w:ascii="Bookman Old Style" w:hAnsi="Bookman Old Style"/><w:sz w:val="24"/><w:szCs w:val="24"/></w:rPr><w:t>.</w:t></w:r></w:p><w:p><w:pPr><w:jc w:val="both"/><w:rPr><w:rFonts w:ascii="Bookman Old Style" w:hAnsi="Bookman Old Style"/><w:sz w:val="24"/><w:szCs w:val="24"/></w:rPr></w:pPr></w:p><w:p><w:pPr><w:spacing w:after="120"/><w:jc w:val="center"/><w:rPr><w:rFonts w:ascii="Bookman Old Style" w:hAnsi="Bookman Old Style"/><w:b/><w:sz w:val="24"/><w:szCs w:val="24"/></w:rPr></w:pPr><w:r><w:rPr><w:rFonts w:ascii="Bookman Old Style" w:hAnsi="Bookman Old Style"/><w:b/><w:sz w:val="24"/><w:szCs w:val="24"/></w:rPr><w:t>Pasal 7</w:t></w:r></w:p><w:p><w:pPr><w:pStyle w:val="ListParagraph"/><w:numPr><w:ilvl w:val="0"/><w:numId w:val="44"/></w:numPr><w:ind w:hanging="720"/><w:jc w:val="both"/><w:rPr><w:rFonts w:ascii="Bookman Old Style" w:hAnsi="Bookman Old Style"/><w:color w:val="FF0000"/><w:sz w:val="24"/><w:szCs w:val="24"/></w:rPr></w:pPr><w:r><w:rPr><w:rFonts w:ascii="Bookman Old Style" w:hAnsi="Bookman Old Style"/><w:sz w:val="24"/><w:szCs w:val="24"/></w:rPr><w:t xml:space="preserve">Penyerahan seluruh hasil pekerjaan lapangan sebagaimana dimaksud dalam Pasal 2 dilaksanakan oleh </w:t></w:r><w:r><w:rPr><w:rFonts w:ascii="Bookman Old Style" w:hAnsi="Bookman Old Style"/><w:b/><w:sz w:val="24"/><w:szCs w:val="24"/></w:rPr><w:t>PIHAK KEDUA</w:t></w:r><w:r><w:rPr><w:rFonts w:ascii="Bookman Old Style" w:hAnsi="Bookman Old Style"/><w:sz w:val="24"/><w:szCs w:val="24"/></w:rPr><w:t xml:space="preserve"> kepada </w:t></w:r><w:r><w:rPr><w:rFonts w:ascii="Bookman Old Style" w:hAnsi="Bookman Old Style"/><w:b/><w:sz w:val="24"/><w:szCs w:val="24"/></w:rPr><w:t>PIHAK PERTAMA</w:t></w:r><w:r><w:rPr><w:rFonts w:ascii="Bookman Old Style" w:hAnsi="Bookman Old Style"/><w:sz w:val="24"/><w:szCs w:val="24"/></w:rPr><w:t xml:space="preserve"> yang dinyatakan dalam Berita Acara Serah Terima Hasil Pekerjaan dan ditandatangani oleh </w:t></w:r><w:r><w:rPr><w:rFonts w:ascii="Bookman Old Style" w:hAnsi="Bookman Old Style"/><w:b/><w:sz w:val="24"/><w:szCs w:val="24"/></w:rPr><w:t>PARA PIHAK</w:t></w:r><w:r><w:rPr><w:rFonts w:ascii="Bookman Old Style" w:hAnsi="Bookman Old Style"/><w:sz w:val="24"/><w:szCs w:val="24"/></w:rPr><w:t>. pa</w:t></w:r><w:r><w:rPr><w:rFonts w:ascii="Bookman Old Style" w:hAnsi="Bookman Old Style"/><w:sz w:val="24"/><w:szCs w:val="24"/></w:rPr><w:t xml:space="preserve">ling lambat pada tanggal </w:t></w:r><w:r><w:rPr><w:rFonts w:ascii="Bookman Old Style" w:hAnsi="Bookman Old Style"/><w:sz w:val="24"/><w:szCs w:val="24"/></w:rPr><w:t>&lt;&lt;TANGGAL_SELESAI&gt;&gt;</w:t>.</w:t></w:r></w:p><w:p><w:pPr><w:pStyle w:val="ListParagraph"/><w:numPr><w:ilvl w:val="0"/><w:numId w:val="44"/></w:numPr><w:spacing w:line="240" w:lineRule="auto"/><w:ind w:hanging="720"/><w:jc w:val="both"/><w:rPr><w:rFonts w:ascii="Bookman Old Style" w:hAnsi="Bookman Old Style"/><w:color w:val="000000"/><w:sz w:val="24"/><w:szCs w:val="24"/></w:rPr></w:pPr><w:r><w:rPr><w:rFonts w:ascii="Bookman Old Style" w:hAnsi="Bookman Old Style"/><w:color w:val="000000"/><w:sz w:val="24"/><w:szCs w:val="24"/></w:rPr><w:t xml:space="preserve">Apabila terdapat hambatan dalam penyerahan hasil pekerjaan sebagaimana dimaksud pada ayat (1). </w:t></w:r><w:r><w:rPr><w:rFonts w:ascii="Bookman Old Style" w:hAnsi="Bookman Old Style"/><w:b/><w:bCs/><w:color w:val="000000"/><w:sz w:val="24"/><w:szCs w:val="24"/></w:rPr><w:t>PIHAK PERTAMA</w:t></w:r><w:r><w:rPr><w:rFonts w:ascii="Bookman Old Style" w:hAnsi="Bookman Old Style"/><w:color w:val="000000"/><w:sz w:val="24"/><w:szCs w:val="24"/></w:rPr><w:t xml:space="preserve"> dapat memberikan tambahan waktu penyerahan seluruh hasil pekerjaan apangan paling lambat pada </w:t></w:r><w:r><w:rPr><w:rFonts w:ascii="Bookman Old Style" w:hAnsi="Bookman Old Style"/><w:sz w:val="24"/><w:szCs w:val="24"/></w:rPr><w:t xml:space="preserve">tanggal </w:t></w:r><w:r><w:rPr><w:rFonts w:ascii="Bookman Old Style" w:hAnsi="Bookman Old Style"/><w:sz w:val="24"/><w:szCs w:val="24"/></w:rPr><w:t>&lt;&lt;BATAS_PENYERAHAN&gt;&gt;</w:t>.</w:t></w:r></w:p><w:p><w:pPr><w:spacing w:after="120"/><w:rPr><w:rFonts w:ascii="Bookman Old Style" w:hAnsi="Bookman Old Style"/><w:b/><w:sz w:val="24"/><w:szCs w:val="24"/></w:rPr></w:pPr></w:p><w:p><w:pPr><w:spacing w:after="120"/><w:jc w:val="center"/><w:rPr><w:rFonts w:ascii="Bookman Old Style" w:hAnsi="Bookman Old Style"/><w:b/><w:sz w:val="24"/><w:szCs w:val="24"/></w:rPr></w:pPr><w:r><w:rPr><w:rFonts w:ascii="Bookman Old Style" w:hAnsi="Bookman Old Style"/><w:b/><w:sz w:val="24"/><w:szCs w:val="24"/></w:rPr><w:t>Pasal 8</w:t></w:r></w:p><w:p><w:pPr><w:jc w:val="both"/><w:rPr><w:rFonts w:ascii="Bookman Old Style" w:hAnsi="Bookman Old Style"/><w:sz w:val="24"/><w:szCs w:val="24"/></w:rPr></w:pPr><w:r><w:rPr><w:rFonts w:ascii="Bookman Old Style" w:hAnsi="Bookman Old Style"/><w:b/><w:sz w:val="24"/><w:szCs w:val="24"/></w:rPr><w:t>PIHAK PERTAMA</w:t></w:r><w:r><w:rPr><w:rFonts w:ascii="Bookman Old Style" w:hAnsi="Bookman Old Style"/><w:sz w:val="24"/><w:szCs w:val="24"/></w:rPr><w:t xml:space="preserve"> dapat memutuskan Perjanjian ini secara sepihak sewaktu-waktu dalam hal </w:t></w:r><w:r><w:rPr><w:rFonts w:ascii="Bookman Old Style" w:hAnsi="Bookman Old Style"/><w:b/><w:sz w:val="24"/><w:szCs w:val="24"/></w:rPr><w:t>PIHAK KEDUA</w:t></w:r><w:r><w:rPr><w:rFonts w:ascii="Bookman Old Style" w:hAnsi="Bookman Old Style"/><w:sz w:val="24"/><w:szCs w:val="24"/></w:rPr><w:t xml:space="preserve"> tidak dapat melaksanakan kewajibannya sebagaimana dimaksud dalam Pasal 4. dengan menerbitkan Surat Pemutusan Perjanjian Kerja.</w:t></w:r></w:p><w:p><w:pPr><w:jc w:val="both"/><w:rPr><w:rFonts w:ascii="Bookman Old Style" w:hAnsi="Bookman Old Style"/><w:sz w:val="24"/><w:szCs w:val="24"/></w:rPr></w:pPr></w:p><w:p><w:pPr><w:spacing w:after="120"/><w:jc w:val="center"/><w:rPr><w:rFonts w:ascii="Bookman Old Style" w:hAnsi="Bookman Old Style"/><w:b/><w:sz w:val="24"/><w:szCs w:val="24"/></w:rPr></w:pPr><w:r><w:rPr><w:rFonts w:ascii="Bookman Old Style" w:hAnsi="Bookman Old Style"/><w:b/><w:sz w:val="24"/><w:szCs w:val="24"/></w:rPr><w:t>Pasal 9</w:t></w:r></w:p><w:p><w:pPr><w:pStyle w:val="ListParagraph"/><w:numPr><w:ilvl w:val="0"/><w:numId w:val="41"/></w:numPr><w:tabs><w:tab w:val="left" w:pos="567"/></w:tabs><w:ind w:left="562" w:hanging="562"/><w:contextualSpacing w:val="0"/><w:jc w:val="both"/><w:rPr><w:rFonts w:ascii="Bookman Old Style" w:hAnsi="Bookman Old Style"/><w:sz w:val="24"/><w:szCs w:val="24"/></w:rPr></w:pPr><w:r><w:rPr><w:rFonts w:ascii="Bookman Old Style" w:hAnsi="Bookman Old Style"/><w:sz w:val="24"/><w:szCs w:val="24"/></w:rPr><w:t xml:space="preserve">Apabila </w:t></w:r><w:r><w:rPr><w:rFonts w:ascii="Bookman Old Style" w:hAnsi="Bookman Old Style"/><w:b/><w:sz w:val="24"/><w:szCs w:val="24"/></w:rPr><w:t>PIHAK KEDUA</w:t></w:r><w:r><w:rPr><w:rFonts w:ascii="Bookman Old Style" w:hAnsi="Bookman Old Style"/><w:sz w:val="24"/><w:szCs w:val="24"/></w:rPr><w:t xml:space="preserve"> mengundurkan diri pada saat/setelah pelaksanaan pelatihan atau saat pendataan dengan tidak menyelesaikan pekerjaan yang menjadi tanggung jawabnya. maka wajib membayar ganti rugi kepada </w:t></w:r><w:r><w:rPr><w:rFonts w:ascii="Bookman Old Style" w:hAnsi="Bookman Old Style"/><w:b/><w:sz w:val="24"/><w:szCs w:val="24"/></w:rPr><w:t>PIHAK PERTAMA</w:t></w:r><w:r><w:rPr><w:rFonts w:ascii="Bookman Old Style" w:hAnsi="Bookman Old Style"/><w:sz w:val="24"/><w:szCs w:val="24"/></w:rPr><w:t>.</w:t></w:r></w:p><w:p><w:pPr><w:pStyle w:val="ListParagraph"/><w:tabs><w:tab w:val="left" w:pos="567"/></w:tabs><w:ind w:left="562"/><w:contextualSpacing w:val="0"/><w:jc w:val="both"/><w:rPr><w:rFonts w:ascii="Bookman Old Style" w:hAnsi="Bookman Old Style"/><w:sz w:val="24"/><w:szCs w:val="24"/></w:rPr></w:pPr></w:p><w:p><w:pPr><w:pStyle w:val="ListParagraph"/><w:numPr><w:ilvl w:val="0"/><w:numId w:val="41"/></w:numPr><w:tabs><w:tab w:val="left" w:pos="567"/></w:tabs><w:ind w:left="562" w:hanging="562"/><w:contextualSpacing w:val="0"/><w:jc w:val="both"/><w:rPr><w:rFonts w:ascii="Bookman Old Style" w:hAnsi="Bookman Old Style"/><w:sz w:val="24"/><w:szCs w:val="24"/></w:rPr></w:pPr><w:r><w:rPr><w:rFonts w:ascii="Bookman Old Style" w:hAnsi="Bookman Old Style"/><w:sz w:val="24"/><w:szCs w:val="24"/></w:rPr><w:t xml:space="preserve">Dikecualikan tidak membayar ganti rugi sebagaimana dimaksud pada ayat (1) kepada </w:t></w:r><w:r><w:rPr><w:rFonts w:ascii="Bookman Old Style" w:hAnsi="Bookman Old Style"/><w:b/><w:sz w:val="24"/><w:szCs w:val="24"/></w:rPr><w:t>PIHAK PERTAMA</w:t></w:r><w:r><w:rPr><w:rFonts w:ascii="Bookman Old Style" w:hAnsi="Bookman Old Style"/><w:sz w:val="24"/><w:szCs w:val="24"/></w:rPr><w:t xml:space="preserve">. apabila </w:t></w:r><w:r><w:rPr><w:rFonts w:ascii="Bookman Old Style" w:hAnsi="Bookman Old Style"/><w:b/><w:sz w:val="24"/><w:szCs w:val="24"/></w:rPr><w:t>PIHAK KEDUA</w:t></w:r><w:r><w:rPr><w:rFonts w:ascii="Bookman Old Style" w:hAnsi="Bookman Old Style"/><w:sz w:val="24"/><w:szCs w:val="24"/></w:rPr><w:t xml:space="preserve"> meninggal dunia. mengundurkan diri karena sakit dengan keterangan rawat inap. kecelakaan dengan keterangan kepolisian. dan/atau telah diberikan Surat Pemutusan Perjanjian Kerja dari </w:t></w:r><w:r><w:rPr><w:rFonts w:ascii="Bookman Old Style" w:hAnsi="Bookman Old Style"/><w:b/><w:sz w:val="24"/><w:szCs w:val="24"/></w:rPr><w:t>PIHAK PERTAMA</w:t></w:r><w:r><w:rPr><w:rFonts w:ascii="Bookman Old Style" w:hAnsi="Bookman Old Style"/><w:sz w:val="24"/><w:szCs w:val="24"/></w:rPr><w:t>.</w:t></w:r></w:p><w:p><w:pPr><w:pStyle w:val="ListParagraph"/><w:tabs><w:tab w:val="left" w:pos="567"/></w:tabs><w:ind w:left="562"/><w:jc w:val="both"/><w:rPr><w:rFonts w:ascii="Bookman Old Style" w:hAnsi="Bookman Old Style"/><w:sz w:val="24"/><w:szCs w:val="24"/></w:rPr></w:pPr></w:p><w:p><w:pPr><w:pStyle w:val="ListParagraph"/><w:numPr><w:ilvl w:val="0"/><w:numId w:val="41"/></w:numPr><w:tabs><w:tab w:val="left" w:pos="567"/></w:tabs><w:ind w:left="562" w:hanging="562"/><w:contextualSpacing w:val="0"/><w:jc w:val="both"/><w:rPr><w:rFonts w:ascii="Bookman Old Style" w:hAnsi="Bookman Old Style"/><w:sz w:val="24"/><w:szCs w:val="24"/></w:rPr></w:pPr><w:r><w:rPr><w:rFonts w:ascii="Bookman Old Style" w:hAnsi="Bookman Old Style"/><w:sz w:val="24"/><w:szCs w:val="24"/></w:rPr><w:t xml:space="preserve">Dalam hal terjadi peristiwa sebagaimana dimaksud pada ayat (2). </w:t></w:r><w:r><w:rPr><w:rFonts w:ascii="Bookman Old Style" w:hAnsi="Bookman Old Style"/><w:b/><w:sz w:val="24"/><w:szCs w:val="24"/></w:rPr><w:t>PIHAK PERTAMA</w:t></w:r><w:r><w:rPr><w:rFonts w:ascii="Bookman Old Style" w:hAnsi="Bookman Old Style"/><w:sz w:val="24"/><w:szCs w:val="24"/></w:rPr><w:t xml:space="preserve"> membayarkan honorarium kepada </w:t></w:r><w:r><w:rPr><w:rFonts w:ascii="Bookman Old Style" w:hAnsi="Bookman Old Style"/><w:b/><w:sz w:val="24"/><w:szCs w:val="24"/></w:rPr><w:t>PIHAK KEDUA</w:t></w:r><w:r><w:rPr><w:rFonts w:ascii="Bookman Old Style" w:hAnsi="Bookman Old Style"/><w:sz w:val="24"/><w:szCs w:val="24"/></w:rPr><w:t xml:space="preserve"> secara proporsional sesuai pekerjaan yang telah dilaksanakan.</w:t></w:r></w:p><w:p><w:pPr><w:jc w:val="both"/><w:rPr><w:rFonts w:ascii="Bookman Old Style" w:hAnsi="Bookman Old Style"/><w:sz w:val="24"/><w:szCs w:val="24"/></w:rPr></w:pPr></w:p><w:p><w:pPr><w:spacing w:after="120"/><w:jc w:val="center"/><w:rPr><w:rFonts w:ascii="Bookman Old Style" w:hAnsi="Bookman Old Style"/><w:b/><w:sz w:val="24"/><w:szCs w:val="24"/></w:rPr></w:pPr><w:r><w:rPr><w:rFonts w:ascii="Bookman Old Style" w:hAnsi="Bookman Old Style"/><w:b/><w:sz w:val="24"/><w:szCs w:val="24"/></w:rPr><w:t>Pasal 10</w:t></w:r></w:p><w:p><w:pPr><w:numPr><w:ilvl w:val="0"/><w:numId w:val="42"/></w:numPr><w:ind w:left="567" w:hanging="567"/><w:jc w:val="both"/><w:rPr><w:rFonts w:ascii="Bookman Old Style" w:hAnsi="Bookman Old Style"/><w:sz w:val="24"/><w:szCs w:val="24"/></w:rPr></w:pPr><w:r><w:rPr><w:rFonts w:ascii="Bookman Old Style" w:hAnsi="Bookman Old Style"/><w:sz w:val="24"/><w:szCs w:val="24"/></w:rPr><w:t xml:space="preserve">Apabila terjadi Keadaan Kahar. yang meliputi bencana alam dan bencana sosial. </w:t></w:r><w:r><w:rPr><w:rFonts w:ascii="Bookman Old Style" w:hAnsi="Bookman Old Style"/><w:b/><w:sz w:val="24"/><w:szCs w:val="24"/></w:rPr><w:t xml:space="preserve">PIHAK KEDUA </w:t></w:r><w:r><w:rPr><w:rFonts w:ascii="Bookman Old Style" w:hAnsi="Bookman Old Style"/><w:bCs/><w:sz w:val="24"/><w:szCs w:val="24"/></w:rPr><w:t xml:space="preserve">memberitahukan kepada </w:t></w:r><w:r><w:rPr><w:rFonts w:ascii="Bookman Old Style" w:hAnsi="Bookman Old Style"/><w:b/><w:sz w:val="24"/><w:szCs w:val="24"/></w:rPr><w:t xml:space="preserve">PIHAK PERTAMA </w:t></w:r><w:r><w:rPr><w:rFonts w:ascii="Bookman Old Style" w:hAnsi="Bookman Old Style"/><w:bCs/><w:sz w:val="24"/><w:szCs w:val="24"/></w:rPr><w:t xml:space="preserve">dalam waktu </w:t></w:r><w:r><w:rPr><w:rFonts w:ascii="Bookman Old Style" w:hAnsi="Bookman Old Style"/><w:bCs/><w:color w:val="000000"/><w:sz w:val="24"/><w:szCs w:val="24"/></w:rPr><w:t xml:space="preserve">paling lambat 7 (tujuh) hari </w:t></w:r><w:r><w:rPr><w:rFonts w:ascii="Bookman Old Style" w:hAnsi="Bookman Old Style"/><w:bCs/><w:sz w:val="24"/><w:szCs w:val="24"/></w:rPr><w:t>sejak mengetahui atas kejadian Keadaan Kahar dengan menyertakan bukti.</w:t></w:r></w:p><w:p><w:pPr><w:ind w:left="567"/><w:jc w:val="both"/><w:rPr><w:rFonts w:ascii="Bookman Old Style" w:hAnsi="Bookman Old Style"/><w:sz w:val="24"/><w:szCs w:val="24"/></w:rPr></w:pPr></w:p><w:p><w:pPr><w:pStyle w:val="ListParagraph"/><w:numPr><w:ilvl w:val="0"/><w:numId w:val="42"/></w:numPr><w:jc w:val="both"/><w:rPr><w:rFonts w:ascii="Bookman Old Style" w:hAnsi="Bookman Old Style"/><w:sz w:val="24"/><w:szCs w:val="24"/></w:rPr></w:pPr><w:r><w:rPr><w:rFonts w:ascii="Bookman Old Style" w:hAnsi="Bookman Old Style"/><w:bCs/><w:sz w:val="24"/><w:szCs w:val="24"/></w:rPr><w:t xml:space="preserve">Pada saat terjadi Keadaan Kahar. pelaksanaan pekerjaan oleh </w:t></w:r><w:r><w:rPr><w:rFonts w:ascii="Bookman Old Style" w:hAnsi="Bookman Old Style"/><w:b/><w:sz w:val="24"/><w:szCs w:val="24"/></w:rPr><w:t xml:space="preserve">PIHAK KEDUA </w:t></w:r><w:r><w:rPr><w:rFonts w:ascii="Bookman Old Style" w:hAnsi="Bookman Old Style"/><w:bCs/><w:sz w:val="24"/><w:szCs w:val="24"/></w:rPr><w:t xml:space="preserve">dihentikan sementara dan dilanjutkan kembali setelah Keadaan Kahar berakhir. namun apabila akibat Keadaan Kahar tidak memungkinkan dilanjutkan/diselesaikannya pelaksanaan pekerjaan. </w:t></w:r><w:r><w:rPr><w:rFonts w:ascii="Bookman Old Style" w:hAnsi="Bookman Old Style"/><w:b/><w:sz w:val="24"/><w:szCs w:val="24"/></w:rPr><w:t xml:space="preserve">PIHAK KEDUA </w:t></w:r><w:r><w:rPr><w:rFonts w:ascii="Bookman Old Style" w:hAnsi="Bookman Old Style"/><w:bCs/><w:sz w:val="24"/><w:szCs w:val="24"/></w:rPr><w:t xml:space="preserve">berhak menerima </w:t></w:r><w:r><w:rPr><w:rFonts w:ascii="Bookman Old Style" w:hAnsi="Bookman Old Style"/><w:sz w:val="24"/><w:szCs w:val="24"/></w:rPr><w:t>honorarium secara proporsional sesuai pekerjaan yang telah dilaksanakan.</w:t></w:r></w:p><w:p><w:pPr><w:pStyle w:val="ListParagraph"/><w:jc w:val="both"/><w:rPr><w:rFonts w:ascii="Bookman Old Style" w:hAnsi="Bookman Old Style"/><w:b/><w:sz w:val="24"/><w:szCs w:val="24"/></w:rPr></w:pPr></w:p><w:p><w:pPr><w:spacing w:after="120"/><w:jc w:val="center"/><w:rPr><w:rFonts w:ascii="Bookman Old Style" w:hAnsi="Bookman Old Style"/><w:b/><w:sz w:val="24"/><w:szCs w:val="24"/></w:rPr></w:pPr><w:r><w:rPr><w:rFonts w:ascii="Bookman Old Style" w:hAnsi="Bookman Old Style"/><w:b/><w:sz w:val="24"/><w:szCs w:val="24"/></w:rPr><w:t>Pasal 11</w:t></w:r></w:p><w:p><w:pPr><w:jc w:val="both"/><w:rPr><w:rFonts w:ascii="Bookman Old Style" w:hAnsi="Bookman Old Style"/><w:sz w:val="24"/><w:szCs w:val="24"/></w:rPr></w:pPr><w:r><w:rPr><w:rFonts w:ascii="Bookman Old Style" w:hAnsi="Bookman Old Style"/><w:sz w:val="24"/><w:szCs w:val="24"/></w:rPr><w:t>Segala sesuatu yang belum atau tidak cukup diatur dalam Perjanjian ini. dituangkan dalam perjanjian tambahan/</w:t></w:r><w:r><w:rPr><w:rFonts w:ascii="Bookman Old Style" w:hAnsi="Bookman Old Style"/><w:i/><w:sz w:val="24"/><w:szCs w:val="24"/></w:rPr><w:t>addendum</w:t></w:r><w:r><w:rPr><w:rFonts w:ascii="Bookman Old Style" w:hAnsi="Bookman Old Style"/><w:sz w:val="24"/><w:szCs w:val="24"/></w:rPr><w:t xml:space="preserve"> dan merupakan bagian tidak terpisahkan dari Perjanjian ini.</w:t></w:r></w:p><w:p><w:pPr><w:jc w:val="both"/><w:rPr><w:rFonts w:ascii="Bookman Old Style" w:hAnsi="Bookman Old Style"/><w:sz w:val="24"/><w:szCs w:val="24"/></w:rPr></w:pPr></w:p><w:p><w:pPr><w:jc w:val="both"/><w:rPr><w:rFonts w:ascii="Bookman Old Style" w:hAnsi="Bookman Old Style"/><w:sz w:val="24"/><w:szCs w:val="24"/></w:rPr></w:pPr></w:p><w:p><w:pPr><w:spacing w:after="120"/><w:jc w:val="center"/><w:rPr><w:rFonts w:ascii="Bookman Old Style" w:hAnsi="Bookman Old Style"/><w:b/><w:sz w:val="24"/><w:szCs w:val="24"/></w:rPr></w:pPr><w:r><w:rPr><w:rFonts w:ascii="Bookman Old Style" w:hAnsi="Bookman Old Style"/><w:b/><w:sz w:val="24"/><w:szCs w:val="24"/></w:rPr><w:t>Pasal 12</w:t></w:r></w:p><w:p><w:pPr><w:pStyle w:val="ListParagraph"/><w:numPr><w:ilvl w:val="0"/><w:numId w:val="43"/></w:numPr><w:ind w:left="431" w:hanging="431"/><w:contextualSpacing w:val="0"/><w:jc w:val="both"/><w:rPr><w:rFonts w:ascii="Bookman Old Style" w:hAnsi="Bookman Old Style"/><w:sz w:val="24"/><w:szCs w:val="24"/></w:rPr></w:pPr><w:r><w:rPr><w:rFonts w:ascii="Bookman Old Style" w:hAnsi="Bookman Old Style"/><w:sz w:val="24"/><w:szCs w:val="24"/></w:rPr><w:t xml:space="preserve">Segala perselisihan atau perbedaan pendapat yang timbul sebagai akibat adanya Perjanjian ini akan diselesaikan secara musyawarah untuk mufakat. </w:t></w:r></w:p><w:p><w:pPr><w:pStyle w:val="ListParagraph"/><w:ind w:left="431"/><w:jc w:val="both"/><w:rPr><w:rFonts w:ascii="Bookman Old Style" w:hAnsi="Bookman Old Style"/><w:sz w:val="24"/><w:szCs w:val="24"/></w:rPr></w:pPr></w:p><w:p><w:pPr><w:pStyle w:val="ListParagraph"/><w:numPr><w:ilvl w:val="0"/><w:numId w:val="43"/></w:numPr><w:ind w:left="426" w:hanging="426"/><w:contextualSpacing w:val="0"/><w:jc w:val="both"/><w:rPr><w:rFonts w:ascii="Bookman Old Style" w:hAnsi="Bookman Old Style"/><w:sz w:val="24"/><w:szCs w:val="24"/></w:rPr></w:pPr><w:r><w:rPr><w:rFonts w:ascii="Bookman Old Style" w:hAnsi="Bookman Old Style"/><w:sz w:val="24"/><w:szCs w:val="24"/></w:rPr><w:t xml:space="preserve">Apabila perselisihan tidak dapat diselesaikan sebagaimana dimaksud pada ayat (1). </w:t></w:r><w:r><w:rPr><w:rFonts w:ascii="Bookman Old Style" w:hAnsi="Bookman Old Style"/><w:b/><w:sz w:val="24"/><w:szCs w:val="24"/></w:rPr><w:t>PARA PIHAK</w:t></w:r><w:r><w:rPr><w:rFonts w:ascii="Bookman Old Style" w:hAnsi="Bookman Old Style"/><w:sz w:val="24"/><w:szCs w:val="24"/></w:rPr><w:t xml:space="preserve"> sepakat menyelesaikan perselisihan dengan memilih kedudukan/domisili hukum di Panitera Pengadilan Negeri </w:t></w:r><w:r><w:rPr><w:rFonts w:ascii="Bookman Old Style" w:hAnsi="Bookman Old Style"/><w:noProof/><w:sz w:val="24"/><w:szCs w:val="24"/></w:rPr><w:t>Kota Subulussalam</w:t></w:r></w:p><w:p><w:pPr><w:jc w:val="both"/><w:rPr><w:rFonts w:ascii="Bookman Old Style" w:hAnsi="Bookman Old Style"/><w:sz w:val="24"/><w:szCs w:val="24"/></w:rPr></w:pPr></w:p><w:p><w:pPr><w:jc w:val="both"/><w:rPr><w:rFonts w:ascii="Bookman Old Style" w:hAnsi="Bookman Old Style"/><w:sz w:val="24"/><w:szCs w:val="24"/></w:rPr></w:pPr><w:r><w:rPr><w:rFonts w:ascii="Bookman Old Style" w:hAnsi="Bookman Old Style"/><w:sz w:val="24"/><w:szCs w:val="24"/></w:rPr><w:t xml:space="preserve">Demikian Perjanjian ini dibuat dan ditandatangani oleh </w:t></w:r><w:r><w:rPr><w:rFonts w:ascii="Bookman Old Style" w:hAnsi="Bookman Old Style"/><w:b/><w:sz w:val="24"/><w:szCs w:val="24"/></w:rPr><w:t>PARA PIHAK</w:t></w:r><w:r><w:rPr><w:rFonts w:ascii="Bookman Old Style" w:hAnsi="Bookman Old Style"/><w:sz w:val="24"/><w:szCs w:val="24"/></w:rPr><w:t xml:space="preserve"> dalam 2 (dua) rangkap asli bermeterai cukup. tanpa paksaan dari </w:t></w:r><w:r><w:rPr><w:rFonts w:ascii="Bookman Old Style" w:hAnsi="Bookman Old Style"/><w:b/><w:sz w:val="24"/><w:szCs w:val="24"/></w:rPr><w:t>PIHAK</w:t></w:r><w:r><w:rPr><w:rFonts w:ascii="Bookman Old Style" w:hAnsi="Bookman Old Style"/><w:sz w:val="24"/><w:szCs w:val="24"/></w:rPr><w:t xml:space="preserve"> manapun dan untuk dilaksanakan oleh </w:t></w:r><w:r><w:rPr><w:rFonts w:ascii="Bookman Old Style" w:hAnsi="Bookman Old Style"/><w:b/><w:sz w:val="24"/><w:szCs w:val="24"/></w:rPr><w:t>PARA PIHAK</w:t></w:r><w:r><w:rPr><w:rFonts w:ascii="Bookman Old Style" w:hAnsi="Bookman Old Style"/><w:sz w:val="24"/><w:szCs w:val="24"/></w:rPr><w:t>.</w:t></w:r></w:p><w:p><w:pPr><w:jc w:val="both"/><w:rPr><w:rFonts w:ascii="Bookman Old Style" w:hAnsi="Bookman Old Style"/><w:sz w:val="24"/><w:szCs w:val="24"/></w:rPr></w:pPr></w:p><w:p><w:pPr><w:jc w:val="both"/><w:rPr><w:rFonts w:ascii="Bookman Old Style" w:hAnsi="Bookman Old Style"/><w:sz w:val="24"/><w:szCs w:val="24"/></w:rPr></w:pPr></w:p><w:tbl><w:tblPr><w:tblW w:w="0" w:type="auto"/><w:jc w:val="center"/><w:tblLayout w:type="fixed"/><w:tblCellMar><w:left w:w="0" w:type="dxa"/><w:right w:w="0" w:type="dxa"/></w:tblCellMar><w:tblLook w:val="04A0" w:firstRow="1" w:lastRow="0" w:firstColumn="1" w:lastColumn="0" w:noHBand="0" w:noVBand="1"/></w:tblPr><w:tblGrid><w:gridCol w:w="4998"/><w:gridCol w:w="4339"/></w:tblGrid><w:tr><w:trPr><w:jc w:val="center"/></w:trPr><w:tc><w:tcPr><w:tcW w:w="4998" w:type="dxa"/></w:tcPr><w:p><w:pPr><w:jc w:val="center"/><w:rPr><w:rFonts w:ascii="Bookman Old Style" w:hAnsi="Bookman Old Style"/><w:sz w:val="24"/><w:szCs w:val="24"/></w:rPr></w:pPr><w:r><w:rPr><w:rFonts w:ascii="Bookman Old Style" w:hAnsi="Bookman Old Style"/><w:b/><w:sz w:val="24"/><w:szCs w:val="24"/></w:rPr><w:t>PIHAK KEDUA</w:t></w:r><w:r><w:rPr><w:rFonts w:ascii="Bookman Old Style" w:hAnsi="Bookman Old Style"/><w:sz w:val="24"/><w:szCs w:val="24"/></w:rPr><w:t>.</w:t></w:r></w:p><w:p><w:pPr><w:jc w:val="center"/><w:rPr><w:rFonts w:ascii="Bookman Old Style" w:hAnsi="Bookman Old Style"/><w:sz w:val="24"/><w:szCs w:val="24"/></w:rPr></w:pPr></w:p><w:p><w:pPr><w:jc w:val="center"/><w:rPr><w:rFonts w:ascii="Bookman Old Style" w:hAnsi="Bookman Old Style"/><w:sz w:val="24"/><w:szCs w:val="24"/></w:rPr></w:pPr></w:p><w:p><w:pPr><w:jc w:val="center"/><w:rPr><w:rFonts w:ascii="Bookman Old Style" w:hAnsi="Bookman Old Style"/><w:sz w:val="24"/><w:szCs w:val="24"/></w:rPr></w:pPr></w:p><w:p><w:pPr><w:jc w:val="center"/><w:rPr><w:rFonts w:ascii="Bookman Old Style" w:hAnsi="Bookman Old Style"/><w:sz w:val="24"/><w:szCs w:val="24"/></w:rPr></w:pPr></w:p><w:p><w:pPr><w:jc w:val="center"/><w:rPr><w:rFonts w:ascii="Bookman Old Style" w:hAnsi="Bookman Old Style"/><w:sz w:val="24"/><w:szCs w:val="24"/></w:rPr></w:pPr><w:r><w:rPr><w:rFonts w:ascii="Bookman Old Style" w:hAnsi="Bookman Old Style"/><w:sz w:val="24"/><w:szCs w:val="24"/></w:rPr><w:t>&lt;&lt;NAMA_PIHAK_KEDUA&gt;&gt;</w:t></w:r></w:p></w:tc><w:tc><w:tcPr><w:tcW w:w="4339" w:type="dxa"/></w:tcPr><w:p><w:pPr><w:jc w:val="center"/><w:rPr><w:rFonts w:ascii="Bookman Old Style" w:hAnsi="Bookman Old Style"/><w:sz w:val="24"/><w:szCs w:val="24"/></w:rPr></w:pPr><w:r><w:rPr><w:rFonts w:ascii="Bookman Old Style" w:hAnsi="Bookman Old Style"/><w:b/><w:sz w:val="24"/><w:szCs w:val="24"/></w:rPr><w:t>PIHAK PERTAMA</w:t></w:r><w:r><w:rPr><w:rFonts w:ascii="Bookman Old Style" w:hAnsi="Bookman Old Style"/><w:sz w:val="24"/><w:szCs w:val="24"/></w:rPr><w:t>.</w:t></w:r></w:p><w:p><w:pPr><w:jc w:val="center"/><w:rPr><w:rFonts w:ascii="Bookman Old Style" w:hAnsi="Bookman Old Style"/><w:sz w:val="24"/><w:szCs w:val="24"/></w:rPr></w:pPr></w:p><w:p><w:pPr><w:jc w:val="center"/><w:rPr><w:rFonts w:ascii="Bookman Old Style" w:hAnsi="Bookman Old Style"/><w:sz w:val="24"/><w:szCs w:val="24"/></w:rPr></w:pPr></w:p><w:p><w:pPr><w:jc w:val="center"/><w:rPr><w:rFonts w:ascii="Bookman Old Style" w:hAnsi="Bookman Old Style"/><w:sz w:val="24"/><w:szCs w:val="24"/></w:rPr></w:pPr></w:p><w:p><w:pPr><w:jc w:val="center"/><w:rPr><w:rFonts w:ascii="Bookman Old Style" w:hAnsi="Bookman Old Style"/><w:sz w:val="24"/><w:szCs w:val="24"/></w:rPr></w:pPr></w:p><w:p><w:pPr><w:jc w:val="center"/><w:rPr><w:rFonts w:ascii="Bookman Old Style" w:hAnsi="Bookman Old Style"/><w:sz w:val="24"/><w:szCs w:val="24"/></w:rPr></w:pPr><w:r><w:rPr><w:rFonts w:ascii="Bookman Old Style" w:hAnsi="Bookman Old Style"/><w:sz w:val="24"/><w:szCs w:val="24"/></w:rPr><w:t>&lt;&lt;NAMA_PIHAK_PERTAMA&gt;&gt;</w:t></w:r></w:p><w:p><w:pPr><w:jc w:val="center"/><w:rPr><w:rFonts w:ascii="Bookman Old Style" w:hAnsi="Bookman Old Style"/><w:sz w:val="24"/><w:szCs w:val="24"/></w:rPr></w:pPr></w:p></w:tc></w:tr></w:tbl><w:p><w:pPr><w:rPr><w:rFonts w:ascii="Bookman Old Style" w:hAnsi="Bookman Old Style"/><w:sz w:val="24"/><w:szCs w:val="24"/></w:rPr></w:pPr></w:p><w:p><w:pPr><w:rPr><w:rFonts w:ascii="Bookman Old Style" w:hAnsi="Bookman Old Style"/><w:sz w:val="24"/><w:szCs w:val="24"/></w:rPr></w:pPr></w:p><w:p><w:pPr><w:tabs><w:tab w:val="left" w:pos="4155"/></w:tabs><w:rPr><w:rFonts w:ascii="Bookman Old Style" w:hAnsi="Bookman Old Style"/><w:sz w:val="24"/><w:szCs w:val="24"/></w:rPr><w:sectPr><w:headerReference w:type="default" r:id="rId8"/><w:pgSz w:w="11906" w:h="16838"/><w:pgMar w:top="1440" w:right="1134" w:bottom="1440" w:left="1247" w:header="709" w:footer="709" w:gutter="0"/><w:pgNumType w:fmt="numberInDash"/><w:cols w:space="708"/><w:titlePg/><w:docGrid w:linePitch="360"/></w:sectPr></w:pPr></w:p><w:p><w:pPr><w:pStyle w:val="BodyText"/><w:spacing w:line="285" w:lineRule="auto"/><w:ind w:left="5245" w:right="66"/><w:jc w:val="both"/><w:rPr><w:rFonts w:ascii="Bookman Old Style" w:hAnsi="Bookman Old Style"/><w:sz w:val="24"/><w:szCs w:val="24"/></w:rPr></w:pPr><w:r><w:rPr><w:rFonts w:ascii="Bookman Old Style" w:hAnsi="Bookman Old Style"/><w:sz w:val="24"/><w:szCs w:val="24"/></w:rPr><w:t>LAMPIRAN</w:t></w:r></w:p><w:p><w:pPr><w:pStyle w:val="BodyText"/><w:spacing w:line="285" w:lineRule="auto"/><w:ind w:left="5245" w:right="66"/><w:jc w:val="both"/><w:rPr><w:rFonts w:ascii="Bookman Old Style" w:hAnsi="Bookman Old Style"/><w:sz w:val="24"/><w:szCs w:val="24"/></w:rPr></w:pPr><w:r><w:rPr><w:rFonts w:ascii="Bookman Old Style" w:hAnsi="Bookman Old Style"/><w:sz w:val="24"/><w:szCs w:val="24"/></w:rPr><w:t xml:space="preserve">PERJANJIAN KERJA </w:t></w:r><w:r><w:rPr><w:rFonts w:ascii="Bookman Old Style" w:hAnsi="Bookman Old Style"/><w:sz w:val="24"/><w:szCs w:val="24"/></w:rPr><w:t>&lt;&lt;URAIAN_PEKERJAAN&gt;&gt;</w:t></w:r><w:r><w:rPr><w:rFonts w:ascii="Bookman Old Style" w:hAnsi="Bookman Old Style"/><w:sz w:val="24"/><w:szCs w:val="24"/></w:rPr><w:t xml:space="preserve"> </w:t></w:r><w:r><w:rPr><w:rFonts w:ascii="Bookman Old Style" w:hAnsi="Bookman Old Style"/><w:sz w:val="24"/><w:szCs w:val="24"/></w:rPr><w:t>PADA BADAN PUSAT STATISTIK KOTA SUBULUSSALAM</w:t></w:r></w:p><w:p><w:pPr><w:pStyle w:val="BodyText"/><w:spacing w:line="285" w:lineRule="auto"/><w:ind w:left="5245" w:right="66"/><w:jc w:val="both"/><w:rPr><w:rFonts w:ascii="Bookman Old Style" w:hAnsi="Bookman Old Style"/><w:sz w:val="24"/><w:szCs w:val="24"/></w:rPr></w:pPr><w:r><w:rPr><w:rFonts w:ascii="Bookman Old Style" w:hAnsi="Bookman Old Style"/><w:sz w:val="24"/><w:szCs w:val="24"/></w:rPr><w:t xml:space="preserve">NOMOR </w:t></w:r><w:r><w:rPr><w:rFonts w:ascii="Bookman Old Style" w:hAnsi="Bookman Old Style"/><w:sz w:val="24"/><w:szCs w:val="24"/></w:rPr><w:t>&lt;&lt;NO_SPK&gt;&gt;</w:t></w:r></w:p><w:p><w:pPr><w:pStyle w:val="BodyText"/><w:rPr><w:rFonts w:ascii="Bookman Old Style" w:hAnsi="Bookman Old Style"/><w:sz w:val="24"/><w:szCs w:val="24"/></w:rPr></w:pPr></w:p><w:p><w:pPr><w:pStyle w:val="BodyText"/><w:spacing w:before="69"/><w:rPr><w:rFonts w:ascii="Bookman Old Style" w:hAnsi="Bookman Old Style"/><w:sz w:val="24"/><w:szCs w:val="24"/></w:rPr></w:pPr></w:p><w:p><w:pPr><w:ind w:left="921" w:right="914"/><w:jc w:val="center"/><w:rPr><w:rFonts w:ascii="Bookman Old Style" w:hAnsi="Bookman Old Style"/><w:b/><w:sz w:val="24"/><w:szCs w:val="24"/></w:rPr></w:pPr><w:r><w:rPr><w:rFonts w:ascii="Bookman Old Style" w:hAnsi="Bookman Old Style"/><w:b/><w:sz w:val="24"/><w:szCs w:val="24"/></w:rPr><w:t>DAFTAR</w:t></w:r><w:r><w:rPr><w:rFonts w:ascii="Bookman Old Style" w:hAnsi="Bookman Old Style"/><w:spacing w:val="34"/><w:sz w:val="24"/><w:szCs w:val="24"/></w:rPr><w:t xml:space="preserve"> </w:t></w:r><w:r><w:rPr><w:rFonts w:ascii="Bookman Old Style" w:hAnsi="Bookman Old Style"/><w:b/><w:sz w:val="24"/><w:szCs w:val="24"/></w:rPr><w:t>URAIAN</w:t></w:r><w:r><w:rPr><w:rFonts w:ascii="Bookman Old Style" w:hAnsi="Bookman Old Style"/><w:spacing w:val="35"/><w:sz w:val="24"/><w:szCs w:val="24"/></w:rPr><w:t xml:space="preserve"> </w:t></w:r><w:r><w:rPr><w:rFonts w:ascii="Bookman Old Style" w:hAnsi="Bookman Old Style"/><w:b/><w:sz w:val="24"/><w:szCs w:val="24"/></w:rPr><w:t>TUGAS,</w:t></w:r><w:r><w:rPr><w:rFonts w:ascii="Bookman Old Style" w:hAnsi="Bookman Old Style"/><w:spacing w:val="36"/><w:sz w:val="24"/><w:szCs w:val="24"/></w:rPr><w:t xml:space="preserve"> </w:t></w:r><w:r><w:rPr><w:rFonts w:ascii="Bookman Old Style" w:hAnsi="Bookman Old Style"/><w:b/><w:sz w:val="24"/><w:szCs w:val="24"/></w:rPr><w:t>JANGKA</w:t></w:r><w:r><w:rPr><w:rFonts w:ascii="Bookman Old Style" w:hAnsi="Bookman Old Style"/><w:spacing w:val="33"/><w:sz w:val="24"/><w:szCs w:val="24"/></w:rPr><w:t xml:space="preserve"> </w:t></w:r><w:r><w:rPr><w:rFonts w:ascii="Bookman Old Style" w:hAnsi="Bookman Old Style"/><w:b/><w:sz w:val="24"/><w:szCs w:val="24"/></w:rPr><w:t>WAKTU,</w:t></w:r><w:r><w:rPr><w:rFonts w:ascii="Bookman Old Style" w:hAnsi="Bookman Old Style"/><w:spacing w:val="36"/><w:sz w:val="24"/><w:szCs w:val="24"/></w:rPr><w:t xml:space="preserve"> </w:t></w:r><w:r><w:rPr><w:rFonts w:ascii="Bookman Old Style" w:hAnsi="Bookman Old Style"/><w:b/><w:sz w:val="24"/><w:szCs w:val="24"/></w:rPr><w:t>NILAI</w:t></w:r><w:r><w:rPr><w:rFonts w:ascii="Bookman Old Style" w:hAnsi="Bookman Old Style"/><w:spacing w:val="34"/><w:sz w:val="24"/><w:szCs w:val="24"/></w:rPr><w:t xml:space="preserve"> </w:t></w:r><w:r><w:rPr><w:rFonts w:ascii="Bookman Old Style" w:hAnsi="Bookman Old Style"/><w:b/><w:sz w:val="24"/><w:szCs w:val="24"/></w:rPr><w:t>PERJANJIAN,</w:t></w:r><w:r><w:rPr><w:rFonts w:ascii="Bookman Old Style" w:hAnsi="Bookman Old Style"/><w:spacing w:val="36"/><w:sz w:val="24"/><w:szCs w:val="24"/></w:rPr><w:t xml:space="preserve"> </w:t></w:r><w:r><w:rPr><w:rFonts w:ascii="Bookman Old Style" w:hAnsi="Bookman Old Style"/><w:b/><w:sz w:val="24"/><w:szCs w:val="24"/></w:rPr><w:t>DAN</w:t></w:r><w:r><w:rPr><w:rFonts w:ascii="Bookman Old Style" w:hAnsi="Bookman Old Style"/><w:spacing w:val="35"/><w:sz w:val="24"/><w:szCs w:val="24"/></w:rPr><w:t xml:space="preserve"> </w:t></w:r><w:r><w:rPr><w:rFonts w:ascii="Bookman Old Style" w:hAnsi="Bookman Old Style"/><w:b/><w:sz w:val="24"/><w:szCs w:val="24"/></w:rPr><w:t>BEBAN</w:t></w:r><w:r><w:rPr><w:rFonts w:ascii="Bookman Old Style" w:hAnsi="Bookman Old Style"/><w:spacing w:val="37"/><w:sz w:val="24"/><w:szCs w:val="24"/></w:rPr><w:t xml:space="preserve"> </w:t></w:r><w:r><w:rPr><w:rFonts w:ascii="Bookman Old Style" w:hAnsi="Bookman Old Style"/><w:b/><w:spacing w:val="-2"/><w:sz w:val="24"/><w:szCs w:val="24"/></w:rPr><w:t>ANGGARAN</w:t></w:r></w:p><w:p><w:pPr><w:pStyle w:val="BodyText"/><w:spacing w:before="28" w:after="1"/><w:rPr><w:rFonts w:ascii="Bookman Old Style" w:hAnsi="Bookman Old Style"/><w:b/><w:sz w:val="24"/><w:szCs w:val="24"/></w:rPr></w:pPr></w:p><w:tbl><w:tblPr><w:tblW w:w="15794" w:type="dxa"/><w:jc w:val="center"/><w:tblBorders><w:top w:val="single" w:sz="4" w:space="0" w:color="000000"/><w:left w:val="single" w:sz="4" w:space="0" w:color="000000"/><w:bottom w:val="single" w:sz="4" w:space="0" w:color="000000"/><w:right w:val="single" w:sz="4" w:space="0" w:color="000000"/><w:insideH w:val="single" w:sz="4" w:space="0" w:color="000000"/><w:insideV w:val="single" w:sz="4" w:space="0" w:color="000000"/></w:tblBorders><w:tblLayout w:type="fixed"/><w:tblCellMar><w:left w:w="0" w:type="dxa"/><w:right w:w="0" w:type="dxa"/></w:tblCellMar><w:tblLook w:val="01E0" w:firstRow="1" w:lastRow="1" w:firstColumn="1" w:lastColumn="1" w:noHBand="0" w:noVBand="0"/></w:tblPr><w:tblGrid><w:gridCol w:w="472"/><w:gridCol w:w="858"/><w:gridCol w:w="2498"/><w:gridCol w:w="1866"/><w:gridCol w:w="1064"/><w:gridCol w:w="1599"/><w:gridCol w:w="1844"/><w:gridCol w:w="2036"/><w:gridCol w:w="3557"/></w:tblGrid><w:tr><w:trPr><w:trHeight w:val="241"/><w:jc w:val="center"/></w:trPr><w:tc><w:tcPr><w:tcW w:w="472" w:type="dxa"/><w:vMerge w:val="restart"/></w:tcPr><w:p><w:pPr><w:pStyle w:val="TableParagraph"/><w:ind w:left="100"/><w:rPr><w:rFonts w:ascii="Bookman Old Style" w:hAnsi="Bookman Old Style"/><w:sz w:val="24"/><w:szCs w:val="24"/></w:rPr></w:pPr><w:r><w:rPr><w:rFonts w:ascii="Bookman Old Style" w:hAnsi="Bookman Old Style"/><w:spacing w:val="-5"/><w:w w:val="105"/><w:sz w:val="24"/><w:szCs w:val="24"/></w:rPr><w:t>No</w:t></w:r></w:p></w:tc><w:tc><w:tcPr><w:tcW w:w="3356" w:type="dxa"/><w:gridSpan w:val="2"/><w:vMerge w:val="restart"/></w:tcPr><w:p><w:pPr><w:pStyle w:val="TableParagraph"/><w:ind w:left="677" w:right="701"/><w:rPr><w:rFonts w:ascii="Bookman Old Style" w:hAnsi="Bookman Old Style"/><w:sz w:val="24"/><w:szCs w:val="24"/></w:rPr></w:pPr><w:r><w:rPr><w:rFonts w:ascii="Bookman Old Style" w:hAnsi="Bookman Old Style"/><w:w w:val="105"/><w:sz w:val="24"/><w:szCs w:val="24"/></w:rPr><w:t>Uraian</w:t></w:r><w:r><w:rPr><w:rFonts w:ascii="Bookman Old Style" w:hAnsi="Bookman Old Style"/><w:spacing w:val="-5"/><w:w w:val="105"/><w:sz w:val="24"/><w:szCs w:val="24"/></w:rPr><w:t xml:space="preserve"> </w:t></w:r><w:r><w:rPr><w:rFonts w:ascii="Bookman Old Style" w:hAnsi="Bookman Old Style"/><w:spacing w:val="-4"/><w:w w:val="105"/><w:sz w:val="24"/><w:szCs w:val="24"/></w:rPr><w:t>Tugas</w:t></w:r></w:p></w:tc><w:tc><w:tcPr><w:tcW w:w="1866" w:type="dxa"/><w:vMerge w:val="restart"/></w:tcPr><w:p><w:pPr><w:pStyle w:val="TableParagraph"/><w:ind w:left="129"/><w:rPr><w:rFonts w:ascii="Bookman Old Style" w:hAnsi="Bookman Old Style"/><w:sz w:val="24"/><w:szCs w:val="24"/></w:rPr></w:pPr><w:r><w:rPr><w:rFonts w:ascii="Bookman Old Style" w:hAnsi="Bookman Old Style"/><w:spacing w:val="-2"/><w:w w:val="105"/><w:sz w:val="24"/><w:szCs w:val="24"/></w:rPr><w:t>Jangka</w:t></w:r><w:r><w:rPr><w:rFonts w:ascii="Bookman Old Style" w:hAnsi="Bookman Old Style"/><w:spacing w:val="1"/><w:w w:val="105"/><w:sz w:val="24"/><w:szCs w:val="24"/></w:rPr><w:t xml:space="preserve"> </w:t></w:r><w:r><w:rPr><w:rFonts w:ascii="Bookman Old Style" w:hAnsi="Bookman Old Style"/><w:spacing w:val="-4"/><w:w w:val="105"/><w:sz w:val="24"/><w:szCs w:val="24"/></w:rPr><w:t>Waktu</w:t></w:r></w:p></w:tc><w:tc><w:tcPr><w:tcW w:w="2663" w:type="dxa"/><w:gridSpan w:val="2"/></w:tcPr><w:p><w:pPr><w:pStyle w:val="TableParagraph"/><w:spacing w:line="214" w:lineRule="exact"/><w:ind w:left="480"/><w:rPr><w:rFonts w:ascii="Bookman Old Style" w:hAnsi="Bookman Old Style"/><w:sz w:val="24"/><w:szCs w:val="24"/></w:rPr></w:pPr><w:r><w:rPr><w:rFonts w:ascii="Bookman Old Style" w:hAnsi="Bookman Old Style"/><w:w w:val="105"/><w:sz w:val="24"/><w:szCs w:val="24"/></w:rPr><w:t>Target</w:t></w:r><w:r><w:rPr><w:rFonts w:ascii="Bookman Old Style" w:hAnsi="Bookman Old Style"/><w:spacing w:val="-5"/><w:w w:val="105"/><w:sz w:val="24"/><w:szCs w:val="24"/></w:rPr><w:t xml:space="preserve"> </w:t></w:r><w:r><w:rPr><w:rFonts w:ascii="Bookman Old Style" w:hAnsi="Bookman Old Style"/><w:spacing w:val="-2"/><w:w w:val="105"/><w:sz w:val="24"/><w:szCs w:val="24"/></w:rPr><w:t>Pekerjaan</w:t></w:r></w:p></w:tc><w:tc><w:tcPr><w:tcW w:w="1844" w:type="dxa"/><w:vMerge w:val="restart"/></w:tcPr><w:p><w:pPr><w:pStyle w:val="TableParagraph"/><w:spacing w:before="0" w:line="242" w:lineRule="exact"/><w:ind w:left="287"/><w:rPr><w:rFonts w:ascii="Bookman Old Style" w:hAnsi="Bookman Old Style"/><w:sz w:val="24"/><w:szCs w:val="24"/></w:rPr></w:pPr><w:r><w:rPr><w:rFonts w:ascii="Bookman Old Style" w:hAnsi="Bookman Old Style"/><w:spacing w:val="-4"/><w:w w:val="105"/><w:sz w:val="24"/><w:szCs w:val="24"/></w:rPr><w:t xml:space="preserve">Harga </w:t></w:r><w:r><w:rPr><w:rFonts w:ascii="Bookman Old Style" w:hAnsi="Bookman Old Style"/><w:spacing w:val="-2"/><w:sz w:val="24"/><w:szCs w:val="24"/></w:rPr><w:t>Satuan</w:t></w:r></w:p></w:tc><w:tc><w:tcPr><w:tcW w:w="2036" w:type="dxa"/><w:vMerge w:val="restart"/></w:tcPr><w:p><w:pPr><w:pStyle w:val="TableParagraph"/><w:ind w:left="159"/><w:rPr><w:rFonts w:ascii="Bookman Old Style" w:hAnsi="Bookman Old Style"/><w:sz w:val="24"/><w:szCs w:val="24"/></w:rPr></w:pPr><w:r><w:rPr><w:rFonts w:ascii="Bookman Old Style" w:hAnsi="Bookman Old Style"/><w:w w:val="105"/><w:sz w:val="24"/><w:szCs w:val="24"/></w:rPr><w:t>Nilai</w:t></w:r><w:r><w:rPr><w:rFonts w:ascii="Bookman Old Style" w:hAnsi="Bookman Old Style"/><w:spacing w:val="2"/><w:w w:val="105"/><w:sz w:val="24"/><w:szCs w:val="24"/></w:rPr><w:t xml:space="preserve"> </w:t></w:r><w:r><w:rPr><w:rFonts w:ascii="Bookman Old Style" w:hAnsi="Bookman Old Style"/><w:spacing w:val="-2"/><w:w w:val="105"/><w:sz w:val="24"/><w:szCs w:val="24"/></w:rPr><w:t>Perjanjian</w:t></w:r></w:p></w:tc><w:tc><w:tcPr><w:tcW w:w="3557" w:type="dxa"/><w:vMerge w:val="restart"/></w:tcPr><w:p><w:pPr><w:pStyle w:val="TableParagraph"/><w:ind w:left="0"/><w:rPr><w:rFonts w:ascii="Bookman Old Style" w:hAnsi="Bookman Old Style"/><w:sz w:val="24"/><w:szCs w:val="24"/></w:rPr></w:pPr><w:r><w:rPr><w:rFonts w:ascii="Bookman Old Style" w:hAnsi="Bookman Old Style"/><w:w w:val="105"/><w:sz w:val="24"/><w:szCs w:val="24"/></w:rPr><w:t>Beban</w:t></w:r><w:r><w:rPr><w:rFonts w:ascii="Bookman Old Style" w:hAnsi="Bookman Old Style"/><w:spacing w:val="-4"/><w:w w:val="105"/><w:sz w:val="24"/><w:szCs w:val="24"/></w:rPr><w:t xml:space="preserve"> </w:t></w:r><w:r><w:rPr><w:rFonts w:ascii="Bookman Old Style" w:hAnsi="Bookman Old Style"/><w:spacing w:val="-2"/><w:w w:val="105"/><w:sz w:val="24"/><w:szCs w:val="24"/></w:rPr><w:t>Anggaran</w:t></w:r></w:p></w:tc></w:tr><w:tr><w:trPr><w:trHeight w:val="241"/><w:jc w:val="center"/></w:trPr><w:tc><w:tcPr><w:tcW w:w="472" w:type="dxa"/><w:vMerge/><w:tcBorders><w:top w:val="nil"/></w:tcBorders></w:tcPr><w:p><w:pPr><w:rPr><w:rFonts w:ascii="Bookman Old Style" w:hAnsi="Bookman Old Style"/><w:sz w:val="24"/><w:szCs w:val="24"/></w:rPr></w:pPr></w:p></w:tc><w:tc><w:tcPr><w:tcW w:w="3356" w:type="dxa"/><w:gridSpan w:val="2"/><w:vMerge/><w:tcBorders><w:top w:val="nil"/></w:tcBorders></w:tcPr><w:p><w:pPr><w:rPr><w:rFonts w:ascii="Bookman Old Style" w:hAnsi="Bookman Old Style"/><w:sz w:val="24"/><w:szCs w:val="24"/></w:rPr></w:pPr></w:p></w:tc><w:tc><w:tcPr><w:tcW w:w="1866" w:type="dxa"/><w:vMerge/><w:tcBorders><w:top w:val="nil"/></w:tcBorders></w:tcPr><w:p><w:pPr><w:rPr><w:rFonts w:ascii="Bookman Old Style" w:hAnsi="Bookman Old Style"/><w:sz w:val="24"/><w:szCs w:val="24"/></w:rPr></w:pPr></w:p></w:tc><w:tc><w:tcPr><w:tcW w:w="1064" w:type="dxa"/></w:tcPr><w:p><w:pPr><w:pStyle w:val="TableParagraph"/><w:spacing w:line="214" w:lineRule="exact"/><w:ind w:left="10" w:right="5"/><w:rPr><w:rFonts w:ascii="Bookman Old Style" w:hAnsi="Bookman Old Style"/><w:sz w:val="24"/><w:szCs w:val="24"/></w:rPr></w:pPr><w:r><w:rPr><w:rFonts w:ascii="Bookman Old Style" w:hAnsi="Bookman Old Style"/><w:spacing w:val="-2"/><w:w w:val="105"/><w:sz w:val="24"/><w:szCs w:val="24"/></w:rPr><w:t>Volume</w:t></w:r></w:p></w:tc><w:tc><w:tcPr><w:tcW w:w="1599" w:type="dxa"/></w:tcPr><w:p><w:pPr><w:pStyle w:val="TableParagraph"/><w:spacing w:line="214" w:lineRule="exact"/><w:rPr><w:rFonts w:ascii="Bookman Old Style" w:hAnsi="Bookman Old Style"/><w:sz w:val="24"/><w:szCs w:val="24"/></w:rPr></w:pPr><w:r><w:rPr><w:rFonts w:ascii="Bookman Old Style" w:hAnsi="Bookman Old Style"/><w:spacing w:val="-2"/><w:w w:val="105"/><w:sz w:val="24"/><w:szCs w:val="24"/></w:rPr><w:t>Satuan</w:t></w:r></w:p></w:tc><w:tc><w:tcPr><w:tcW w:w="1844" w:type="dxa"/><w:vMerge/><w:tcBorders><w:top w:val="nil"/></w:tcBorders></w:tcPr><w:p><w:pPr><w:rPr><w:rFonts w:ascii="Bookman Old Style" w:hAnsi="Bookman Old Style"/><w:sz w:val="24"/><w:szCs w:val="24"/></w:rPr></w:pPr></w:p></w:tc><w:tc><w:tcPr><w:tcW w:w="2036" w:type="dxa"/><w:vMerge/><w:tcBorders><w:top w:val="nil"/></w:tcBorders></w:tcPr><w:p><w:pPr><w:rPr><w:rFonts w:ascii="Bookman Old Style" w:hAnsi="Bookman Old Style"/><w:sz w:val="24"/><w:szCs w:val="24"/></w:rPr></w:pPr></w:p></w:tc><w:tc><w:tcPr><w:tcW w:w="3557" w:type="dxa"/><w:vMerge/><w:tcBorders><w:top w:val="nil"/></w:tcBorders></w:tcPr><w:p><w:pPr><w:rPr><w:rFonts w:ascii="Bookman Old Style" w:hAnsi="Bookman Old Style"/><w:sz w:val="24"/><w:szCs w:val="24"/></w:rPr></w:pPr></w:p></w:tc></w:tr><w:tr><w:trPr><w:trHeight w:val="241"/><w:jc w:val="center"/></w:trPr><w:tc><w:tcPr><w:tcW w:w="472" w:type="dxa"/></w:tcPr><w:p><w:pPr><w:pStyle w:val="TableParagraph"/><w:spacing w:line="214" w:lineRule="exact"/><w:ind w:left="7" w:right="2"/><w:rPr><w:rFonts w:ascii="Bookman Old Style" w:hAnsi="Bookman Old Style"/><w:sz w:val="18"/><w:szCs w:val="24"/></w:rPr></w:pPr><w:r><w:rPr><w:rFonts w:ascii="Bookman Old Style" w:hAnsi="Bookman Old Style"/><w:spacing w:val="-5"/><w:w w:val="105"/><w:sz w:val="18"/><w:szCs w:val="24"/></w:rPr><w:t>(1)</w:t></w:r></w:p></w:tc><w:tc><w:tcPr><w:tcW w:w="3356" w:type="dxa"/><w:gridSpan w:val="2"/></w:tcPr><w:p><w:pPr><w:pStyle w:val="TableParagraph"/><w:spacing w:line="214" w:lineRule="exact"/><w:ind w:left="9"/><w:rPr><w:rFonts w:ascii="Bookman Old Style" w:hAnsi="Bookman Old Style"/><w:sz w:val="18"/><w:szCs w:val="24"/></w:rPr></w:pPr><w:r><w:rPr><w:rFonts w:ascii="Bookman Old Style" w:hAnsi="Bookman Old Style"/><w:spacing w:val="-5"/><w:w w:val="105"/><w:sz w:val="18"/><w:szCs w:val="24"/></w:rPr><w:t>(2)</w:t></w:r></w:p></w:tc><w:tc><w:tcPr><w:tcW w:w="1866" w:type="dxa"/></w:tcPr><w:p><w:pPr><w:pStyle w:val="TableParagraph"/><w:spacing w:line="214" w:lineRule="exact"/><w:ind w:left="7"/><w:rPr><w:rFonts w:ascii="Bookman Old Style" w:hAnsi="Bookman Old Style"/><w:sz w:val="18"/><w:szCs w:val="24"/></w:rPr></w:pPr><w:r><w:rPr><w:rFonts w:ascii="Bookman Old Style" w:hAnsi="Bookman Old Style"/><w:spacing w:val="-5"/><w:w w:val="105"/><w:sz w:val="18"/><w:szCs w:val="24"/></w:rPr><w:t>(3)</w:t></w:r></w:p></w:tc><w:tc><w:tcPr><w:tcW w:w="1064" w:type="dxa"/></w:tcPr><w:p><w:pPr><w:pStyle w:val="TableParagraph"/><w:spacing w:line="214" w:lineRule="exact"/><w:ind w:left="10"/><w:rPr><w:rFonts w:ascii="Bookman Old Style" w:hAnsi="Bookman Old Style"/><w:sz w:val="18"/><w:szCs w:val="24"/></w:rPr></w:pPr><w:r><w:rPr><w:rFonts w:ascii="Bookman Old Style" w:hAnsi="Bookman Old Style"/><w:spacing w:val="-5"/><w:w w:val="105"/><w:sz w:val="18"/><w:szCs w:val="24"/></w:rPr><w:t>(3)</w:t></w:r></w:p></w:tc><w:tc><w:tcPr><w:tcW w:w="1599" w:type="dxa"/></w:tcPr><w:p><w:pPr><w:pStyle w:val="TableParagraph"/><w:spacing w:line="214" w:lineRule="exact"/><w:ind w:right="5"/><w:rPr><w:rFonts w:ascii="Bookman Old Style" w:hAnsi="Bookman Old Style"/><w:sz w:val="18"/><w:szCs w:val="24"/></w:rPr></w:pPr><w:r><w:rPr><w:rFonts w:ascii="Bookman Old Style" w:hAnsi="Bookman Old Style"/><w:spacing w:val="-5"/><w:w w:val="105"/><w:sz w:val="18"/><w:szCs w:val="24"/></w:rPr><w:t>(4)</w:t></w:r></w:p></w:tc><w:tc><w:tcPr><w:tcW w:w="1844" w:type="dxa"/></w:tcPr><w:p><w:pPr><w:pStyle w:val="TableParagraph"/><w:spacing w:line="214" w:lineRule="exact"/><w:ind w:right="1"/><w:rPr><w:rFonts w:ascii="Bookman Old Style" w:hAnsi="Bookman Old Style"/><w:sz w:val="18"/><w:szCs w:val="24"/></w:rPr></w:pPr><w:r><w:rPr><w:rFonts w:ascii="Bookman Old Style" w:hAnsi="Bookman Old Style"/><w:spacing w:val="-5"/><w:w w:val="105"/><w:sz w:val="18"/><w:szCs w:val="24"/></w:rPr><w:t>(5)</w:t></w:r></w:p></w:tc><w:tc><w:tcPr><w:tcW w:w="2036" w:type="dxa"/></w:tcPr><w:p><w:pPr><w:pStyle w:val="TableParagraph"/><w:spacing w:line="214" w:lineRule="exact"/><w:ind w:left="13"/><w:rPr><w:rFonts w:ascii="Bookman Old Style" w:hAnsi="Bookman Old Style"/><w:sz w:val="18"/><w:szCs w:val="24"/></w:rPr></w:pPr><w:r><w:rPr><w:rFonts w:ascii="Bookman Old Style" w:hAnsi="Bookman Old Style"/><w:spacing w:val="-5"/><w:w w:val="105"/><w:sz w:val="18"/><w:szCs w:val="24"/></w:rPr><w:t>(6)</w:t></w:r></w:p></w:tc><w:tc><w:tcPr><w:tcW w:w="3557" w:type="dxa"/></w:tcPr><w:p><w:pPr><w:pStyle w:val="TableParagraph"/><w:spacing w:line="214" w:lineRule="exact"/><w:ind w:left="17"/><w:rPr><w:rFonts w:ascii="Bookman Old Style" w:hAnsi="Bookman Old Style"/><w:sz w:val="18"/><w:szCs w:val="24"/></w:rPr></w:pPr><w:r><w:rPr><w:rFonts w:ascii="Bookman Old Style" w:hAnsi="Bookman Old Style"/><w:spacing w:val="-5"/><w:w w:val="105"/><w:sz w:val="18"/><w:szCs w:val="24"/></w:rPr><w:t>(7)</w:t></w:r></w:p></w:tc></w:tr><w:tr><w:trPr><w:trHeight w:val="484"/><w:jc w:val="center"/></w:trPr><w:tc><w:tcPr><w:tcW w:w="472" w:type="dxa"/><w:vAlign w:val="center"/></w:tcPr><w:p><w:pPr><w:pStyle w:val="TableParagraph"/><w:ind w:left="7"/><w:jc w:val="left"/><w:rPr><w:rFonts w:ascii="Bookman Old Style" w:hAnsi="Bookman Old Style"/><w:sz w:val="24"/><w:szCs w:val="24"/></w:rPr></w:pPr><w:r><w:rPr><w:rFonts w:ascii="Bookman Old Style" w:hAnsi="Bookman Old Style"/><w:sz w:val="24"/><w:szCs w:val="24"/></w:rPr><w:t>&lt;&lt;NO_URUT&gt;&gt;</w:t></w:r></w:p></w:tc><w:tc><w:tcPr><w:tcW w:w="3356" w:type="dxa"/><w:gridSpan w:val="2"/><w:vAlign w:val="center"/></w:tcPr><w:p><w:pPr><w:pStyle w:val="TableParagraph"/><w:spacing w:before="0" w:line="242" w:lineRule="exact"/><w:ind w:left="103" w:right="159"/><w:jc w:val="left"/><w:rPr><w:rFonts w:ascii="Bookman Old Style" w:hAnsi="Bookman Old Style"/><w:sz w:val="24"/><w:szCs w:val="24"/></w:rPr></w:pPr><w:r><w:rPr><w:rFonts w:ascii="Bookman Old Style" w:hAnsi="Bookman Old Style"/><w:sz w:val="24"/><w:szCs w:val="24"/></w:rPr><w:t>&lt;&lt;URAIAN_TUGAS&gt;&gt;</w:t></w:r></w:p></w:tc><w:tc><w:tcPr><w:tcW w:w="1866" w:type="dxa"/><w:vAlign w:val="center"/></w:tcPr><w:p><w:pPr><w:pStyle w:val="TableParagraph"/><w:spacing w:before="9" w:line="214" w:lineRule="exact"/><w:ind w:left="84"/><w:jc w:val="left"/><w:rPr><w:rFonts w:ascii="Bookman Old Style" w:hAnsi="Bookman Old Style"/><w:sz w:val="24"/><w:szCs w:val="24"/></w:rPr></w:pPr><w:r><w:rPr><w:rFonts w:ascii="Bookman Old Style" w:hAnsi="Bookman Old Style"/><w:sz w:val="24"/><w:szCs w:val="24"/></w:rPr><w:t>&lt;&lt;JANGKA_WAKTU&gt;&gt;</w:t></w:r></w:p></w:tc><w:tc><w:tcPr><w:tcW w:w="1064" w:type="dxa"/><w:vAlign w:val="center"/></w:tcPr><w:p><w:pPr><w:pStyle w:val="TableParagraph"/><w:ind w:left="10" w:right="4"/><w:rPr><w:rFonts w:ascii="Bookman Old Style" w:hAnsi="Bookman Old Style"/><w:sz w:val="24"/><w:szCs w:val="24"/></w:rPr></w:pPr><w:r><w:rPr><w:rFonts w:ascii="Bookman Old Style" w:hAnsi="Bookman Old Style"/><w:sz w:val="24"/><w:szCs w:val="24"/></w:rPr><w:t>&lt;&lt;VOLUME&gt;&gt;</w:t></w:r></w:p></w:tc><w:tc><w:tcPr><w:tcW w:w="1599" w:type="dxa"/><w:vAlign w:val="center"/></w:tcPr><w:p><w:pPr><w:pStyle w:val="TableParagraph"/><w:jc w:val="left"/><w:rPr><w:rFonts w:ascii="Bookman Old Style" w:hAnsi="Bookman Old Style"/><w:sz w:val="24"/><w:szCs w:val="24"/></w:rPr></w:pPr><w:r><w:rPr><w:rFonts w:ascii="Bookman Old Style" w:hAnsi="Bookman Old Style"/><w:sz w:val="24"/><w:szCs w:val="24"/></w:rPr><w:t>&lt;&lt;SATUAN&gt;&gt;</w:t></w:r></w:p></w:tc><w:tc><w:tcPr><w:tcW w:w="1844" w:type="dxa"/><w:vAlign w:val="center"/></w:tcPr><w:p><w:pPr><w:pStyle w:val="TableParagraph"/><w:ind w:left="143" w:right="5"/><w:jc w:val="left"/><w:rPr><w:rFonts w:ascii="Bookman Old Style" w:hAnsi="Bookman Old Style"/><w:sz w:val="24"/><w:szCs w:val="24"/></w:rPr></w:pPr><w:r><w:rPr><w:rFonts w:ascii="Bookman Old Style" w:hAnsi="Bookman Old Style"/><w:sz w:val="24"/><w:szCs w:val="24"/></w:rPr><w:t>&lt;&lt;HARGA_SATUAN&gt;&gt;</w:t></w:r></w:p></w:tc><w:tc><w:tcPr><w:tcW w:w="2036" w:type="dxa"/><w:vAlign w:val="center"/></w:tcPr><w:p><w:pPr><w:pStyle w:val="TableParagraph"/><w:ind w:left="0" w:right="86"/><w:rPr><w:rFonts w:ascii="Bookman Old Style" w:hAnsi="Bookman Old Style"/><w:sz w:val="24"/><w:szCs w:val="24"/></w:rPr></w:pPr><w:r><w:rPr><w:rFonts w:ascii="Bookman Old Style" w:hAnsi="Bookman Old Style"/><w:sz w:val="24"/><w:szCs w:val="24"/></w:rPr><w:t>&lt;&lt;NILAI_PERJANJIAN&gt;&gt;</w:t></w:r></w:p></w:tc><w:tc><w:tcPr><w:tcW w:w="3557" w:type="dxa"/><w:vAlign w:val="center"/></w:tcPr><w:p><w:pPr><w:pStyle w:val="TableParagraph"/><w:ind w:left="17" w:right="1"/><w:rPr><w:rFonts w:ascii="Bookman Old Style" w:hAnsi="Bookman Old Style"/><w:sz w:val="24"/><w:szCs w:val="24"/></w:rPr></w:pPr><w:r><w:rPr><w:rFonts w:ascii="Bookman Old Style" w:hAnsi="Bookman Old Style"/><w:sz w:val="24"/><w:szCs w:val="24"/></w:rPr><w:t>&lt;&lt;BEBAN_ANGGARAN&gt;&gt;</w:t></w:r></w:p></w:tc></w:tr><w:tr><w:trPr><w:trHeight w:val="527"/><w:jc w:val="center"/></w:trPr><w:tc><w:tcPr><w:tcW w:w="1330" w:type="dxa"/><w:gridSpan w:val="2"/><w:vAlign w:val="center"/></w:tcPr><w:p><w:pPr><w:pStyle w:val="TableParagraph"/><w:spacing w:before="0"/><w:ind w:left="0"/><w:rPr><w:rFonts w:ascii="Bookman Old Style" w:hAnsi="Bookman Old Style"/><w:sz w:val="24"/><w:szCs w:val="24"/></w:rPr></w:pPr></w:p></w:tc><w:tc><w:tcPr><w:tcW w:w="8871" w:type="dxa"/><w:gridSpan w:val="5"/><w:vAlign w:val="center"/></w:tcPr><w:p><w:pPr><w:pStyle w:val="TableParagraph"/><w:spacing w:before="159"/><w:ind w:left="544"/><w:jc w:val="left"/><w:rPr><w:rFonts w:ascii="Bookman Old Style" w:hAnsi="Bookman Old Style"/><w:i/><w:sz w:val="24"/><w:szCs w:val="24"/></w:rPr></w:pPr><w:r><w:rPr><w:rFonts w:ascii="Bookman Old Style" w:hAnsi="Bookman Old Style"/><w:i/><w:w w:val="105"/><w:sz w:val="24"/><w:szCs w:val="24"/></w:rPr><w:t>Terbilang:</w:t></w:r><w:r><w:rPr><w:rFonts w:ascii="Bookman Old Style" w:hAnsi="Bookman Old Style"/><w:spacing w:val="-7"/><w:w w:val="105"/><w:sz w:val="24"/><w:szCs w:val="24"/></w:rPr><w:t xml:space="preserve"> </w:t></w:r><w:r><w:rPr><w:rFonts w:ascii="Bookman Old Style" w:hAnsi="Bookman Old Style"/><w:spacing w:val="-7"/><w:w w:val="105"/><w:sz w:val="24"/><w:szCs w:val="24"/></w:rPr><w:t>&lt;&lt;TERBILANG&gt;&gt;</w:t></w:r></w:p></w:tc><w:tc><w:tcPr><w:tcW w:w="2036" w:type="dxa"/><w:vAlign w:val="center"/></w:tcPr><w:p><w:pPr><w:pStyle w:val="TableParagraph"/><w:spacing w:before="152"/><w:ind w:left="0" w:right="86"/><w:jc w:val="left"/><w:rPr><w:rFonts w:ascii="Bookman Old Style" w:hAnsi="Bookman Old Style"/><w:sz w:val="24"/><w:szCs w:val="24"/></w:rPr></w:pPr><w:r><w:rPr><w:rFonts w:ascii="Bookman Old Style" w:hAnsi="Bookman Old Style"/><w:sz w:val="24"/><w:szCs w:val="24"/></w:rPr><w:t>Rp <w:t>&lt;&lt;TOTAL_HONOR&gt;&gt;</w:t>,-</w:t></w:r></w:p></w:tc><w:tc><w:tcPr><w:tcW w:w="3557" w:type="dxa"/><w:vAlign w:val="center"/></w:tcPr><w:p><w:pPr><w:pStyle w:val="TableParagraph"/><w:spacing w:before="0"/><w:ind w:left="0"/><w:rPr><w:rFonts w:ascii="Bookman Old Style" w:hAnsi="Bookman Old Style"/><w:sz w:val="24"/><w:szCs w:val="24"/></w:rPr></w:pPr></w:p></w:tc></w:tr></w:tbl><w:p><w:pPr><w:pStyle w:val="BodyText"/><w:tabs><w:tab w:val="left" w:pos="450"/></w:tabs><w:spacing w:after="120" w:line="276" w:lineRule="auto"/><w:rPr><w:rFonts w:ascii="Bookman Old Style" w:hAnsi="Bookman Old Style" w:cs="Times New Roman"/><w:color w:val="000000" w:themeColor="text1"/><w:sz w:val="24"/><w:szCs w:val="24"/><w:lang w:val="id-ID"/></w:rPr></w:pPr></w:p><w:sectPr><w:pgSz w:w="16838" w:h="11906" w:orient="landscape"/><w:pgMar w:top="1134" w:right="1440" w:bottom="1247" w:left="1440" w:header="709" w:footer="709" w:gutter="0"/><w:pgNumType w:fmt="numberInDash"/><w:cols w:space="708"/><w:titlePg/><w:docGrid w:linePitch="360"/></w:sectPr></w:body></w:document>
 </file>
 
 <file path=word/endnotes.xml><?xml version="1.0" encoding="utf-8"?>

</xml_diff>